<commit_message>
Amplia la documentacion tecnica: detalle del metodo congelado, flujo del experimento en 8 pasos y explicacion de la augmentacion (transformaciones y por que se eligio); README sin la descripcion 70/30 de Rohu
Co-Authored-By: Claude Opus 5.5 <noreply@anthropic.com>
Claude-Session: https://claude.ai/code/session_0153ECmVtHffrApi7B7wry8e
</commit_message>
<xml_diff>
--- a/Documentacion_Tecnica_ViT_DenseNet.docx
+++ b/Documentacion_Tecnica_ViT_DenseNet.docx
@@ -85,27 +85,318 @@
     </w:p>
     <w:p>
       <w:pPr>
+        <w:spacing w:after="80" w:before="140"/>
+      </w:pPr>
+      <w:r>
+        <w:rPr>
+          <w:b/>
+        </w:rPr>
+        <w:t xml:space="preserve">Partes del modelo</w:t>
+      </w:r>
+    </w:p>
+    <w:p>
+      <w:pPr>
+        <w:spacing w:after="100"/>
+      </w:pPr>
+      <w:r>
+        <w:rPr>
+          <w:b/>
+        </w:rPr>
+        <w:t xml:space="preserve">Backbone: </w:t>
+      </w:r>
+      <w:r>
+        <w:t xml:space="preserve">las capas que extraen las características de la imagen. En ViT-Base/16 son los 12 bloques transformer; en DenseNet-121, los bloques densos convolucionales. Es la parte que "aprendió a ver" el ojo del pescado durante el entrenamiento en Mendeley.</w:t>
+      </w:r>
+    </w:p>
+    <w:p>
+      <w:pPr>
+        <w:spacing w:after="100"/>
+      </w:pPr>
+      <w:r>
+        <w:rPr>
+          <w:b/>
+        </w:rPr>
+        <w:t xml:space="preserve">Cabeza de clasificación: </w:t>
+      </w:r>
+      <w:r>
+        <w:t xml:space="preserve">la última capa lineal, que recibe el vector de características del backbone y produce 2 salidas (fresco / no_fresco). Es la única parte que se vuelve a entrenar.</w:t>
+      </w:r>
+    </w:p>
+    <w:p>
+      <w:pPr>
+        <w:spacing w:after="80" w:before="140"/>
+      </w:pPr>
+      <w:r>
+        <w:rPr>
+          <w:b/>
+        </w:rPr>
+        <w:t xml:space="preserve">Qué significa congelar, en el código (finetune_target_x2.py, finetune_eval_fold)</w:t>
+      </w:r>
+    </w:p>
+    <w:p>
+      <w:pPr>
+        <w:spacing w:after="100"/>
+      </w:pPr>
+      <w:r>
+        <w:rPr>
+          <w:b/>
+        </w:rPr>
+        <w:t xml:space="preserve">Sin gradiente: </w:t>
+      </w:r>
+      <w:r>
+        <w:t xml:space="preserve">todos los parámetros del backbone se marcan con requires_grad=False. El optimizador solo recibe los parámetros de la cabeza, por lo que los pesos del backbone no cambian.</w:t>
+      </w:r>
+    </w:p>
+    <w:p>
+      <w:pPr>
+        <w:spacing w:after="100"/>
+      </w:pPr>
+      <w:r>
+        <w:rPr>
+          <w:b/>
+        </w:rPr>
+        <w:t xml:space="preserve">Backbone en modo eval(): </w:t>
+      </w:r>
+      <w:r>
+        <w:t xml:space="preserve">durante el entrenamiento el backbone se mantiene en eval() y solo la cabeza en train(). Así BatchNorm (presente en DenseNet-121) no actualiza sus estadísticas con datos del dominio objetivo y Dropout queda desactivado. Sin esto no sería un backbone realmente congelado, sino una adaptación parcial.</w:t>
+      </w:r>
+    </w:p>
+    <w:p>
+      <w:pPr>
+        <w:spacing w:after="100"/>
+      </w:pPr>
+      <w:r>
+        <w:rPr>
+          <w:b/>
+        </w:rPr>
+        <w:t xml:space="preserve">Cabeza: </w:t>
+      </w:r>
+      <w:r>
+        <w:t xml:space="preserve">se parte de la cabeza del checkpoint de Mendeley y se reentrena con imágenes del dominio objetivo. No se agrega una capa nueva: la "capa adicional" del flujo es esta cabeza reentrenada.</w:t>
+      </w:r>
+    </w:p>
+    <w:p>
+      <w:pPr>
+        <w:spacing w:after="100"/>
+      </w:pPr>
+      <w:r>
+        <w:rPr>
+          <w:b/>
+        </w:rPr>
+        <w:t xml:space="preserve">Hiperparámetros: </w:t>
+      </w:r>
+      <w:r>
+        <w:t xml:space="preserve">AdamW (lr=1e-4, weight_decay=1e-4), CosineAnnealingLR, CrossEntropyLoss, hasta 30 épocas, early stopping con paciencia=8.</w:t>
+      </w:r>
+    </w:p>
+    <w:p>
+      <w:pPr>
+        <w:spacing w:after="80" w:before="140"/>
+      </w:pPr>
+      <w:r>
+        <w:rPr>
+          <w:b/>
+        </w:rPr>
+        <w:t xml:space="preserve">Comparación con los otros enfoques</w:t>
+      </w:r>
+    </w:p>
+    <w:p>
+      <w:pPr>
+        <w:spacing w:after="100"/>
+      </w:pPr>
+      <w:r>
+        <w:rPr>
+          <w:b/>
+        </w:rPr>
+        <w:t xml:space="preserve">Zero-shot: </w:t>
+      </w:r>
+      <w:r>
+        <w:t xml:space="preserve">el modelo de Mendeley se evalúa directamente en el dominio objetivo, sin entrenar nada. Mide la generalización pura.</w:t>
+      </w:r>
+    </w:p>
+    <w:p>
+      <w:pPr>
+        <w:spacing w:after="100"/>
+      </w:pPr>
+      <w:r>
+        <w:rPr>
+          <w:b/>
+        </w:rPr>
+        <w:t xml:space="preserve">Congelado (este documento): </w:t>
+      </w:r>
+      <w:r>
+        <w:t xml:space="preserve">se entrena solo la cabeza con imágenes del dominio objetivo. Mide cuán transferibles son las características aprendidas en Mendeley: si una cabeza lineal basta para separar las clases, el backbone ya generaliza.</w:t>
+      </w:r>
+    </w:p>
+    <w:p>
+      <w:pPr>
+        <w:spacing w:after="100"/>
+      </w:pPr>
+      <w:r>
+        <w:rPr>
+          <w:b/>
+        </w:rPr>
+        <w:t xml:space="preserve">Fine-tuning completo: </w:t>
+      </w:r>
+      <w:r>
+        <w:t xml:space="preserve">se entrenan todos los pesos (backbone con lr más bajo, cabeza con lr más alto). Tiene más capacidad de adaptación, pero también más inestabilidad y más riesgo de sobreajuste con ~1,000 imágenes.</w:t>
+      </w:r>
+    </w:p>
+    <w:p>
+      <w:pPr>
+        <w:spacing w:after="100"/>
+      </w:pPr>
+      <w:r>
+        <w:rPr>
+          <w:b/>
+        </w:rPr>
+        <w:t xml:space="preserve">Por qué congelado: </w:t>
+      </w:r>
+      <w:r>
+        <w:t xml:space="preserve">con pocos parámetros libres el entrenamiento es estable entre folds, el riesgo de sobreajuste es bajo y la comparación entre ViT-Base/16 y DenseNet-121 refleja la calidad de sus características, no su capacidad de reaprender.</w:t>
+      </w:r>
+    </w:p>
+    <w:p>
+      <w:pPr>
         <w:pStyle w:val="Heading2"/>
         <w:spacing w:after="90" w:before="180"/>
       </w:pPr>
       <w:r>
-        <w:t xml:space="preserve">1.2 Datasets evaluados</w:t>
-      </w:r>
-    </w:p>
-    <w:p>
-      <w:pPr>
-        <w:spacing w:after="100"/>
-      </w:pPr>
-      <w:r>
-        <w:t xml:space="preserve">Trucha: 1,150 imágenes (OneDrive), dominio objetivo original del proyecto.</w:t>
-      </w:r>
-    </w:p>
-    <w:p>
-      <w:pPr>
-        <w:spacing w:after="100"/>
-      </w:pPr>
-      <w:r>
-        <w:t xml:space="preserve">Rohu: 1,261 imágenes, dominio objetivo evaluado bajo el mismo protocolo que Trucha, con el mismo pipeline de entrenamiento.</w:t>
+        <w:t xml:space="preserve">1.2 Flujo del experimento</w:t>
+      </w:r>
+    </w:p>
+    <w:p>
+      <w:pPr>
+        <w:spacing w:after="100"/>
+      </w:pPr>
+      <w:r>
+        <w:t xml:space="preserve">El mismo flujo se aplica por separado a cada dominio objetivo (Trucha y Rohu), a cada modelo (ViT-Base/16, DenseNet-121).</w:t>
+      </w:r>
+    </w:p>
+    <w:p>
+      <w:pPr>
+        <w:spacing w:after="100"/>
+      </w:pPr>
+      <w:r>
+        <w:rPr>
+          <w:b/>
+        </w:rPr>
+        <w:t xml:space="preserve">Paso 1 — Modelo entrenado en Mendeley. </w:t>
+      </w:r>
+      <w:r>
+        <w:t xml:space="preserve">Punto de partida: 5 checkpoints por arquitectura ({modelo}_fold{k}_best.pt, k=1..5), entrenados sobre Mendeley (8,000 imágenes ya recortadas al ojo).</w:t>
+      </w:r>
+    </w:p>
+    <w:p>
+      <w:pPr>
+        <w:spacing w:after="100"/>
+      </w:pPr>
+      <w:r>
+        <w:rPr>
+          <w:b/>
+        </w:rPr>
+        <w:t xml:space="preserve">Paso 2 — Dataset objetivo con imágenes diferentes. </w:t>
+      </w:r>
+      <w:r>
+        <w:t xml:space="preserve">Las fotos originales de Trucha y Rohu son de cabeza completa a resolución de cámara (~4160×3120 y ~4032×3024 px). Usarlas tal cual mezclaría el cambio de dominio con un cambio de encuadre, y la comparación no sería válida.</w:t>
+      </w:r>
+    </w:p>
+    <w:p>
+      <w:pPr>
+        <w:spacing w:after="100"/>
+      </w:pPr>
+      <w:r>
+        <w:rPr>
+          <w:b/>
+        </w:rPr>
+        <w:t xml:space="preserve">Paso 3 — Función de procesamiento de imágenes. </w:t>
+      </w:r>
+      <w:r>
+        <w:t xml:space="preserve">preprocess_ojos_trucha.py y preprocess_ojos_rohu.py: (1) detectan el ojo con Fast Radial Symmetry Transform, (2) recortan un cuadrado centrado en el ojo con el mismo encuadre que Mendeley, (3) normalizan brillo y contraste con CLAHE, (4) redimensionan a 330×330 px.</w:t>
+      </w:r>
+    </w:p>
+    <w:p>
+      <w:pPr>
+        <w:spacing w:after="100"/>
+      </w:pPr>
+      <w:r>
+        <w:rPr>
+          <w:b/>
+        </w:rPr>
+        <w:t xml:space="preserve">Paso 4 — Nuevo dataset con las imágenes procesadas. </w:t>
+      </w:r>
+      <w:r>
+        <w:t xml:space="preserve">Se conservan las detecciones con estado "ok" más las rescatadas en revisión manual; en Rohu además se excluyen los falsos positivos confirmados (escama, aleta, borrosa). Resultado: Trucha 1,150 imágenes y Rohu 1,261 imágenes (domains.py).</w:t>
+      </w:r>
+    </w:p>
+    <w:p>
+      <w:pPr>
+        <w:spacing w:after="100"/>
+      </w:pPr>
+      <w:r>
+        <w:rPr>
+          <w:b/>
+        </w:rPr>
+        <w:t xml:space="preserve">Paso 5 — Partición en 5 folds. </w:t>
+      </w:r>
+      <w:r>
+        <w:t xml:space="preserve">Trucha: StratifiedKFold. Rohu: StratifiedGroupKFold, agrupando casi-duplicados (fotos en ráfaga detectadas por aHash, detectar_duplicados.py) para que una foto y su casi-gemela no queden una en entrenamiento y otra en validación. Ambos con seed=42 y estratificados por clase. En cada fold, 4/5 de las imágenes son de entrenamiento y 1/5 de validación.</w:t>
+      </w:r>
+    </w:p>
+    <w:p>
+      <w:pPr>
+        <w:spacing w:after="100"/>
+      </w:pPr>
+      <w:r>
+        <w:rPr>
+          <w:b/>
+        </w:rPr>
+        <w:t xml:space="preserve">Paso 6 — Entrenamiento congelado. </w:t>
+      </w:r>
+      <w:r>
+        <w:t xml:space="preserve">En el fold k se carga el checkpoint de Mendeley del mismo fold k, se congela el backbone (sección 1.1) y se entrena solo la cabeza con la porción de entrenamiento del fold, con augmentación y sin x2 (sección 1.5). El resultado es un modelo nuevo: backbone de Mendeley + cabeza adaptada al dominio objetivo.</w:t>
+      </w:r>
+    </w:p>
+    <w:p>
+      <w:pPr>
+        <w:spacing w:after="100"/>
+      </w:pPr>
+      <w:r>
+        <w:rPr>
+          <w:b/>
+        </w:rPr>
+        <w:t xml:space="preserve">Paso 7 — Evaluación. </w:t>
+      </w:r>
+      <w:r>
+        <w:t xml:space="preserve">El modelo resultante se evalúa sobre la porción de validación del fold, con imágenes que no vio durante el entrenamiento. Esta misma porción se usa para elegir la mejor época (early stopping); no existe un conjunto de test separado.</w:t>
+      </w:r>
+    </w:p>
+    <w:p>
+      <w:pPr>
+        <w:spacing w:after="100"/>
+      </w:pPr>
+      <w:r>
+        <w:rPr>
+          <w:b/>
+        </w:rPr>
+        <w:t xml:space="preserve">Paso 8 — Resultados. </w:t>
+      </w:r>
+      <w:r>
+        <w:t xml:space="preserve">Por fold se calculan F1 macro y Accuracy (fórmulas en la sección 2.2). El valor de las tablas por fold es la media de los 5 folds. Además, las predicciones de los 5 folds se unen para la matriz de confusión, la curva ROC y el AUC pooled (sección 1.6). Con F1 se calculan TRD, Brecha y RBE (sección 2.4).</w:t>
+      </w:r>
+    </w:p>
+    <w:p>
+      <w:pPr>
+        <w:spacing w:after="100"/>
+      </w:pPr>
+      <w:r>
+        <w:rPr>
+          <w:b/>
+        </w:rPr>
+        <w:t xml:space="preserve">Folds y corridas: </w:t>
+      </w:r>
+      <w:r>
+        <w:t xml:space="preserve">5 folds × 2 modelos × 2 dominios = 20 entrenamientos, todos sin x2. Se hizo una corrida por fold con seed=42; no se repitió con varias semillas.</w:t>
       </w:r>
     </w:p>
     <w:p>
@@ -114,15 +405,23 @@
         <w:spacing w:after="90" w:before="180"/>
       </w:pPr>
       <w:r>
-        <w:t xml:space="preserve">1.3 Entrenamiento y selección del mejor epoch</w:t>
-      </w:r>
-    </w:p>
-    <w:p>
-      <w:pPr>
-        <w:spacing w:after="100"/>
-      </w:pPr>
-      <w:r>
-        <w:t xml:space="preserve">5-fold estratificado por clase (fresco/no_fresco). Por cada fold: hasta 30 épocas, early stopping con paciencia=8 épocas sin mejora en val_F1. Se recarga el checkpoint del mejor val_F1 (no el peso del último epoch) y se evalúa una sola vez contra la partición de validación de ese fold.</w:t>
+        <w:t xml:space="preserve">1.3 Datasets evaluados</w:t>
+      </w:r>
+    </w:p>
+    <w:p>
+      <w:pPr>
+        <w:spacing w:after="100"/>
+      </w:pPr>
+      <w:r>
+        <w:t xml:space="preserve">Trucha: 1,150 imágenes (OneDrive), dominio objetivo original del proyecto.</w:t>
+      </w:r>
+    </w:p>
+    <w:p>
+      <w:pPr>
+        <w:spacing w:after="100"/>
+      </w:pPr>
+      <w:r>
+        <w:t xml:space="preserve">Rohu: 1,261 imágenes, dominio objetivo evaluado bajo el mismo protocolo que Trucha, con el mismo pipeline de entrenamiento.</w:t>
       </w:r>
     </w:p>
     <w:p>
@@ -131,15 +430,15 @@
         <w:spacing w:after="90" w:before="180"/>
       </w:pPr>
       <w:r>
-        <w:t xml:space="preserve">1.4 Augmentación: sin x2</w:t>
-      </w:r>
-    </w:p>
-    <w:p>
-      <w:pPr>
-        <w:spacing w:after="100"/>
-      </w:pPr>
-      <w:r>
-        <w:t xml:space="preserve">Sin x2: cada imagen de entrenamiento aparece una sola vez por época (una vista), con la augmentación estocástica estándar (recorte/flip/color/blur/rotación/erasing). La validación nunca se aumenta.</w:t>
+        <w:t xml:space="preserve">1.4 Entrenamiento y selección del mejor epoch</w:t>
+      </w:r>
+    </w:p>
+    <w:p>
+      <w:pPr>
+        <w:spacing w:after="100"/>
+      </w:pPr>
+      <w:r>
+        <w:t xml:space="preserve">5-fold estratificado por clase (fresco/no_fresco). Por cada fold: hasta 30 épocas, early stopping con paciencia=8 épocas sin mejora en val_F1. Se recarga el checkpoint del mejor val_F1 (no el peso del último epoch) y se evalúa una sola vez contra la partición de validación de ese fold.</w:t>
       </w:r>
     </w:p>
     <w:p>
@@ -148,7 +447,257 @@
         <w:spacing w:after="90" w:before="180"/>
       </w:pPr>
       <w:r>
-        <w:t xml:space="preserve">1.5 Resultado pooled — cómo se calcula</w:t>
+        <w:t xml:space="preserve">1.5 Augmentación: sin x2</w:t>
+      </w:r>
+    </w:p>
+    <w:p>
+      <w:pPr>
+        <w:spacing w:after="100"/>
+      </w:pPr>
+      <w:r>
+        <w:t xml:space="preserve">La augmentación de datos genera, durante el entrenamiento, versiones modificadas al azar de cada imagen (girada, más clara, desenfocada, etc.). El modelo nunca ve exactamente la misma imagen dos veces, y así aprende la característica que importa (el estado del ojo) en lugar de memorizar detalles de cada foto.</w:t>
+      </w:r>
+    </w:p>
+    <w:p>
+      <w:pPr>
+        <w:spacing w:after="80" w:before="140"/>
+      </w:pPr>
+      <w:r>
+        <w:rPr>
+          <w:b/>
+        </w:rPr>
+        <w:t xml:space="preserve">Transformaciones aplicadas (run_freshness_v3.py, get_transforms_v3)</w:t>
+      </w:r>
+    </w:p>
+    <w:p>
+      <w:pPr>
+        <w:spacing w:after="100"/>
+      </w:pPr>
+      <w:r>
+        <w:t xml:space="preserve">Se aplican en este orden, cada una con valores elegidos al azar en cada uso:</w:t>
+      </w:r>
+    </w:p>
+    <w:p>
+      <w:pPr>
+        <w:spacing w:after="100"/>
+      </w:pPr>
+      <w:r>
+        <w:rPr>
+          <w:b/>
+        </w:rPr>
+        <w:t xml:space="preserve">1. Recorte aleatorio: </w:t>
+      </w:r>
+      <w:r>
+        <w:t xml:space="preserve">la imagen se redimensiona a 32 px más que el tamaño de entrada (256 para ViT-Base/16, 288 para DenseNet-121) y se recorta una ventana al azar de 224×224 o 256×256. Simula que el ojo no siempre queda en el mismo lugar del encuadre, por ejemplo por pequeñas imprecisiones del detector.</w:t>
+      </w:r>
+    </w:p>
+    <w:p>
+      <w:pPr>
+        <w:spacing w:after="100"/>
+      </w:pPr>
+      <w:r>
+        <w:rPr>
+          <w:b/>
+        </w:rPr>
+        <w:t xml:space="preserve">2. Volteo horizontal (probabilidad 50%) y vertical (20%): </w:t>
+      </w:r>
+      <w:r>
+        <w:t xml:space="preserve">simula ojo izquierdo o derecho y distinta orientación del pescado.</w:t>
+      </w:r>
+    </w:p>
+    <w:p>
+      <w:pPr>
+        <w:spacing w:after="100"/>
+      </w:pPr>
+      <w:r>
+        <w:rPr>
+          <w:b/>
+        </w:rPr>
+        <w:t xml:space="preserve">3. Variación de color (ColorJitter): </w:t>
+      </w:r>
+      <w:r>
+        <w:t xml:space="preserve">brillo ±30%, contraste ±30%, saturación ±40% y tono ±0.1. Simula distinta iluminación y cámaras, que es justamente lo que cambia entre Mendeley, Trucha y Rohu.</w:t>
+      </w:r>
+    </w:p>
+    <w:p>
+      <w:pPr>
+        <w:spacing w:after="100"/>
+      </w:pPr>
+      <w:r>
+        <w:rPr>
+          <w:b/>
+        </w:rPr>
+        <w:t xml:space="preserve">4. Escala de grises (5%): </w:t>
+      </w:r>
+      <w:r>
+        <w:t xml:space="preserve">de vez en cuando se quita el color, para que el modelo no dependa solo del color del ojo.</w:t>
+      </w:r>
+    </w:p>
+    <w:p>
+      <w:pPr>
+        <w:spacing w:after="100"/>
+      </w:pPr>
+      <w:r>
+        <w:rPr>
+          <w:b/>
+        </w:rPr>
+        <w:t xml:space="preserve">5. Desenfoque gaussiano: </w:t>
+      </w:r>
+      <w:r>
+        <w:t xml:space="preserve">kernel 3×3, sigma entre 0.1 y 1.5. Simula fotos levemente fuera de foco.</w:t>
+      </w:r>
+    </w:p>
+    <w:p>
+      <w:pPr>
+        <w:spacing w:after="100"/>
+      </w:pPr>
+      <w:r>
+        <w:rPr>
+          <w:b/>
+        </w:rPr>
+        <w:t xml:space="preserve">6. Rotación: </w:t>
+      </w:r>
+      <w:r>
+        <w:t xml:space="preserve">hasta ±15°. Simula inclinación del pescado o de la cámara.</w:t>
+      </w:r>
+    </w:p>
+    <w:p>
+      <w:pPr>
+        <w:spacing w:after="100"/>
+      </w:pPr>
+      <w:r>
+        <w:rPr>
+          <w:b/>
+        </w:rPr>
+        <w:t xml:space="preserve">7. Borrado aleatorio (RandomErasing, 10%): </w:t>
+      </w:r>
+      <w:r>
+        <w:t xml:space="preserve">tapa un rectángulo de entre 2% y 10% del área. Simula reflejos u oclusiones y obliga al modelo a no depender de un solo detalle.</w:t>
+      </w:r>
+    </w:p>
+    <w:p>
+      <w:pPr>
+        <w:spacing w:after="100"/>
+      </w:pPr>
+      <w:r>
+        <w:t xml:space="preserve">Al final la imagen se normaliza con la media y desviación de ImageNet. Esto no es augmentación: se aplica siempre, también en validación.</w:t>
+      </w:r>
+    </w:p>
+    <w:p>
+      <w:pPr>
+        <w:spacing w:after="100"/>
+      </w:pPr>
+      <w:r>
+        <w:rPr>
+          <w:b/>
+        </w:rPr>
+        <w:t xml:space="preserve">Importante: </w:t>
+      </w:r>
+      <w:r>
+        <w:t xml:space="preserve">las transformaciones se aplican en memoria al cargar cada imagen; no se guardan copias en disco. Las imágenes de validación nunca se modifican (solo redimensionar y normalizar), para que la métrica refleje imágenes reales.</w:t>
+      </w:r>
+    </w:p>
+    <w:p>
+      <w:pPr>
+        <w:spacing w:after="80" w:before="140"/>
+      </w:pPr>
+      <w:r>
+        <w:rPr>
+          <w:b/>
+        </w:rPr>
+        <w:t xml:space="preserve">Una vista por imagen y por época (sin x2)</w:t>
+      </w:r>
+    </w:p>
+    <w:p>
+      <w:pPr>
+        <w:spacing w:after="100"/>
+      </w:pPr>
+      <w:r>
+        <w:t xml:space="preserve">Cada imagen de entrenamiento aparece una sola vez por época, con una transformación al azar. En Trucha, un fold tiene 920 imágenes de entrenamiento, es decir 920 vistas por época. Como las transformaciones cambian en cada época, a lo largo de hasta 30 épocas el modelo ve muchas versiones distintas de cada foto sin agregar fotos nuevas.</w:t>
+      </w:r>
+    </w:p>
+    <w:p>
+      <w:pPr>
+        <w:spacing w:after="100"/>
+      </w:pPr>
+      <w:r>
+        <w:rPr>
+          <w:b/>
+        </w:rPr>
+        <w:t xml:space="preserve">Ejemplo: </w:t>
+      </w:r>
+      <w:r>
+        <w:t xml:space="preserve">en la época 1 una foto puede salir volteada, 20% más clara y girada 8°; en la época 2, sin voltear, desenfocada y con el ojo desplazado a la izquierda.</w:t>
+      </w:r>
+    </w:p>
+    <w:p>
+      <w:pPr>
+        <w:spacing w:after="100"/>
+      </w:pPr>
+      <w:r>
+        <w:t xml:space="preserve">Sin x2 significa que la lista de entrenamiento no se duplica: se descartó la variante x2, en la que cada imagen aparecía 2 veces por época con dos transformaciones distintas.</w:t>
+      </w:r>
+    </w:p>
+    <w:p>
+      <w:pPr>
+        <w:spacing w:after="80" w:before="140"/>
+      </w:pPr>
+      <w:r>
+        <w:rPr>
+          <w:b/>
+        </w:rPr>
+        <w:t xml:space="preserve">Por qué se eligió</w:t>
+      </w:r>
+    </w:p>
+    <w:p>
+      <w:pPr>
+        <w:spacing w:after="100"/>
+      </w:pPr>
+      <w:r>
+        <w:rPr>
+          <w:b/>
+        </w:rPr>
+        <w:t xml:space="preserve">Pocos datos: </w:t>
+      </w:r>
+      <w:r>
+        <w:t xml:space="preserve">cada fold entrena con ~900-1,000 imágenes, frente a las 8,000 de Mendeley. Con tan pocas imágenes, la cabeza puede memorizar el conjunto de entrenamiento; la augmentación lo reduce.</w:t>
+      </w:r>
+    </w:p>
+    <w:p>
+      <w:pPr>
+        <w:spacing w:after="100"/>
+      </w:pPr>
+      <w:r>
+        <w:rPr>
+          <w:b/>
+        </w:rPr>
+        <w:t xml:space="preserve">Coincide con el cambio de dominio: </w:t>
+      </w:r>
+      <w:r>
+        <w:t xml:space="preserve">lo que diferencia a los datasets es la iluminación, la cámara, el ángulo y el enfoque. Las transformaciones simulan esas mismas diferencias, por lo que entrenan al modelo para tolerarlas, que es el objetivo de generalización del proyecto.</w:t>
+      </w:r>
+    </w:p>
+    <w:p>
+      <w:pPr>
+        <w:spacing w:after="100"/>
+      </w:pPr>
+      <w:r>
+        <w:rPr>
+          <w:b/>
+        </w:rPr>
+        <w:t xml:space="preserve">Misma augmentación que en Mendeley: </w:t>
+      </w:r>
+      <w:r>
+        <w:t xml:space="preserve">get_transforms_v3 es la misma función usada al entrenar los checkpoints de Mendeley, así que el dominio objetivo se entrena con el mismo tratamiento de imágenes que el dominio fuente.</w:t>
+      </w:r>
+    </w:p>
+    <w:p>
+      <w:pPr>
+        <w:pStyle w:val="Heading2"/>
+        <w:spacing w:after="90" w:before="180"/>
+      </w:pPr>
+      <w:r>
+        <w:t xml:space="preserve">1.6 Resultado pooled — cómo se calcula</w:t>
       </w:r>
     </w:p>
     <w:p>

</xml_diff>

<commit_message>
Revierte la ampliacion de la documentacion tecnica y del README (commit 44c2428): vuelve a la version anterior de Documentacion_Tecnica_ViT_DenseNet.docx y README.md
Co-Authored-By: Claude Opus 5.5 <noreply@anthropic.com>
Claude-Session: https://claude.ai/code/session_0153ECmVtHffrApi7B7wry8e
</commit_message>
<xml_diff>
--- a/Documentacion_Tecnica_ViT_DenseNet.docx
+++ b/Documentacion_Tecnica_ViT_DenseNet.docx
@@ -85,184 +85,11 @@
     </w:p>
     <w:p>
       <w:pPr>
-        <w:spacing w:after="80" w:before="140"/>
-      </w:pPr>
-      <w:r>
-        <w:rPr>
-          <w:b/>
-        </w:rPr>
-        <w:t xml:space="preserve">Partes del modelo</w:t>
-      </w:r>
-    </w:p>
-    <w:p>
-      <w:pPr>
-        <w:spacing w:after="100"/>
-      </w:pPr>
-      <w:r>
-        <w:rPr>
-          <w:b/>
-        </w:rPr>
-        <w:t xml:space="preserve">Backbone: </w:t>
-      </w:r>
-      <w:r>
-        <w:t xml:space="preserve">las capas que extraen las características de la imagen. En ViT-Base/16 son los 12 bloques transformer; en DenseNet-121, los bloques densos convolucionales. Es la parte que "aprendió a ver" el ojo del pescado durante el entrenamiento en Mendeley.</w:t>
-      </w:r>
-    </w:p>
-    <w:p>
-      <w:pPr>
-        <w:spacing w:after="100"/>
-      </w:pPr>
-      <w:r>
-        <w:rPr>
-          <w:b/>
-        </w:rPr>
-        <w:t xml:space="preserve">Cabeza de clasificación: </w:t>
-      </w:r>
-      <w:r>
-        <w:t xml:space="preserve">la última capa lineal, que recibe el vector de características del backbone y produce 2 salidas (fresco / no_fresco). Es la única parte que se vuelve a entrenar.</w:t>
-      </w:r>
-    </w:p>
-    <w:p>
-      <w:pPr>
-        <w:spacing w:after="80" w:before="140"/>
-      </w:pPr>
-      <w:r>
-        <w:rPr>
-          <w:b/>
-        </w:rPr>
-        <w:t xml:space="preserve">Qué significa congelar, en el código (finetune_target_x2.py, finetune_eval_fold)</w:t>
-      </w:r>
-    </w:p>
-    <w:p>
-      <w:pPr>
-        <w:spacing w:after="100"/>
-      </w:pPr>
-      <w:r>
-        <w:rPr>
-          <w:b/>
-        </w:rPr>
-        <w:t xml:space="preserve">Sin gradiente: </w:t>
-      </w:r>
-      <w:r>
-        <w:t xml:space="preserve">todos los parámetros del backbone se marcan con requires_grad=False. El optimizador solo recibe los parámetros de la cabeza, por lo que los pesos del backbone no cambian.</w:t>
-      </w:r>
-    </w:p>
-    <w:p>
-      <w:pPr>
-        <w:spacing w:after="100"/>
-      </w:pPr>
-      <w:r>
-        <w:rPr>
-          <w:b/>
-        </w:rPr>
-        <w:t xml:space="preserve">Backbone en modo eval(): </w:t>
-      </w:r>
-      <w:r>
-        <w:t xml:space="preserve">durante el entrenamiento el backbone se mantiene en eval() y solo la cabeza en train(). Así BatchNorm (presente en DenseNet-121) no actualiza sus estadísticas con datos del dominio objetivo y Dropout queda desactivado. Sin esto no sería un backbone realmente congelado, sino una adaptación parcial.</w:t>
-      </w:r>
-    </w:p>
-    <w:p>
-      <w:pPr>
-        <w:spacing w:after="100"/>
-      </w:pPr>
-      <w:r>
-        <w:rPr>
-          <w:b/>
-        </w:rPr>
-        <w:t xml:space="preserve">Cabeza: </w:t>
-      </w:r>
-      <w:r>
-        <w:t xml:space="preserve">se parte de la cabeza del checkpoint de Mendeley y se reentrena con imágenes del dominio objetivo. No se agrega una capa nueva: la "capa adicional" del flujo es esta cabeza reentrenada.</w:t>
-      </w:r>
-    </w:p>
-    <w:p>
-      <w:pPr>
-        <w:spacing w:after="100"/>
-      </w:pPr>
-      <w:r>
-        <w:rPr>
-          <w:b/>
-        </w:rPr>
-        <w:t xml:space="preserve">Hiperparámetros: </w:t>
-      </w:r>
-      <w:r>
-        <w:t xml:space="preserve">AdamW (lr=1e-4, weight_decay=1e-4), CosineAnnealingLR, CrossEntropyLoss, hasta 30 épocas, early stopping con paciencia=8.</w:t>
-      </w:r>
-    </w:p>
-    <w:p>
-      <w:pPr>
-        <w:spacing w:after="80" w:before="140"/>
-      </w:pPr>
-      <w:r>
-        <w:rPr>
-          <w:b/>
-        </w:rPr>
-        <w:t xml:space="preserve">Comparación con los otros enfoques</w:t>
-      </w:r>
-    </w:p>
-    <w:p>
-      <w:pPr>
-        <w:spacing w:after="100"/>
-      </w:pPr>
-      <w:r>
-        <w:rPr>
-          <w:b/>
-        </w:rPr>
-        <w:t xml:space="preserve">Zero-shot: </w:t>
-      </w:r>
-      <w:r>
-        <w:t xml:space="preserve">el modelo de Mendeley se evalúa directamente en el dominio objetivo, sin entrenar nada. Mide la generalización pura.</w:t>
-      </w:r>
-    </w:p>
-    <w:p>
-      <w:pPr>
-        <w:spacing w:after="100"/>
-      </w:pPr>
-      <w:r>
-        <w:rPr>
-          <w:b/>
-        </w:rPr>
-        <w:t xml:space="preserve">Congelado (este documento): </w:t>
-      </w:r>
-      <w:r>
-        <w:t xml:space="preserve">se entrena solo la cabeza con imágenes del dominio objetivo. Mide cuán transferibles son las características aprendidas en Mendeley: si una cabeza lineal basta para separar las clases, el backbone ya generaliza.</w:t>
-      </w:r>
-    </w:p>
-    <w:p>
-      <w:pPr>
-        <w:spacing w:after="100"/>
-      </w:pPr>
-      <w:r>
-        <w:rPr>
-          <w:b/>
-        </w:rPr>
-        <w:t xml:space="preserve">Fine-tuning completo: </w:t>
-      </w:r>
-      <w:r>
-        <w:t xml:space="preserve">se entrenan todos los pesos (backbone con lr más bajo, cabeza con lr más alto). Tiene más capacidad de adaptación, pero también más inestabilidad y más riesgo de sobreajuste con ~1,000 imágenes.</w:t>
-      </w:r>
-    </w:p>
-    <w:p>
-      <w:pPr>
-        <w:spacing w:after="100"/>
-      </w:pPr>
-      <w:r>
-        <w:rPr>
-          <w:b/>
-        </w:rPr>
-        <w:t xml:space="preserve">Por qué congelado: </w:t>
-      </w:r>
-      <w:r>
-        <w:t xml:space="preserve">con pocos parámetros libres el entrenamiento es estable entre folds, el riesgo de sobreajuste es bajo y la comparación entre ViT-Base/16 y DenseNet-121 refleja la calidad de sus características, no su capacidad de reaprender.</w:t>
-      </w:r>
-    </w:p>
-    <w:p>
-      <w:pPr>
         <w:pStyle w:val="Heading2"/>
         <w:spacing w:after="90" w:before="180"/>
       </w:pPr>
       <w:r>
-        <w:t xml:space="preserve">1.2 Flujo del experimento</w:t>
+        <w:t xml:space="preserve">1.2 Datasets evaluados</w:t>
       </w:r>
     </w:p>
     <w:p>
@@ -270,7 +97,7 @@
         <w:spacing w:after="100"/>
       </w:pPr>
       <w:r>
-        <w:t xml:space="preserve">El mismo flujo se aplica por separado a cada dominio objetivo (Trucha y Rohu), a cada modelo (ViT-Base/16, DenseNet-121).</w:t>
+        <w:t xml:space="preserve">Trucha: 1,150 imágenes (OneDrive), dominio objetivo original del proyecto.</w:t>
       </w:r>
     </w:p>
     <w:p>
@@ -278,125 +105,7 @@
         <w:spacing w:after="100"/>
       </w:pPr>
       <w:r>
-        <w:rPr>
-          <w:b/>
-        </w:rPr>
-        <w:t xml:space="preserve">Paso 1 — Modelo entrenado en Mendeley. </w:t>
-      </w:r>
-      <w:r>
-        <w:t xml:space="preserve">Punto de partida: 5 checkpoints por arquitectura ({modelo}_fold{k}_best.pt, k=1..5), entrenados sobre Mendeley (8,000 imágenes ya recortadas al ojo).</w:t>
-      </w:r>
-    </w:p>
-    <w:p>
-      <w:pPr>
-        <w:spacing w:after="100"/>
-      </w:pPr>
-      <w:r>
-        <w:rPr>
-          <w:b/>
-        </w:rPr>
-        <w:t xml:space="preserve">Paso 2 — Dataset objetivo con imágenes diferentes. </w:t>
-      </w:r>
-      <w:r>
-        <w:t xml:space="preserve">Las fotos originales de Trucha y Rohu son de cabeza completa a resolución de cámara (~4160×3120 y ~4032×3024 px). Usarlas tal cual mezclaría el cambio de dominio con un cambio de encuadre, y la comparación no sería válida.</w:t>
-      </w:r>
-    </w:p>
-    <w:p>
-      <w:pPr>
-        <w:spacing w:after="100"/>
-      </w:pPr>
-      <w:r>
-        <w:rPr>
-          <w:b/>
-        </w:rPr>
-        <w:t xml:space="preserve">Paso 3 — Función de procesamiento de imágenes. </w:t>
-      </w:r>
-      <w:r>
-        <w:t xml:space="preserve">preprocess_ojos_trucha.py y preprocess_ojos_rohu.py: (1) detectan el ojo con Fast Radial Symmetry Transform, (2) recortan un cuadrado centrado en el ojo con el mismo encuadre que Mendeley, (3) normalizan brillo y contraste con CLAHE, (4) redimensionan a 330×330 px.</w:t>
-      </w:r>
-    </w:p>
-    <w:p>
-      <w:pPr>
-        <w:spacing w:after="100"/>
-      </w:pPr>
-      <w:r>
-        <w:rPr>
-          <w:b/>
-        </w:rPr>
-        <w:t xml:space="preserve">Paso 4 — Nuevo dataset con las imágenes procesadas. </w:t>
-      </w:r>
-      <w:r>
-        <w:t xml:space="preserve">Se conservan las detecciones con estado "ok" más las rescatadas en revisión manual; en Rohu además se excluyen los falsos positivos confirmados (escama, aleta, borrosa). Resultado: Trucha 1,150 imágenes y Rohu 1,261 imágenes (domains.py).</w:t>
-      </w:r>
-    </w:p>
-    <w:p>
-      <w:pPr>
-        <w:spacing w:after="100"/>
-      </w:pPr>
-      <w:r>
-        <w:rPr>
-          <w:b/>
-        </w:rPr>
-        <w:t xml:space="preserve">Paso 5 — Partición en 5 folds. </w:t>
-      </w:r>
-      <w:r>
-        <w:t xml:space="preserve">Trucha: StratifiedKFold. Rohu: StratifiedGroupKFold, agrupando casi-duplicados (fotos en ráfaga detectadas por aHash, detectar_duplicados.py) para que una foto y su casi-gemela no queden una en entrenamiento y otra en validación. Ambos con seed=42 y estratificados por clase. En cada fold, 4/5 de las imágenes son de entrenamiento y 1/5 de validación.</w:t>
-      </w:r>
-    </w:p>
-    <w:p>
-      <w:pPr>
-        <w:spacing w:after="100"/>
-      </w:pPr>
-      <w:r>
-        <w:rPr>
-          <w:b/>
-        </w:rPr>
-        <w:t xml:space="preserve">Paso 6 — Entrenamiento congelado. </w:t>
-      </w:r>
-      <w:r>
-        <w:t xml:space="preserve">En el fold k se carga el checkpoint de Mendeley del mismo fold k, se congela el backbone (sección 1.1) y se entrena solo la cabeza con la porción de entrenamiento del fold, con augmentación y sin x2 (sección 1.5). El resultado es un modelo nuevo: backbone de Mendeley + cabeza adaptada al dominio objetivo.</w:t>
-      </w:r>
-    </w:p>
-    <w:p>
-      <w:pPr>
-        <w:spacing w:after="100"/>
-      </w:pPr>
-      <w:r>
-        <w:rPr>
-          <w:b/>
-        </w:rPr>
-        <w:t xml:space="preserve">Paso 7 — Evaluación. </w:t>
-      </w:r>
-      <w:r>
-        <w:t xml:space="preserve">El modelo resultante se evalúa sobre la porción de validación del fold, con imágenes que no vio durante el entrenamiento. Esta misma porción se usa para elegir la mejor época (early stopping); no existe un conjunto de test separado.</w:t>
-      </w:r>
-    </w:p>
-    <w:p>
-      <w:pPr>
-        <w:spacing w:after="100"/>
-      </w:pPr>
-      <w:r>
-        <w:rPr>
-          <w:b/>
-        </w:rPr>
-        <w:t xml:space="preserve">Paso 8 — Resultados. </w:t>
-      </w:r>
-      <w:r>
-        <w:t xml:space="preserve">Por fold se calculan F1 macro y Accuracy (fórmulas en la sección 2.2). El valor de las tablas por fold es la media de los 5 folds. Además, las predicciones de los 5 folds se unen para la matriz de confusión, la curva ROC y el AUC pooled (sección 1.6). Con F1 se calculan TRD, Brecha y RBE (sección 2.4).</w:t>
-      </w:r>
-    </w:p>
-    <w:p>
-      <w:pPr>
-        <w:spacing w:after="100"/>
-      </w:pPr>
-      <w:r>
-        <w:rPr>
-          <w:b/>
-        </w:rPr>
-        <w:t xml:space="preserve">Folds y corridas: </w:t>
-      </w:r>
-      <w:r>
-        <w:t xml:space="preserve">5 folds × 2 modelos × 2 dominios = 20 entrenamientos, todos sin x2. Se hizo una corrida por fold con seed=42; no se repitió con varias semillas.</w:t>
+        <w:t xml:space="preserve">Rohu: 1,261 imágenes, dominio objetivo evaluado bajo el mismo protocolo que Trucha, con el mismo pipeline de entrenamiento.</w:t>
       </w:r>
     </w:p>
     <w:p>
@@ -405,7 +114,7 @@
         <w:spacing w:after="90" w:before="180"/>
       </w:pPr>
       <w:r>
-        <w:t xml:space="preserve">1.3 Datasets evaluados</w:t>
+        <w:t xml:space="preserve">1.3 Entrenamiento y selección del mejor epoch</w:t>
       </w:r>
     </w:p>
     <w:p>
@@ -413,15 +122,7 @@
         <w:spacing w:after="100"/>
       </w:pPr>
       <w:r>
-        <w:t xml:space="preserve">Trucha: 1,150 imágenes (OneDrive), dominio objetivo original del proyecto.</w:t>
-      </w:r>
-    </w:p>
-    <w:p>
-      <w:pPr>
-        <w:spacing w:after="100"/>
-      </w:pPr>
-      <w:r>
-        <w:t xml:space="preserve">Rohu: 1,261 imágenes, dominio objetivo evaluado bajo el mismo protocolo que Trucha, con el mismo pipeline de entrenamiento.</w:t>
+        <w:t xml:space="preserve">5-fold estratificado por clase (fresco/no_fresco). Por cada fold: hasta 30 épocas, early stopping con paciencia=8 épocas sin mejora en val_F1. Se recarga el checkpoint del mejor val_F1 (no el peso del último epoch) y se evalúa una sola vez contra la partición de validación de ese fold.</w:t>
       </w:r>
     </w:p>
     <w:p>
@@ -430,7 +131,7 @@
         <w:spacing w:after="90" w:before="180"/>
       </w:pPr>
       <w:r>
-        <w:t xml:space="preserve">1.4 Entrenamiento y selección del mejor epoch</w:t>
+        <w:t xml:space="preserve">1.4 Augmentación: sin x2</w:t>
       </w:r>
     </w:p>
     <w:p>
@@ -438,7 +139,7 @@
         <w:spacing w:after="100"/>
       </w:pPr>
       <w:r>
-        <w:t xml:space="preserve">5-fold estratificado por clase (fresco/no_fresco). Por cada fold: hasta 30 épocas, early stopping con paciencia=8 épocas sin mejora en val_F1. Se recarga el checkpoint del mejor val_F1 (no el peso del último epoch) y se evalúa una sola vez contra la partición de validación de ese fold.</w:t>
+        <w:t xml:space="preserve">Sin x2: cada imagen de entrenamiento aparece una sola vez por época (una vista), con la augmentación estocástica estándar (recorte/flip/color/blur/rotación/erasing). La validación nunca se aumenta.</w:t>
       </w:r>
     </w:p>
     <w:p>
@@ -447,257 +148,7 @@
         <w:spacing w:after="90" w:before="180"/>
       </w:pPr>
       <w:r>
-        <w:t xml:space="preserve">1.5 Augmentación: sin x2</w:t>
-      </w:r>
-    </w:p>
-    <w:p>
-      <w:pPr>
-        <w:spacing w:after="100"/>
-      </w:pPr>
-      <w:r>
-        <w:t xml:space="preserve">La augmentación de datos genera, durante el entrenamiento, versiones modificadas al azar de cada imagen (girada, más clara, desenfocada, etc.). El modelo nunca ve exactamente la misma imagen dos veces, y así aprende la característica que importa (el estado del ojo) en lugar de memorizar detalles de cada foto.</w:t>
-      </w:r>
-    </w:p>
-    <w:p>
-      <w:pPr>
-        <w:spacing w:after="80" w:before="140"/>
-      </w:pPr>
-      <w:r>
-        <w:rPr>
-          <w:b/>
-        </w:rPr>
-        <w:t xml:space="preserve">Transformaciones aplicadas (run_freshness_v3.py, get_transforms_v3)</w:t>
-      </w:r>
-    </w:p>
-    <w:p>
-      <w:pPr>
-        <w:spacing w:after="100"/>
-      </w:pPr>
-      <w:r>
-        <w:t xml:space="preserve">Se aplican en este orden, cada una con valores elegidos al azar en cada uso:</w:t>
-      </w:r>
-    </w:p>
-    <w:p>
-      <w:pPr>
-        <w:spacing w:after="100"/>
-      </w:pPr>
-      <w:r>
-        <w:rPr>
-          <w:b/>
-        </w:rPr>
-        <w:t xml:space="preserve">1. Recorte aleatorio: </w:t>
-      </w:r>
-      <w:r>
-        <w:t xml:space="preserve">la imagen se redimensiona a 32 px más que el tamaño de entrada (256 para ViT-Base/16, 288 para DenseNet-121) y se recorta una ventana al azar de 224×224 o 256×256. Simula que el ojo no siempre queda en el mismo lugar del encuadre, por ejemplo por pequeñas imprecisiones del detector.</w:t>
-      </w:r>
-    </w:p>
-    <w:p>
-      <w:pPr>
-        <w:spacing w:after="100"/>
-      </w:pPr>
-      <w:r>
-        <w:rPr>
-          <w:b/>
-        </w:rPr>
-        <w:t xml:space="preserve">2. Volteo horizontal (probabilidad 50%) y vertical (20%): </w:t>
-      </w:r>
-      <w:r>
-        <w:t xml:space="preserve">simula ojo izquierdo o derecho y distinta orientación del pescado.</w:t>
-      </w:r>
-    </w:p>
-    <w:p>
-      <w:pPr>
-        <w:spacing w:after="100"/>
-      </w:pPr>
-      <w:r>
-        <w:rPr>
-          <w:b/>
-        </w:rPr>
-        <w:t xml:space="preserve">3. Variación de color (ColorJitter): </w:t>
-      </w:r>
-      <w:r>
-        <w:t xml:space="preserve">brillo ±30%, contraste ±30%, saturación ±40% y tono ±0.1. Simula distinta iluminación y cámaras, que es justamente lo que cambia entre Mendeley, Trucha y Rohu.</w:t>
-      </w:r>
-    </w:p>
-    <w:p>
-      <w:pPr>
-        <w:spacing w:after="100"/>
-      </w:pPr>
-      <w:r>
-        <w:rPr>
-          <w:b/>
-        </w:rPr>
-        <w:t xml:space="preserve">4. Escala de grises (5%): </w:t>
-      </w:r>
-      <w:r>
-        <w:t xml:space="preserve">de vez en cuando se quita el color, para que el modelo no dependa solo del color del ojo.</w:t>
-      </w:r>
-    </w:p>
-    <w:p>
-      <w:pPr>
-        <w:spacing w:after="100"/>
-      </w:pPr>
-      <w:r>
-        <w:rPr>
-          <w:b/>
-        </w:rPr>
-        <w:t xml:space="preserve">5. Desenfoque gaussiano: </w:t>
-      </w:r>
-      <w:r>
-        <w:t xml:space="preserve">kernel 3×3, sigma entre 0.1 y 1.5. Simula fotos levemente fuera de foco.</w:t>
-      </w:r>
-    </w:p>
-    <w:p>
-      <w:pPr>
-        <w:spacing w:after="100"/>
-      </w:pPr>
-      <w:r>
-        <w:rPr>
-          <w:b/>
-        </w:rPr>
-        <w:t xml:space="preserve">6. Rotación: </w:t>
-      </w:r>
-      <w:r>
-        <w:t xml:space="preserve">hasta ±15°. Simula inclinación del pescado o de la cámara.</w:t>
-      </w:r>
-    </w:p>
-    <w:p>
-      <w:pPr>
-        <w:spacing w:after="100"/>
-      </w:pPr>
-      <w:r>
-        <w:rPr>
-          <w:b/>
-        </w:rPr>
-        <w:t xml:space="preserve">7. Borrado aleatorio (RandomErasing, 10%): </w:t>
-      </w:r>
-      <w:r>
-        <w:t xml:space="preserve">tapa un rectángulo de entre 2% y 10% del área. Simula reflejos u oclusiones y obliga al modelo a no depender de un solo detalle.</w:t>
-      </w:r>
-    </w:p>
-    <w:p>
-      <w:pPr>
-        <w:spacing w:after="100"/>
-      </w:pPr>
-      <w:r>
-        <w:t xml:space="preserve">Al final la imagen se normaliza con la media y desviación de ImageNet. Esto no es augmentación: se aplica siempre, también en validación.</w:t>
-      </w:r>
-    </w:p>
-    <w:p>
-      <w:pPr>
-        <w:spacing w:after="100"/>
-      </w:pPr>
-      <w:r>
-        <w:rPr>
-          <w:b/>
-        </w:rPr>
-        <w:t xml:space="preserve">Importante: </w:t>
-      </w:r>
-      <w:r>
-        <w:t xml:space="preserve">las transformaciones se aplican en memoria al cargar cada imagen; no se guardan copias en disco. Las imágenes de validación nunca se modifican (solo redimensionar y normalizar), para que la métrica refleje imágenes reales.</w:t>
-      </w:r>
-    </w:p>
-    <w:p>
-      <w:pPr>
-        <w:spacing w:after="80" w:before="140"/>
-      </w:pPr>
-      <w:r>
-        <w:rPr>
-          <w:b/>
-        </w:rPr>
-        <w:t xml:space="preserve">Una vista por imagen y por época (sin x2)</w:t>
-      </w:r>
-    </w:p>
-    <w:p>
-      <w:pPr>
-        <w:spacing w:after="100"/>
-      </w:pPr>
-      <w:r>
-        <w:t xml:space="preserve">Cada imagen de entrenamiento aparece una sola vez por época, con una transformación al azar. En Trucha, un fold tiene 920 imágenes de entrenamiento, es decir 920 vistas por época. Como las transformaciones cambian en cada época, a lo largo de hasta 30 épocas el modelo ve muchas versiones distintas de cada foto sin agregar fotos nuevas.</w:t>
-      </w:r>
-    </w:p>
-    <w:p>
-      <w:pPr>
-        <w:spacing w:after="100"/>
-      </w:pPr>
-      <w:r>
-        <w:rPr>
-          <w:b/>
-        </w:rPr>
-        <w:t xml:space="preserve">Ejemplo: </w:t>
-      </w:r>
-      <w:r>
-        <w:t xml:space="preserve">en la época 1 una foto puede salir volteada, 20% más clara y girada 8°; en la época 2, sin voltear, desenfocada y con el ojo desplazado a la izquierda.</w:t>
-      </w:r>
-    </w:p>
-    <w:p>
-      <w:pPr>
-        <w:spacing w:after="100"/>
-      </w:pPr>
-      <w:r>
-        <w:t xml:space="preserve">Sin x2 significa que la lista de entrenamiento no se duplica: se descartó la variante x2, en la que cada imagen aparecía 2 veces por época con dos transformaciones distintas.</w:t>
-      </w:r>
-    </w:p>
-    <w:p>
-      <w:pPr>
-        <w:spacing w:after="80" w:before="140"/>
-      </w:pPr>
-      <w:r>
-        <w:rPr>
-          <w:b/>
-        </w:rPr>
-        <w:t xml:space="preserve">Por qué se eligió</w:t>
-      </w:r>
-    </w:p>
-    <w:p>
-      <w:pPr>
-        <w:spacing w:after="100"/>
-      </w:pPr>
-      <w:r>
-        <w:rPr>
-          <w:b/>
-        </w:rPr>
-        <w:t xml:space="preserve">Pocos datos: </w:t>
-      </w:r>
-      <w:r>
-        <w:t xml:space="preserve">cada fold entrena con ~900-1,000 imágenes, frente a las 8,000 de Mendeley. Con tan pocas imágenes, la cabeza puede memorizar el conjunto de entrenamiento; la augmentación lo reduce.</w:t>
-      </w:r>
-    </w:p>
-    <w:p>
-      <w:pPr>
-        <w:spacing w:after="100"/>
-      </w:pPr>
-      <w:r>
-        <w:rPr>
-          <w:b/>
-        </w:rPr>
-        <w:t xml:space="preserve">Coincide con el cambio de dominio: </w:t>
-      </w:r>
-      <w:r>
-        <w:t xml:space="preserve">lo que diferencia a los datasets es la iluminación, la cámara, el ángulo y el enfoque. Las transformaciones simulan esas mismas diferencias, por lo que entrenan al modelo para tolerarlas, que es el objetivo de generalización del proyecto.</w:t>
-      </w:r>
-    </w:p>
-    <w:p>
-      <w:pPr>
-        <w:spacing w:after="100"/>
-      </w:pPr>
-      <w:r>
-        <w:rPr>
-          <w:b/>
-        </w:rPr>
-        <w:t xml:space="preserve">Misma augmentación que en Mendeley: </w:t>
-      </w:r>
-      <w:r>
-        <w:t xml:space="preserve">get_transforms_v3 es la misma función usada al entrenar los checkpoints de Mendeley, así que el dominio objetivo se entrena con el mismo tratamiento de imágenes que el dominio fuente.</w:t>
-      </w:r>
-    </w:p>
-    <w:p>
-      <w:pPr>
-        <w:pStyle w:val="Heading2"/>
-        <w:spacing w:after="90" w:before="180"/>
-      </w:pPr>
-      <w:r>
-        <w:t xml:space="preserve">1.6 Resultado pooled — cómo se calcula</w:t>
+        <w:t xml:space="preserve">1.5 Resultado pooled — cómo se calcula</w:t>
       </w:r>
     </w:p>
     <w:p>

</xml_diff>

<commit_message>
Completa la documentacion tecnica con los datos que faltaban: F1 oficial por fold (N, F1, accuracy, epochs y tiempo de la corrida de 3_resultados/), composicion del conjunto Rohu (805 Trucha + 456 Rohu Kaggle), grupos de casi-duplicados de Rohu y el tamano del dominio fuente Mendeley
Co-Authored-By: Claude Opus 5.5 <noreply@anthropic.com>
Claude-Session: https://claude.ai/code/session_01H57NiR1mJmA9jsiQrmrPSF
</commit_message>
<xml_diff>
--- a/Documentacion_Tecnica_ViT_DenseNet.docx
+++ b/Documentacion_Tecnica_ViT_DenseNet.docx
@@ -482,6 +482,18 @@
     </w:p>
     <w:p>
       <w:r>
+        <w:rPr>
+          <w:b/>
+        </w:rPr>
+        <w:t xml:space="preserve">Composición de Rohu: </w:t>
+      </w:r>
+      <w:r>
+        <w:rPr/>
+        <w:t>el conjunto de Rohu combina 805 imágenes de Trucha (70 % de su pool, submuestra estratificada) y 456 de Rohu Kaggle (30 % de su pool), porque Rohu puro tiene un atajo de fecha/sesión que infla el F1 a ~99–100 % (experimento_dataset_mixto.py, construir_dataset_mixto; ver 2_logs/rohu_congelado_sinx2.log).</w:t>
+      </w:r>
+    </w:p>
+    <w:p>
+      <w:r>
         <w:rPr/>
         <w:t>Las clases no están balanceadas en ninguno de los dos dominios (Mendeley sí lo está, 50/50); por eso la métrica central es el F1 macro, que pesa igual a fresco y no_fresco (ver 2.3).</w:t>
       </w:r>
@@ -538,7 +550,7 @@
       </w:r>
       <w:r>
         <w:rPr/>
-        <w:t>StratifiedGroupKFold(n_splits=5, shuffle=True, random_state=42), agrupando las fotos casi idénticas (tomadas en ráfaga, detectadas con detectar_duplicados.py) para que una foto y su casi gemela nunca queden una en entrenamiento y otra en evaluación. Por eso el tamaño del fold de evaluación varía entre 228 y 284 imágenes.</w:t>
+        <w:t>StratifiedGroupKFold(n_splits=5, shuffle=True, random_state=42), agrupando las fotos casi idénticas (tomadas en ráfaga, detectadas con detectar_duplicados.py) para que una foto y su casi gemela nunca queden una en entrenamiento y otra en evaluación. Por eso el tamaño del fold de evaluación varía entre 228 y 284 imágenes. Las 456 imágenes de Rohu Kaggle forman 193 grupos (108 grupos con 2 o más imágenes casi idénticas; el grupo más grande tiene 15); cada imagen de Trucha es su propio grupo.</w:t>
       </w:r>
     </w:p>
     <w:p>
@@ -570,7 +582,7 @@
       </w:pPr>
       <w:r>
         <w:rPr/>
-        <w:t>Cada fold parte del checkpoint de Mendeley del mismo índice de fold (el fold 3 de Trucha parte del checkpoint del fold 3, etc.). El backbone se congela (pesos fijos, sin gradiente, en modo eval() para que BatchNorm no actualice sus estadísticas) y solo se entrena la cabeza de clasificación sobre el dominio objetivo. Es entrenamiento real (hay backpropagation y actualización de pesos en la cabeza), no una evaluación zero-shot.</w:t>
+        <w:t>Cada fold parte del checkpoint de Mendeley (8,000 imágenes, 10 modelos evaluados en Documentacion_Tecnica_10_Modelos.docx) del mismo índice de fold (el fold 3 de Trucha parte del checkpoint del fold 3, etc.). El backbone se congela (pesos fijos, sin gradiente, en modo eval() para que BatchNorm no actualice sus estadísticas) y solo se entrena la cabeza de clasificación sobre el dominio objetivo. Es entrenamiento real (hay backpropagation y actualización de pesos en la cabeza), no una evaluación zero-shot.</w:t>
       </w:r>
     </w:p>
     <w:tbl>
@@ -4144,6 +4156,4492 @@
           <w:sz w:val="19"/>
         </w:rPr>
         <w:t>los valores pooled provienen de la corrida de matrices de confusión y ROC (linear_probe_confmat_roc.py, misma configuración, reentrenada), por eso difieren levemente del F1 oficial (finetune_target_x2.py y experimento_dataset_mixto.py, 3_resultados/{trucha,rohu}/congelado_sinx2_resumen.csv). Los indicadores de robustez usan el F1 oficial.</w:t>
+      </w:r>
+    </w:p>
+    <w:p>
+      <w:pPr>
+        <w:keepNext/>
+      </w:pPr>
+      <w:r>
+        <w:rPr>
+          <w:b/>
+        </w:rPr>
+        <w:t>F1 oficial por fold (corrida de 3_resultados/, base de los indicadores de robustez)</w:t>
+      </w:r>
+    </w:p>
+    <w:tbl>
+      <w:tblPr>
+        <w:tblW w:type="pct" w:w="5000"/>
+        <w:tblLook w:firstColumn="1" w:firstRow="1" w:lastColumn="0" w:lastRow="0" w:noHBand="0" w:noVBand="1" w:val="04A0"/>
+        <w:jc w:val="center"/>
+        <w:tblLayout w:type="fixed"/>
+        <w:tblCellMar>
+          <w:top w:w="45" w:type="dxa"/>
+          <w:bottom w:w="45" w:type="dxa"/>
+          <w:left w:w="70" w:type="dxa"/>
+          <w:right w:w="70" w:type="dxa"/>
+        </w:tblCellMar>
+      </w:tblPr>
+      <w:tblGrid>
+        <w:gridCol w:w="1394"/>
+        <w:gridCol w:w="867"/>
+        <w:gridCol w:w="667"/>
+        <w:gridCol w:w="1434"/>
+        <w:gridCol w:w="1135"/>
+        <w:gridCol w:w="637"/>
+        <w:gridCol w:w="966"/>
+        <w:gridCol w:w="767"/>
+        <w:gridCol w:w="773"/>
+      </w:tblGrid>
+      <w:tr>
+        <w:trPr>
+          <w:cantSplit/>
+          <w:tblHeader/>
+        </w:trPr>
+        <w:tc>
+          <w:tcPr>
+            <w:tcW w:type="dxa" w:w="1394"/>
+            <w:shd w:val="clear" w:color="auto" w:fill="2A4D7A"/>
+            <w:vAlign w:val="center"/>
+          </w:tcPr>
+          <w:p>
+            <w:pPr>
+              <w:spacing w:before="0" w:after="0" w:line="240" w:lineRule="auto"/>
+              <w:jc w:val="center"/>
+            </w:pPr>
+            <w:r>
+              <w:rPr>
+                <w:b/>
+                <w:color w:val="FFFFFF"/>
+                <w:sz w:val="15"/>
+              </w:rPr>
+              <w:t>Modelo</w:t>
+            </w:r>
+          </w:p>
+        </w:tc>
+        <w:tc>
+          <w:tcPr>
+            <w:tcW w:type="dxa" w:w="867"/>
+            <w:shd w:val="clear" w:color="auto" w:fill="2A4D7A"/>
+            <w:vAlign w:val="center"/>
+          </w:tcPr>
+          <w:p>
+            <w:pPr>
+              <w:spacing w:before="0" w:after="0" w:line="240" w:lineRule="auto"/>
+              <w:jc w:val="center"/>
+            </w:pPr>
+            <w:r>
+              <w:rPr>
+                <w:b/>
+                <w:color w:val="FFFFFF"/>
+                <w:sz w:val="15"/>
+              </w:rPr>
+              <w:t>Dominio</w:t>
+            </w:r>
+          </w:p>
+        </w:tc>
+        <w:tc>
+          <w:tcPr>
+            <w:tcW w:type="dxa" w:w="667"/>
+            <w:shd w:val="clear" w:color="auto" w:fill="2A4D7A"/>
+            <w:vAlign w:val="center"/>
+          </w:tcPr>
+          <w:p>
+            <w:pPr>
+              <w:spacing w:before="0" w:after="0" w:line="240" w:lineRule="auto"/>
+              <w:jc w:val="center"/>
+            </w:pPr>
+            <w:r>
+              <w:rPr>
+                <w:b/>
+                <w:color w:val="FFFFFF"/>
+                <w:sz w:val="15"/>
+              </w:rPr>
+              <w:t>Fold</w:t>
+            </w:r>
+          </w:p>
+        </w:tc>
+        <w:tc>
+          <w:tcPr>
+            <w:tcW w:type="dxa" w:w="1434"/>
+            <w:shd w:val="clear" w:color="auto" w:fill="2A4D7A"/>
+            <w:vAlign w:val="center"/>
+          </w:tcPr>
+          <w:p>
+            <w:pPr>
+              <w:spacing w:before="0" w:after="0" w:line="240" w:lineRule="auto"/>
+              <w:jc w:val="center"/>
+            </w:pPr>
+            <w:r>
+              <w:rPr>
+                <w:b/>
+                <w:color w:val="FFFFFF"/>
+                <w:sz w:val="15"/>
+              </w:rPr>
+              <w:t>N entrenamiento</w:t>
+            </w:r>
+          </w:p>
+        </w:tc>
+        <w:tc>
+          <w:tcPr>
+            <w:tcW w:type="dxa" w:w="1135"/>
+            <w:shd w:val="clear" w:color="auto" w:fill="2A4D7A"/>
+            <w:vAlign w:val="center"/>
+          </w:tcPr>
+          <w:p>
+            <w:pPr>
+              <w:spacing w:before="0" w:after="0" w:line="240" w:lineRule="auto"/>
+              <w:jc w:val="center"/>
+            </w:pPr>
+            <w:r>
+              <w:rPr>
+                <w:b/>
+                <w:color w:val="FFFFFF"/>
+                <w:sz w:val="15"/>
+              </w:rPr>
+              <w:t>N evaluación</w:t>
+            </w:r>
+          </w:p>
+        </w:tc>
+        <w:tc>
+          <w:tcPr>
+            <w:tcW w:type="dxa" w:w="637"/>
+            <w:shd w:val="clear" w:color="auto" w:fill="2A4D7A"/>
+            <w:vAlign w:val="center"/>
+          </w:tcPr>
+          <w:p>
+            <w:pPr>
+              <w:spacing w:before="0" w:after="0" w:line="240" w:lineRule="auto"/>
+              <w:jc w:val="center"/>
+            </w:pPr>
+            <w:r>
+              <w:rPr>
+                <w:b/>
+                <w:color w:val="FFFFFF"/>
+                <w:sz w:val="15"/>
+              </w:rPr>
+              <w:t>F1</w:t>
+            </w:r>
+          </w:p>
+        </w:tc>
+        <w:tc>
+          <w:tcPr>
+            <w:tcW w:type="dxa" w:w="966"/>
+            <w:shd w:val="clear" w:color="auto" w:fill="2A4D7A"/>
+            <w:vAlign w:val="center"/>
+          </w:tcPr>
+          <w:p>
+            <w:pPr>
+              <w:spacing w:before="0" w:after="0" w:line="240" w:lineRule="auto"/>
+              <w:jc w:val="center"/>
+            </w:pPr>
+            <w:r>
+              <w:rPr>
+                <w:b/>
+                <w:color w:val="FFFFFF"/>
+                <w:sz w:val="15"/>
+              </w:rPr>
+              <w:t>Accuracy</w:t>
+            </w:r>
+          </w:p>
+        </w:tc>
+        <w:tc>
+          <w:tcPr>
+            <w:tcW w:type="dxa" w:w="767"/>
+            <w:shd w:val="clear" w:color="auto" w:fill="2A4D7A"/>
+            <w:vAlign w:val="center"/>
+          </w:tcPr>
+          <w:p>
+            <w:pPr>
+              <w:spacing w:before="0" w:after="0" w:line="240" w:lineRule="auto"/>
+              <w:jc w:val="center"/>
+            </w:pPr>
+            <w:r>
+              <w:rPr>
+                <w:b/>
+                <w:color w:val="FFFFFF"/>
+                <w:sz w:val="15"/>
+              </w:rPr>
+              <w:t>Epochs</w:t>
+            </w:r>
+          </w:p>
+        </w:tc>
+        <w:tc>
+          <w:tcPr>
+            <w:tcW w:type="dxa" w:w="773"/>
+            <w:shd w:val="clear" w:color="auto" w:fill="2A4D7A"/>
+            <w:vAlign w:val="center"/>
+          </w:tcPr>
+          <w:p>
+            <w:pPr>
+              <w:spacing w:before="0" w:after="0" w:line="240" w:lineRule="auto"/>
+              <w:jc w:val="center"/>
+            </w:pPr>
+            <w:r>
+              <w:rPr>
+                <w:b/>
+                <w:color w:val="FFFFFF"/>
+                <w:sz w:val="15"/>
+              </w:rPr>
+              <w:t>Tiempo (s)</w:t>
+            </w:r>
+          </w:p>
+        </w:tc>
+      </w:tr>
+      <w:tr>
+        <w:trPr>
+          <w:cantSplit/>
+        </w:trPr>
+        <w:tc>
+          <w:tcPr>
+            <w:tcW w:type="dxa" w:w="1394"/>
+            <w:vAlign w:val="center"/>
+          </w:tcPr>
+          <w:p>
+            <w:pPr>
+              <w:spacing w:before="0" w:after="0" w:line="240" w:lineRule="auto"/>
+              <w:jc w:val="center"/>
+            </w:pPr>
+            <w:r>
+              <w:rPr>
+                <w:b w:val="0"/>
+                <w:sz w:val="15"/>
+              </w:rPr>
+              <w:t>ViT-Base/16</w:t>
+            </w:r>
+          </w:p>
+        </w:tc>
+        <w:tc>
+          <w:tcPr>
+            <w:tcW w:type="dxa" w:w="867"/>
+            <w:vAlign w:val="center"/>
+          </w:tcPr>
+          <w:p>
+            <w:pPr>
+              <w:spacing w:before="0" w:after="0" w:line="240" w:lineRule="auto"/>
+              <w:jc w:val="center"/>
+            </w:pPr>
+            <w:r>
+              <w:rPr>
+                <w:b w:val="0"/>
+                <w:sz w:val="15"/>
+              </w:rPr>
+              <w:t>Trucha</w:t>
+            </w:r>
+          </w:p>
+        </w:tc>
+        <w:tc>
+          <w:tcPr>
+            <w:tcW w:type="dxa" w:w="667"/>
+            <w:vAlign w:val="center"/>
+          </w:tcPr>
+          <w:p>
+            <w:pPr>
+              <w:spacing w:before="0" w:after="0" w:line="240" w:lineRule="auto"/>
+              <w:jc w:val="center"/>
+            </w:pPr>
+            <w:r>
+              <w:rPr>
+                <w:b w:val="0"/>
+                <w:sz w:val="15"/>
+              </w:rPr>
+              <w:t>Fold 1</w:t>
+            </w:r>
+          </w:p>
+        </w:tc>
+        <w:tc>
+          <w:tcPr>
+            <w:tcW w:type="dxa" w:w="1434"/>
+            <w:vAlign w:val="center"/>
+          </w:tcPr>
+          <w:p>
+            <w:pPr>
+              <w:spacing w:before="0" w:after="0" w:line="240" w:lineRule="auto"/>
+              <w:jc w:val="center"/>
+            </w:pPr>
+            <w:r>
+              <w:rPr>
+                <w:b w:val="0"/>
+                <w:sz w:val="15"/>
+              </w:rPr>
+              <w:t>920</w:t>
+            </w:r>
+          </w:p>
+        </w:tc>
+        <w:tc>
+          <w:tcPr>
+            <w:tcW w:type="dxa" w:w="1135"/>
+            <w:vAlign w:val="center"/>
+          </w:tcPr>
+          <w:p>
+            <w:pPr>
+              <w:spacing w:before="0" w:after="0" w:line="240" w:lineRule="auto"/>
+              <w:jc w:val="center"/>
+            </w:pPr>
+            <w:r>
+              <w:rPr>
+                <w:b w:val="0"/>
+                <w:sz w:val="15"/>
+              </w:rPr>
+              <w:t>230</w:t>
+            </w:r>
+          </w:p>
+        </w:tc>
+        <w:tc>
+          <w:tcPr>
+            <w:tcW w:type="dxa" w:w="637"/>
+            <w:vAlign w:val="center"/>
+          </w:tcPr>
+          <w:p>
+            <w:pPr>
+              <w:spacing w:before="0" w:after="0" w:line="240" w:lineRule="auto"/>
+              <w:jc w:val="center"/>
+            </w:pPr>
+            <w:r>
+              <w:rPr>
+                <w:b w:val="0"/>
+                <w:sz w:val="15"/>
+              </w:rPr>
+              <w:t>84.60</w:t>
+            </w:r>
+          </w:p>
+        </w:tc>
+        <w:tc>
+          <w:tcPr>
+            <w:tcW w:type="dxa" w:w="966"/>
+            <w:vAlign w:val="center"/>
+          </w:tcPr>
+          <w:p>
+            <w:pPr>
+              <w:spacing w:before="0" w:after="0" w:line="240" w:lineRule="auto"/>
+              <w:jc w:val="center"/>
+            </w:pPr>
+            <w:r>
+              <w:rPr>
+                <w:b w:val="0"/>
+                <w:sz w:val="15"/>
+              </w:rPr>
+              <w:t>85.22</w:t>
+            </w:r>
+          </w:p>
+        </w:tc>
+        <w:tc>
+          <w:tcPr>
+            <w:tcW w:type="dxa" w:w="767"/>
+            <w:vAlign w:val="center"/>
+          </w:tcPr>
+          <w:p>
+            <w:pPr>
+              <w:spacing w:before="0" w:after="0" w:line="240" w:lineRule="auto"/>
+              <w:jc w:val="center"/>
+            </w:pPr>
+            <w:r>
+              <w:rPr>
+                <w:b w:val="0"/>
+                <w:sz w:val="15"/>
+              </w:rPr>
+              <w:t>26</w:t>
+            </w:r>
+          </w:p>
+        </w:tc>
+        <w:tc>
+          <w:tcPr>
+            <w:tcW w:type="dxa" w:w="773"/>
+            <w:vAlign w:val="center"/>
+          </w:tcPr>
+          <w:p>
+            <w:pPr>
+              <w:spacing w:before="0" w:after="0" w:line="240" w:lineRule="auto"/>
+              <w:jc w:val="center"/>
+            </w:pPr>
+            <w:r>
+              <w:rPr>
+                <w:b w:val="0"/>
+                <w:sz w:val="15"/>
+              </w:rPr>
+              <w:t>556.1</w:t>
+            </w:r>
+          </w:p>
+        </w:tc>
+      </w:tr>
+      <w:tr>
+        <w:trPr>
+          <w:cantSplit/>
+        </w:trPr>
+        <w:tc>
+          <w:tcPr>
+            <w:tcW w:type="dxa" w:w="1394"/>
+            <w:vAlign w:val="center"/>
+          </w:tcPr>
+          <w:p>
+            <w:pPr>
+              <w:spacing w:before="0" w:after="0" w:line="240" w:lineRule="auto"/>
+              <w:jc w:val="center"/>
+            </w:pPr>
+            <w:r>
+              <w:rPr>
+                <w:b w:val="0"/>
+                <w:sz w:val="15"/>
+              </w:rPr>
+              <w:t>ViT-Base/16</w:t>
+            </w:r>
+          </w:p>
+        </w:tc>
+        <w:tc>
+          <w:tcPr>
+            <w:tcW w:type="dxa" w:w="867"/>
+            <w:vAlign w:val="center"/>
+          </w:tcPr>
+          <w:p>
+            <w:pPr>
+              <w:spacing w:before="0" w:after="0" w:line="240" w:lineRule="auto"/>
+              <w:jc w:val="center"/>
+            </w:pPr>
+            <w:r>
+              <w:rPr>
+                <w:b w:val="0"/>
+                <w:sz w:val="15"/>
+              </w:rPr>
+              <w:t>Trucha</w:t>
+            </w:r>
+          </w:p>
+        </w:tc>
+        <w:tc>
+          <w:tcPr>
+            <w:tcW w:type="dxa" w:w="667"/>
+            <w:vAlign w:val="center"/>
+          </w:tcPr>
+          <w:p>
+            <w:pPr>
+              <w:spacing w:before="0" w:after="0" w:line="240" w:lineRule="auto"/>
+              <w:jc w:val="center"/>
+            </w:pPr>
+            <w:r>
+              <w:rPr>
+                <w:b w:val="0"/>
+                <w:sz w:val="15"/>
+              </w:rPr>
+              <w:t>Fold 2</w:t>
+            </w:r>
+          </w:p>
+        </w:tc>
+        <w:tc>
+          <w:tcPr>
+            <w:tcW w:type="dxa" w:w="1434"/>
+            <w:vAlign w:val="center"/>
+          </w:tcPr>
+          <w:p>
+            <w:pPr>
+              <w:spacing w:before="0" w:after="0" w:line="240" w:lineRule="auto"/>
+              <w:jc w:val="center"/>
+            </w:pPr>
+            <w:r>
+              <w:rPr>
+                <w:b w:val="0"/>
+                <w:sz w:val="15"/>
+              </w:rPr>
+              <w:t>920</w:t>
+            </w:r>
+          </w:p>
+        </w:tc>
+        <w:tc>
+          <w:tcPr>
+            <w:tcW w:type="dxa" w:w="1135"/>
+            <w:vAlign w:val="center"/>
+          </w:tcPr>
+          <w:p>
+            <w:pPr>
+              <w:spacing w:before="0" w:after="0" w:line="240" w:lineRule="auto"/>
+              <w:jc w:val="center"/>
+            </w:pPr>
+            <w:r>
+              <w:rPr>
+                <w:b w:val="0"/>
+                <w:sz w:val="15"/>
+              </w:rPr>
+              <w:t>230</w:t>
+            </w:r>
+          </w:p>
+        </w:tc>
+        <w:tc>
+          <w:tcPr>
+            <w:tcW w:type="dxa" w:w="637"/>
+            <w:vAlign w:val="center"/>
+          </w:tcPr>
+          <w:p>
+            <w:pPr>
+              <w:spacing w:before="0" w:after="0" w:line="240" w:lineRule="auto"/>
+              <w:jc w:val="center"/>
+            </w:pPr>
+            <w:r>
+              <w:rPr>
+                <w:b w:val="0"/>
+                <w:sz w:val="15"/>
+              </w:rPr>
+              <w:t>87.60</w:t>
+            </w:r>
+          </w:p>
+        </w:tc>
+        <w:tc>
+          <w:tcPr>
+            <w:tcW w:type="dxa" w:w="966"/>
+            <w:vAlign w:val="center"/>
+          </w:tcPr>
+          <w:p>
+            <w:pPr>
+              <w:spacing w:before="0" w:after="0" w:line="240" w:lineRule="auto"/>
+              <w:jc w:val="center"/>
+            </w:pPr>
+            <w:r>
+              <w:rPr>
+                <w:b w:val="0"/>
+                <w:sz w:val="15"/>
+              </w:rPr>
+              <w:t>88.26</w:t>
+            </w:r>
+          </w:p>
+        </w:tc>
+        <w:tc>
+          <w:tcPr>
+            <w:tcW w:type="dxa" w:w="767"/>
+            <w:vAlign w:val="center"/>
+          </w:tcPr>
+          <w:p>
+            <w:pPr>
+              <w:spacing w:before="0" w:after="0" w:line="240" w:lineRule="auto"/>
+              <w:jc w:val="center"/>
+            </w:pPr>
+            <w:r>
+              <w:rPr>
+                <w:b w:val="0"/>
+                <w:sz w:val="15"/>
+              </w:rPr>
+              <w:t>30</w:t>
+            </w:r>
+          </w:p>
+        </w:tc>
+        <w:tc>
+          <w:tcPr>
+            <w:tcW w:type="dxa" w:w="773"/>
+            <w:vAlign w:val="center"/>
+          </w:tcPr>
+          <w:p>
+            <w:pPr>
+              <w:spacing w:before="0" w:after="0" w:line="240" w:lineRule="auto"/>
+              <w:jc w:val="center"/>
+            </w:pPr>
+            <w:r>
+              <w:rPr>
+                <w:b w:val="0"/>
+                <w:sz w:val="15"/>
+              </w:rPr>
+              <w:t>641.3</w:t>
+            </w:r>
+          </w:p>
+        </w:tc>
+      </w:tr>
+      <w:tr>
+        <w:trPr>
+          <w:cantSplit/>
+        </w:trPr>
+        <w:tc>
+          <w:tcPr>
+            <w:tcW w:type="dxa" w:w="1394"/>
+            <w:vAlign w:val="center"/>
+          </w:tcPr>
+          <w:p>
+            <w:pPr>
+              <w:spacing w:before="0" w:after="0" w:line="240" w:lineRule="auto"/>
+              <w:jc w:val="center"/>
+            </w:pPr>
+            <w:r>
+              <w:rPr>
+                <w:b w:val="0"/>
+                <w:sz w:val="15"/>
+              </w:rPr>
+              <w:t>ViT-Base/16</w:t>
+            </w:r>
+          </w:p>
+        </w:tc>
+        <w:tc>
+          <w:tcPr>
+            <w:tcW w:type="dxa" w:w="867"/>
+            <w:vAlign w:val="center"/>
+          </w:tcPr>
+          <w:p>
+            <w:pPr>
+              <w:spacing w:before="0" w:after="0" w:line="240" w:lineRule="auto"/>
+              <w:jc w:val="center"/>
+            </w:pPr>
+            <w:r>
+              <w:rPr>
+                <w:b w:val="0"/>
+                <w:sz w:val="15"/>
+              </w:rPr>
+              <w:t>Trucha</w:t>
+            </w:r>
+          </w:p>
+        </w:tc>
+        <w:tc>
+          <w:tcPr>
+            <w:tcW w:type="dxa" w:w="667"/>
+            <w:vAlign w:val="center"/>
+          </w:tcPr>
+          <w:p>
+            <w:pPr>
+              <w:spacing w:before="0" w:after="0" w:line="240" w:lineRule="auto"/>
+              <w:jc w:val="center"/>
+            </w:pPr>
+            <w:r>
+              <w:rPr>
+                <w:b w:val="0"/>
+                <w:sz w:val="15"/>
+              </w:rPr>
+              <w:t>Fold 3</w:t>
+            </w:r>
+          </w:p>
+        </w:tc>
+        <w:tc>
+          <w:tcPr>
+            <w:tcW w:type="dxa" w:w="1434"/>
+            <w:vAlign w:val="center"/>
+          </w:tcPr>
+          <w:p>
+            <w:pPr>
+              <w:spacing w:before="0" w:after="0" w:line="240" w:lineRule="auto"/>
+              <w:jc w:val="center"/>
+            </w:pPr>
+            <w:r>
+              <w:rPr>
+                <w:b w:val="0"/>
+                <w:sz w:val="15"/>
+              </w:rPr>
+              <w:t>920</w:t>
+            </w:r>
+          </w:p>
+        </w:tc>
+        <w:tc>
+          <w:tcPr>
+            <w:tcW w:type="dxa" w:w="1135"/>
+            <w:vAlign w:val="center"/>
+          </w:tcPr>
+          <w:p>
+            <w:pPr>
+              <w:spacing w:before="0" w:after="0" w:line="240" w:lineRule="auto"/>
+              <w:jc w:val="center"/>
+            </w:pPr>
+            <w:r>
+              <w:rPr>
+                <w:b w:val="0"/>
+                <w:sz w:val="15"/>
+              </w:rPr>
+              <w:t>230</w:t>
+            </w:r>
+          </w:p>
+        </w:tc>
+        <w:tc>
+          <w:tcPr>
+            <w:tcW w:type="dxa" w:w="637"/>
+            <w:vAlign w:val="center"/>
+          </w:tcPr>
+          <w:p>
+            <w:pPr>
+              <w:spacing w:before="0" w:after="0" w:line="240" w:lineRule="auto"/>
+              <w:jc w:val="center"/>
+            </w:pPr>
+            <w:r>
+              <w:rPr>
+                <w:b w:val="0"/>
+                <w:sz w:val="15"/>
+              </w:rPr>
+              <w:t>92.80</w:t>
+            </w:r>
+          </w:p>
+        </w:tc>
+        <w:tc>
+          <w:tcPr>
+            <w:tcW w:type="dxa" w:w="966"/>
+            <w:vAlign w:val="center"/>
+          </w:tcPr>
+          <w:p>
+            <w:pPr>
+              <w:spacing w:before="0" w:after="0" w:line="240" w:lineRule="auto"/>
+              <w:jc w:val="center"/>
+            </w:pPr>
+            <w:r>
+              <w:rPr>
+                <w:b w:val="0"/>
+                <w:sz w:val="15"/>
+              </w:rPr>
+              <w:t>93.04</w:t>
+            </w:r>
+          </w:p>
+        </w:tc>
+        <w:tc>
+          <w:tcPr>
+            <w:tcW w:type="dxa" w:w="767"/>
+            <w:vAlign w:val="center"/>
+          </w:tcPr>
+          <w:p>
+            <w:pPr>
+              <w:spacing w:before="0" w:after="0" w:line="240" w:lineRule="auto"/>
+              <w:jc w:val="center"/>
+            </w:pPr>
+            <w:r>
+              <w:rPr>
+                <w:b w:val="0"/>
+                <w:sz w:val="15"/>
+              </w:rPr>
+              <w:t>23</w:t>
+            </w:r>
+          </w:p>
+        </w:tc>
+        <w:tc>
+          <w:tcPr>
+            <w:tcW w:type="dxa" w:w="773"/>
+            <w:vAlign w:val="center"/>
+          </w:tcPr>
+          <w:p>
+            <w:pPr>
+              <w:spacing w:before="0" w:after="0" w:line="240" w:lineRule="auto"/>
+              <w:jc w:val="center"/>
+            </w:pPr>
+            <w:r>
+              <w:rPr>
+                <w:b w:val="0"/>
+                <w:sz w:val="15"/>
+              </w:rPr>
+              <w:t>491.3</w:t>
+            </w:r>
+          </w:p>
+        </w:tc>
+      </w:tr>
+      <w:tr>
+        <w:trPr>
+          <w:cantSplit/>
+        </w:trPr>
+        <w:tc>
+          <w:tcPr>
+            <w:tcW w:type="dxa" w:w="1394"/>
+            <w:vAlign w:val="center"/>
+          </w:tcPr>
+          <w:p>
+            <w:pPr>
+              <w:spacing w:before="0" w:after="0" w:line="240" w:lineRule="auto"/>
+              <w:jc w:val="center"/>
+            </w:pPr>
+            <w:r>
+              <w:rPr>
+                <w:b w:val="0"/>
+                <w:sz w:val="15"/>
+              </w:rPr>
+              <w:t>ViT-Base/16</w:t>
+            </w:r>
+          </w:p>
+        </w:tc>
+        <w:tc>
+          <w:tcPr>
+            <w:tcW w:type="dxa" w:w="867"/>
+            <w:vAlign w:val="center"/>
+          </w:tcPr>
+          <w:p>
+            <w:pPr>
+              <w:spacing w:before="0" w:after="0" w:line="240" w:lineRule="auto"/>
+              <w:jc w:val="center"/>
+            </w:pPr>
+            <w:r>
+              <w:rPr>
+                <w:b w:val="0"/>
+                <w:sz w:val="15"/>
+              </w:rPr>
+              <w:t>Trucha</w:t>
+            </w:r>
+          </w:p>
+        </w:tc>
+        <w:tc>
+          <w:tcPr>
+            <w:tcW w:type="dxa" w:w="667"/>
+            <w:vAlign w:val="center"/>
+          </w:tcPr>
+          <w:p>
+            <w:pPr>
+              <w:spacing w:before="0" w:after="0" w:line="240" w:lineRule="auto"/>
+              <w:jc w:val="center"/>
+            </w:pPr>
+            <w:r>
+              <w:rPr>
+                <w:b w:val="0"/>
+                <w:sz w:val="15"/>
+              </w:rPr>
+              <w:t>Fold 4</w:t>
+            </w:r>
+          </w:p>
+        </w:tc>
+        <w:tc>
+          <w:tcPr>
+            <w:tcW w:type="dxa" w:w="1434"/>
+            <w:vAlign w:val="center"/>
+          </w:tcPr>
+          <w:p>
+            <w:pPr>
+              <w:spacing w:before="0" w:after="0" w:line="240" w:lineRule="auto"/>
+              <w:jc w:val="center"/>
+            </w:pPr>
+            <w:r>
+              <w:rPr>
+                <w:b w:val="0"/>
+                <w:sz w:val="15"/>
+              </w:rPr>
+              <w:t>920</w:t>
+            </w:r>
+          </w:p>
+        </w:tc>
+        <w:tc>
+          <w:tcPr>
+            <w:tcW w:type="dxa" w:w="1135"/>
+            <w:vAlign w:val="center"/>
+          </w:tcPr>
+          <w:p>
+            <w:pPr>
+              <w:spacing w:before="0" w:after="0" w:line="240" w:lineRule="auto"/>
+              <w:jc w:val="center"/>
+            </w:pPr>
+            <w:r>
+              <w:rPr>
+                <w:b w:val="0"/>
+                <w:sz w:val="15"/>
+              </w:rPr>
+              <w:t>230</w:t>
+            </w:r>
+          </w:p>
+        </w:tc>
+        <w:tc>
+          <w:tcPr>
+            <w:tcW w:type="dxa" w:w="637"/>
+            <w:vAlign w:val="center"/>
+          </w:tcPr>
+          <w:p>
+            <w:pPr>
+              <w:spacing w:before="0" w:after="0" w:line="240" w:lineRule="auto"/>
+              <w:jc w:val="center"/>
+            </w:pPr>
+            <w:r>
+              <w:rPr>
+                <w:b w:val="0"/>
+                <w:sz w:val="15"/>
+              </w:rPr>
+              <w:t>83.20</w:t>
+            </w:r>
+          </w:p>
+        </w:tc>
+        <w:tc>
+          <w:tcPr>
+            <w:tcW w:type="dxa" w:w="966"/>
+            <w:vAlign w:val="center"/>
+          </w:tcPr>
+          <w:p>
+            <w:pPr>
+              <w:spacing w:before="0" w:after="0" w:line="240" w:lineRule="auto"/>
+              <w:jc w:val="center"/>
+            </w:pPr>
+            <w:r>
+              <w:rPr>
+                <w:b w:val="0"/>
+                <w:sz w:val="15"/>
+              </w:rPr>
+              <w:t>84.35</w:t>
+            </w:r>
+          </w:p>
+        </w:tc>
+        <w:tc>
+          <w:tcPr>
+            <w:tcW w:type="dxa" w:w="767"/>
+            <w:vAlign w:val="center"/>
+          </w:tcPr>
+          <w:p>
+            <w:pPr>
+              <w:spacing w:before="0" w:after="0" w:line="240" w:lineRule="auto"/>
+              <w:jc w:val="center"/>
+            </w:pPr>
+            <w:r>
+              <w:rPr>
+                <w:b w:val="0"/>
+                <w:sz w:val="15"/>
+              </w:rPr>
+              <w:t>29</w:t>
+            </w:r>
+          </w:p>
+        </w:tc>
+        <w:tc>
+          <w:tcPr>
+            <w:tcW w:type="dxa" w:w="773"/>
+            <w:vAlign w:val="center"/>
+          </w:tcPr>
+          <w:p>
+            <w:pPr>
+              <w:spacing w:before="0" w:after="0" w:line="240" w:lineRule="auto"/>
+              <w:jc w:val="center"/>
+            </w:pPr>
+            <w:r>
+              <w:rPr>
+                <w:b w:val="0"/>
+                <w:sz w:val="15"/>
+              </w:rPr>
+              <w:t>619.4</w:t>
+            </w:r>
+          </w:p>
+        </w:tc>
+      </w:tr>
+      <w:tr>
+        <w:trPr>
+          <w:cantSplit/>
+        </w:trPr>
+        <w:tc>
+          <w:tcPr>
+            <w:tcW w:type="dxa" w:w="1394"/>
+            <w:vAlign w:val="center"/>
+          </w:tcPr>
+          <w:p>
+            <w:pPr>
+              <w:spacing w:before="0" w:after="0" w:line="240" w:lineRule="auto"/>
+              <w:jc w:val="center"/>
+            </w:pPr>
+            <w:r>
+              <w:rPr>
+                <w:b w:val="0"/>
+                <w:sz w:val="15"/>
+              </w:rPr>
+              <w:t>ViT-Base/16</w:t>
+            </w:r>
+          </w:p>
+        </w:tc>
+        <w:tc>
+          <w:tcPr>
+            <w:tcW w:type="dxa" w:w="867"/>
+            <w:vAlign w:val="center"/>
+          </w:tcPr>
+          <w:p>
+            <w:pPr>
+              <w:spacing w:before="0" w:after="0" w:line="240" w:lineRule="auto"/>
+              <w:jc w:val="center"/>
+            </w:pPr>
+            <w:r>
+              <w:rPr>
+                <w:b w:val="0"/>
+                <w:sz w:val="15"/>
+              </w:rPr>
+              <w:t>Trucha</w:t>
+            </w:r>
+          </w:p>
+        </w:tc>
+        <w:tc>
+          <w:tcPr>
+            <w:tcW w:type="dxa" w:w="667"/>
+            <w:vAlign w:val="center"/>
+          </w:tcPr>
+          <w:p>
+            <w:pPr>
+              <w:spacing w:before="0" w:after="0" w:line="240" w:lineRule="auto"/>
+              <w:jc w:val="center"/>
+            </w:pPr>
+            <w:r>
+              <w:rPr>
+                <w:b w:val="0"/>
+                <w:sz w:val="15"/>
+              </w:rPr>
+              <w:t>Fold 5</w:t>
+            </w:r>
+          </w:p>
+        </w:tc>
+        <w:tc>
+          <w:tcPr>
+            <w:tcW w:type="dxa" w:w="1434"/>
+            <w:vAlign w:val="center"/>
+          </w:tcPr>
+          <w:p>
+            <w:pPr>
+              <w:spacing w:before="0" w:after="0" w:line="240" w:lineRule="auto"/>
+              <w:jc w:val="center"/>
+            </w:pPr>
+            <w:r>
+              <w:rPr>
+                <w:b w:val="0"/>
+                <w:sz w:val="15"/>
+              </w:rPr>
+              <w:t>920</w:t>
+            </w:r>
+          </w:p>
+        </w:tc>
+        <w:tc>
+          <w:tcPr>
+            <w:tcW w:type="dxa" w:w="1135"/>
+            <w:vAlign w:val="center"/>
+          </w:tcPr>
+          <w:p>
+            <w:pPr>
+              <w:spacing w:before="0" w:after="0" w:line="240" w:lineRule="auto"/>
+              <w:jc w:val="center"/>
+            </w:pPr>
+            <w:r>
+              <w:rPr>
+                <w:b w:val="0"/>
+                <w:sz w:val="15"/>
+              </w:rPr>
+              <w:t>230</w:t>
+            </w:r>
+          </w:p>
+        </w:tc>
+        <w:tc>
+          <w:tcPr>
+            <w:tcW w:type="dxa" w:w="637"/>
+            <w:vAlign w:val="center"/>
+          </w:tcPr>
+          <w:p>
+            <w:pPr>
+              <w:spacing w:before="0" w:after="0" w:line="240" w:lineRule="auto"/>
+              <w:jc w:val="center"/>
+            </w:pPr>
+            <w:r>
+              <w:rPr>
+                <w:b w:val="0"/>
+                <w:sz w:val="15"/>
+              </w:rPr>
+              <w:t>82.36</w:t>
+            </w:r>
+          </w:p>
+        </w:tc>
+        <w:tc>
+          <w:tcPr>
+            <w:tcW w:type="dxa" w:w="966"/>
+            <w:vAlign w:val="center"/>
+          </w:tcPr>
+          <w:p>
+            <w:pPr>
+              <w:spacing w:before="0" w:after="0" w:line="240" w:lineRule="auto"/>
+              <w:jc w:val="center"/>
+            </w:pPr>
+            <w:r>
+              <w:rPr>
+                <w:b w:val="0"/>
+                <w:sz w:val="15"/>
+              </w:rPr>
+              <w:t>83.48</w:t>
+            </w:r>
+          </w:p>
+        </w:tc>
+        <w:tc>
+          <w:tcPr>
+            <w:tcW w:type="dxa" w:w="767"/>
+            <w:vAlign w:val="center"/>
+          </w:tcPr>
+          <w:p>
+            <w:pPr>
+              <w:spacing w:before="0" w:after="0" w:line="240" w:lineRule="auto"/>
+              <w:jc w:val="center"/>
+            </w:pPr>
+            <w:r>
+              <w:rPr>
+                <w:b w:val="0"/>
+                <w:sz w:val="15"/>
+              </w:rPr>
+              <w:t>15</w:t>
+            </w:r>
+          </w:p>
+        </w:tc>
+        <w:tc>
+          <w:tcPr>
+            <w:tcW w:type="dxa" w:w="773"/>
+            <w:vAlign w:val="center"/>
+          </w:tcPr>
+          <w:p>
+            <w:pPr>
+              <w:spacing w:before="0" w:after="0" w:line="240" w:lineRule="auto"/>
+              <w:jc w:val="center"/>
+            </w:pPr>
+            <w:r>
+              <w:rPr>
+                <w:b w:val="0"/>
+                <w:sz w:val="15"/>
+              </w:rPr>
+              <w:t>321.0</w:t>
+            </w:r>
+          </w:p>
+        </w:tc>
+      </w:tr>
+      <w:tr>
+        <w:trPr>
+          <w:cantSplit/>
+        </w:trPr>
+        <w:tc>
+          <w:tcPr>
+            <w:tcW w:type="dxa" w:w="1394"/>
+            <w:shd w:val="clear" w:color="auto" w:fill="FFE699"/>
+            <w:vAlign w:val="center"/>
+          </w:tcPr>
+          <w:p>
+            <w:pPr>
+              <w:spacing w:before="0" w:after="0" w:line="240" w:lineRule="auto"/>
+              <w:jc w:val="center"/>
+            </w:pPr>
+            <w:r>
+              <w:rPr>
+                <w:b/>
+                <w:sz w:val="15"/>
+              </w:rPr>
+              <w:t>ViT-Base/16</w:t>
+            </w:r>
+          </w:p>
+        </w:tc>
+        <w:tc>
+          <w:tcPr>
+            <w:tcW w:type="dxa" w:w="867"/>
+            <w:shd w:val="clear" w:color="auto" w:fill="FFE699"/>
+            <w:vAlign w:val="center"/>
+          </w:tcPr>
+          <w:p>
+            <w:pPr>
+              <w:spacing w:before="0" w:after="0" w:line="240" w:lineRule="auto"/>
+              <w:jc w:val="center"/>
+            </w:pPr>
+            <w:r>
+              <w:rPr>
+                <w:b/>
+                <w:sz w:val="15"/>
+              </w:rPr>
+              <w:t>Trucha</w:t>
+            </w:r>
+          </w:p>
+        </w:tc>
+        <w:tc>
+          <w:tcPr>
+            <w:tcW w:type="dxa" w:w="667"/>
+            <w:shd w:val="clear" w:color="auto" w:fill="FFE699"/>
+            <w:vAlign w:val="center"/>
+          </w:tcPr>
+          <w:p>
+            <w:pPr>
+              <w:spacing w:before="0" w:after="0" w:line="240" w:lineRule="auto"/>
+              <w:jc w:val="center"/>
+            </w:pPr>
+            <w:r>
+              <w:rPr>
+                <w:b/>
+                <w:sz w:val="15"/>
+              </w:rPr>
+              <w:t>Media</w:t>
+            </w:r>
+          </w:p>
+        </w:tc>
+        <w:tc>
+          <w:tcPr>
+            <w:tcW w:type="dxa" w:w="1434"/>
+            <w:shd w:val="clear" w:color="auto" w:fill="FFE699"/>
+            <w:vAlign w:val="center"/>
+          </w:tcPr>
+          <w:p>
+            <w:pPr>
+              <w:spacing w:before="0" w:after="0" w:line="240" w:lineRule="auto"/>
+              <w:jc w:val="center"/>
+            </w:pPr>
+            <w:r>
+              <w:rPr>
+                <w:b/>
+                <w:sz w:val="15"/>
+              </w:rPr>
+            </w:r>
+          </w:p>
+        </w:tc>
+        <w:tc>
+          <w:tcPr>
+            <w:tcW w:type="dxa" w:w="1135"/>
+            <w:shd w:val="clear" w:color="auto" w:fill="FFE699"/>
+            <w:vAlign w:val="center"/>
+          </w:tcPr>
+          <w:p>
+            <w:pPr>
+              <w:spacing w:before="0" w:after="0" w:line="240" w:lineRule="auto"/>
+              <w:jc w:val="center"/>
+            </w:pPr>
+            <w:r>
+              <w:rPr>
+                <w:b/>
+                <w:sz w:val="15"/>
+              </w:rPr>
+            </w:r>
+          </w:p>
+        </w:tc>
+        <w:tc>
+          <w:tcPr>
+            <w:tcW w:type="dxa" w:w="637"/>
+            <w:shd w:val="clear" w:color="auto" w:fill="FFE699"/>
+            <w:vAlign w:val="center"/>
+          </w:tcPr>
+          <w:p>
+            <w:pPr>
+              <w:spacing w:before="0" w:after="0" w:line="240" w:lineRule="auto"/>
+              <w:jc w:val="center"/>
+            </w:pPr>
+            <w:r>
+              <w:rPr>
+                <w:b/>
+                <w:sz w:val="15"/>
+              </w:rPr>
+              <w:t>86.11</w:t>
+            </w:r>
+          </w:p>
+        </w:tc>
+        <w:tc>
+          <w:tcPr>
+            <w:tcW w:type="dxa" w:w="966"/>
+            <w:shd w:val="clear" w:color="auto" w:fill="FFE699"/>
+            <w:vAlign w:val="center"/>
+          </w:tcPr>
+          <w:p>
+            <w:pPr>
+              <w:spacing w:before="0" w:after="0" w:line="240" w:lineRule="auto"/>
+              <w:jc w:val="center"/>
+            </w:pPr>
+            <w:r>
+              <w:rPr>
+                <w:b/>
+                <w:sz w:val="15"/>
+              </w:rPr>
+            </w:r>
+          </w:p>
+        </w:tc>
+        <w:tc>
+          <w:tcPr>
+            <w:tcW w:type="dxa" w:w="767"/>
+            <w:shd w:val="clear" w:color="auto" w:fill="FFE699"/>
+            <w:vAlign w:val="center"/>
+          </w:tcPr>
+          <w:p>
+            <w:pPr>
+              <w:spacing w:before="0" w:after="0" w:line="240" w:lineRule="auto"/>
+              <w:jc w:val="center"/>
+            </w:pPr>
+            <w:r>
+              <w:rPr>
+                <w:b/>
+                <w:sz w:val="15"/>
+              </w:rPr>
+            </w:r>
+          </w:p>
+        </w:tc>
+        <w:tc>
+          <w:tcPr>
+            <w:tcW w:type="dxa" w:w="773"/>
+            <w:shd w:val="clear" w:color="auto" w:fill="FFE699"/>
+            <w:vAlign w:val="center"/>
+          </w:tcPr>
+          <w:p>
+            <w:pPr>
+              <w:spacing w:before="0" w:after="0" w:line="240" w:lineRule="auto"/>
+              <w:jc w:val="center"/>
+            </w:pPr>
+            <w:r>
+              <w:rPr>
+                <w:b/>
+                <w:sz w:val="15"/>
+              </w:rPr>
+            </w:r>
+          </w:p>
+        </w:tc>
+      </w:tr>
+      <w:tr>
+        <w:trPr>
+          <w:cantSplit/>
+        </w:trPr>
+        <w:tc>
+          <w:tcPr>
+            <w:tcW w:type="dxa" w:w="1394"/>
+            <w:vAlign w:val="center"/>
+          </w:tcPr>
+          <w:p>
+            <w:pPr>
+              <w:spacing w:before="0" w:after="0" w:line="240" w:lineRule="auto"/>
+              <w:jc w:val="center"/>
+            </w:pPr>
+            <w:r>
+              <w:rPr>
+                <w:b w:val="0"/>
+                <w:sz w:val="15"/>
+              </w:rPr>
+              <w:t>DenseNet-121</w:t>
+            </w:r>
+          </w:p>
+        </w:tc>
+        <w:tc>
+          <w:tcPr>
+            <w:tcW w:type="dxa" w:w="867"/>
+            <w:vAlign w:val="center"/>
+          </w:tcPr>
+          <w:p>
+            <w:pPr>
+              <w:spacing w:before="0" w:after="0" w:line="240" w:lineRule="auto"/>
+              <w:jc w:val="center"/>
+            </w:pPr>
+            <w:r>
+              <w:rPr>
+                <w:b w:val="0"/>
+                <w:sz w:val="15"/>
+              </w:rPr>
+              <w:t>Trucha</w:t>
+            </w:r>
+          </w:p>
+        </w:tc>
+        <w:tc>
+          <w:tcPr>
+            <w:tcW w:type="dxa" w:w="667"/>
+            <w:vAlign w:val="center"/>
+          </w:tcPr>
+          <w:p>
+            <w:pPr>
+              <w:spacing w:before="0" w:after="0" w:line="240" w:lineRule="auto"/>
+              <w:jc w:val="center"/>
+            </w:pPr>
+            <w:r>
+              <w:rPr>
+                <w:b w:val="0"/>
+                <w:sz w:val="15"/>
+              </w:rPr>
+              <w:t>Fold 1</w:t>
+            </w:r>
+          </w:p>
+        </w:tc>
+        <w:tc>
+          <w:tcPr>
+            <w:tcW w:type="dxa" w:w="1434"/>
+            <w:vAlign w:val="center"/>
+          </w:tcPr>
+          <w:p>
+            <w:pPr>
+              <w:spacing w:before="0" w:after="0" w:line="240" w:lineRule="auto"/>
+              <w:jc w:val="center"/>
+            </w:pPr>
+            <w:r>
+              <w:rPr>
+                <w:b w:val="0"/>
+                <w:sz w:val="15"/>
+              </w:rPr>
+              <w:t>920</w:t>
+            </w:r>
+          </w:p>
+        </w:tc>
+        <w:tc>
+          <w:tcPr>
+            <w:tcW w:type="dxa" w:w="1135"/>
+            <w:vAlign w:val="center"/>
+          </w:tcPr>
+          <w:p>
+            <w:pPr>
+              <w:spacing w:before="0" w:after="0" w:line="240" w:lineRule="auto"/>
+              <w:jc w:val="center"/>
+            </w:pPr>
+            <w:r>
+              <w:rPr>
+                <w:b w:val="0"/>
+                <w:sz w:val="15"/>
+              </w:rPr>
+              <w:t>230</w:t>
+            </w:r>
+          </w:p>
+        </w:tc>
+        <w:tc>
+          <w:tcPr>
+            <w:tcW w:type="dxa" w:w="637"/>
+            <w:vAlign w:val="center"/>
+          </w:tcPr>
+          <w:p>
+            <w:pPr>
+              <w:spacing w:before="0" w:after="0" w:line="240" w:lineRule="auto"/>
+              <w:jc w:val="center"/>
+            </w:pPr>
+            <w:r>
+              <w:rPr>
+                <w:b w:val="0"/>
+                <w:sz w:val="15"/>
+              </w:rPr>
+              <w:t>78.01</w:t>
+            </w:r>
+          </w:p>
+        </w:tc>
+        <w:tc>
+          <w:tcPr>
+            <w:tcW w:type="dxa" w:w="966"/>
+            <w:vAlign w:val="center"/>
+          </w:tcPr>
+          <w:p>
+            <w:pPr>
+              <w:spacing w:before="0" w:after="0" w:line="240" w:lineRule="auto"/>
+              <w:jc w:val="center"/>
+            </w:pPr>
+            <w:r>
+              <w:rPr>
+                <w:b w:val="0"/>
+                <w:sz w:val="15"/>
+              </w:rPr>
+              <w:t>79.13</w:t>
+            </w:r>
+          </w:p>
+        </w:tc>
+        <w:tc>
+          <w:tcPr>
+            <w:tcW w:type="dxa" w:w="767"/>
+            <w:vAlign w:val="center"/>
+          </w:tcPr>
+          <w:p>
+            <w:pPr>
+              <w:spacing w:before="0" w:after="0" w:line="240" w:lineRule="auto"/>
+              <w:jc w:val="center"/>
+            </w:pPr>
+            <w:r>
+              <w:rPr>
+                <w:b w:val="0"/>
+                <w:sz w:val="15"/>
+              </w:rPr>
+              <w:t>30</w:t>
+            </w:r>
+          </w:p>
+        </w:tc>
+        <w:tc>
+          <w:tcPr>
+            <w:tcW w:type="dxa" w:w="773"/>
+            <w:vAlign w:val="center"/>
+          </w:tcPr>
+          <w:p>
+            <w:pPr>
+              <w:spacing w:before="0" w:after="0" w:line="240" w:lineRule="auto"/>
+              <w:jc w:val="center"/>
+            </w:pPr>
+            <w:r>
+              <w:rPr>
+                <w:b w:val="0"/>
+                <w:sz w:val="15"/>
+              </w:rPr>
+              <w:t>361.0</w:t>
+            </w:r>
+          </w:p>
+        </w:tc>
+      </w:tr>
+      <w:tr>
+        <w:trPr>
+          <w:cantSplit/>
+        </w:trPr>
+        <w:tc>
+          <w:tcPr>
+            <w:tcW w:type="dxa" w:w="1394"/>
+            <w:vAlign w:val="center"/>
+          </w:tcPr>
+          <w:p>
+            <w:pPr>
+              <w:spacing w:before="0" w:after="0" w:line="240" w:lineRule="auto"/>
+              <w:jc w:val="center"/>
+            </w:pPr>
+            <w:r>
+              <w:rPr>
+                <w:b w:val="0"/>
+                <w:sz w:val="15"/>
+              </w:rPr>
+              <w:t>DenseNet-121</w:t>
+            </w:r>
+          </w:p>
+        </w:tc>
+        <w:tc>
+          <w:tcPr>
+            <w:tcW w:type="dxa" w:w="867"/>
+            <w:vAlign w:val="center"/>
+          </w:tcPr>
+          <w:p>
+            <w:pPr>
+              <w:spacing w:before="0" w:after="0" w:line="240" w:lineRule="auto"/>
+              <w:jc w:val="center"/>
+            </w:pPr>
+            <w:r>
+              <w:rPr>
+                <w:b w:val="0"/>
+                <w:sz w:val="15"/>
+              </w:rPr>
+              <w:t>Trucha</w:t>
+            </w:r>
+          </w:p>
+        </w:tc>
+        <w:tc>
+          <w:tcPr>
+            <w:tcW w:type="dxa" w:w="667"/>
+            <w:vAlign w:val="center"/>
+          </w:tcPr>
+          <w:p>
+            <w:pPr>
+              <w:spacing w:before="0" w:after="0" w:line="240" w:lineRule="auto"/>
+              <w:jc w:val="center"/>
+            </w:pPr>
+            <w:r>
+              <w:rPr>
+                <w:b w:val="0"/>
+                <w:sz w:val="15"/>
+              </w:rPr>
+              <w:t>Fold 2</w:t>
+            </w:r>
+          </w:p>
+        </w:tc>
+        <w:tc>
+          <w:tcPr>
+            <w:tcW w:type="dxa" w:w="1434"/>
+            <w:vAlign w:val="center"/>
+          </w:tcPr>
+          <w:p>
+            <w:pPr>
+              <w:spacing w:before="0" w:after="0" w:line="240" w:lineRule="auto"/>
+              <w:jc w:val="center"/>
+            </w:pPr>
+            <w:r>
+              <w:rPr>
+                <w:b w:val="0"/>
+                <w:sz w:val="15"/>
+              </w:rPr>
+              <w:t>920</w:t>
+            </w:r>
+          </w:p>
+        </w:tc>
+        <w:tc>
+          <w:tcPr>
+            <w:tcW w:type="dxa" w:w="1135"/>
+            <w:vAlign w:val="center"/>
+          </w:tcPr>
+          <w:p>
+            <w:pPr>
+              <w:spacing w:before="0" w:after="0" w:line="240" w:lineRule="auto"/>
+              <w:jc w:val="center"/>
+            </w:pPr>
+            <w:r>
+              <w:rPr>
+                <w:b w:val="0"/>
+                <w:sz w:val="15"/>
+              </w:rPr>
+              <w:t>230</w:t>
+            </w:r>
+          </w:p>
+        </w:tc>
+        <w:tc>
+          <w:tcPr>
+            <w:tcW w:type="dxa" w:w="637"/>
+            <w:vAlign w:val="center"/>
+          </w:tcPr>
+          <w:p>
+            <w:pPr>
+              <w:spacing w:before="0" w:after="0" w:line="240" w:lineRule="auto"/>
+              <w:jc w:val="center"/>
+            </w:pPr>
+            <w:r>
+              <w:rPr>
+                <w:b w:val="0"/>
+                <w:sz w:val="15"/>
+              </w:rPr>
+              <w:t>82.59</w:t>
+            </w:r>
+          </w:p>
+        </w:tc>
+        <w:tc>
+          <w:tcPr>
+            <w:tcW w:type="dxa" w:w="966"/>
+            <w:vAlign w:val="center"/>
+          </w:tcPr>
+          <w:p>
+            <w:pPr>
+              <w:spacing w:before="0" w:after="0" w:line="240" w:lineRule="auto"/>
+              <w:jc w:val="center"/>
+            </w:pPr>
+            <w:r>
+              <w:rPr>
+                <w:b w:val="0"/>
+                <w:sz w:val="15"/>
+              </w:rPr>
+              <w:t>83.48</w:t>
+            </w:r>
+          </w:p>
+        </w:tc>
+        <w:tc>
+          <w:tcPr>
+            <w:tcW w:type="dxa" w:w="767"/>
+            <w:vAlign w:val="center"/>
+          </w:tcPr>
+          <w:p>
+            <w:pPr>
+              <w:spacing w:before="0" w:after="0" w:line="240" w:lineRule="auto"/>
+              <w:jc w:val="center"/>
+            </w:pPr>
+            <w:r>
+              <w:rPr>
+                <w:b w:val="0"/>
+                <w:sz w:val="15"/>
+              </w:rPr>
+              <w:t>30</w:t>
+            </w:r>
+          </w:p>
+        </w:tc>
+        <w:tc>
+          <w:tcPr>
+            <w:tcW w:type="dxa" w:w="773"/>
+            <w:vAlign w:val="center"/>
+          </w:tcPr>
+          <w:p>
+            <w:pPr>
+              <w:spacing w:before="0" w:after="0" w:line="240" w:lineRule="auto"/>
+              <w:jc w:val="center"/>
+            </w:pPr>
+            <w:r>
+              <w:rPr>
+                <w:b w:val="0"/>
+                <w:sz w:val="15"/>
+              </w:rPr>
+              <w:t>365.4</w:t>
+            </w:r>
+          </w:p>
+        </w:tc>
+      </w:tr>
+      <w:tr>
+        <w:trPr>
+          <w:cantSplit/>
+        </w:trPr>
+        <w:tc>
+          <w:tcPr>
+            <w:tcW w:type="dxa" w:w="1394"/>
+            <w:vAlign w:val="center"/>
+          </w:tcPr>
+          <w:p>
+            <w:pPr>
+              <w:spacing w:before="0" w:after="0" w:line="240" w:lineRule="auto"/>
+              <w:jc w:val="center"/>
+            </w:pPr>
+            <w:r>
+              <w:rPr>
+                <w:b w:val="0"/>
+                <w:sz w:val="15"/>
+              </w:rPr>
+              <w:t>DenseNet-121</w:t>
+            </w:r>
+          </w:p>
+        </w:tc>
+        <w:tc>
+          <w:tcPr>
+            <w:tcW w:type="dxa" w:w="867"/>
+            <w:vAlign w:val="center"/>
+          </w:tcPr>
+          <w:p>
+            <w:pPr>
+              <w:spacing w:before="0" w:after="0" w:line="240" w:lineRule="auto"/>
+              <w:jc w:val="center"/>
+            </w:pPr>
+            <w:r>
+              <w:rPr>
+                <w:b w:val="0"/>
+                <w:sz w:val="15"/>
+              </w:rPr>
+              <w:t>Trucha</w:t>
+            </w:r>
+          </w:p>
+        </w:tc>
+        <w:tc>
+          <w:tcPr>
+            <w:tcW w:type="dxa" w:w="667"/>
+            <w:vAlign w:val="center"/>
+          </w:tcPr>
+          <w:p>
+            <w:pPr>
+              <w:spacing w:before="0" w:after="0" w:line="240" w:lineRule="auto"/>
+              <w:jc w:val="center"/>
+            </w:pPr>
+            <w:r>
+              <w:rPr>
+                <w:b w:val="0"/>
+                <w:sz w:val="15"/>
+              </w:rPr>
+              <w:t>Fold 3</w:t>
+            </w:r>
+          </w:p>
+        </w:tc>
+        <w:tc>
+          <w:tcPr>
+            <w:tcW w:type="dxa" w:w="1434"/>
+            <w:vAlign w:val="center"/>
+          </w:tcPr>
+          <w:p>
+            <w:pPr>
+              <w:spacing w:before="0" w:after="0" w:line="240" w:lineRule="auto"/>
+              <w:jc w:val="center"/>
+            </w:pPr>
+            <w:r>
+              <w:rPr>
+                <w:b w:val="0"/>
+                <w:sz w:val="15"/>
+              </w:rPr>
+              <w:t>920</w:t>
+            </w:r>
+          </w:p>
+        </w:tc>
+        <w:tc>
+          <w:tcPr>
+            <w:tcW w:type="dxa" w:w="1135"/>
+            <w:vAlign w:val="center"/>
+          </w:tcPr>
+          <w:p>
+            <w:pPr>
+              <w:spacing w:before="0" w:after="0" w:line="240" w:lineRule="auto"/>
+              <w:jc w:val="center"/>
+            </w:pPr>
+            <w:r>
+              <w:rPr>
+                <w:b w:val="0"/>
+                <w:sz w:val="15"/>
+              </w:rPr>
+              <w:t>230</w:t>
+            </w:r>
+          </w:p>
+        </w:tc>
+        <w:tc>
+          <w:tcPr>
+            <w:tcW w:type="dxa" w:w="637"/>
+            <w:vAlign w:val="center"/>
+          </w:tcPr>
+          <w:p>
+            <w:pPr>
+              <w:spacing w:before="0" w:after="0" w:line="240" w:lineRule="auto"/>
+              <w:jc w:val="center"/>
+            </w:pPr>
+            <w:r>
+              <w:rPr>
+                <w:b w:val="0"/>
+                <w:sz w:val="15"/>
+              </w:rPr>
+              <w:t>85.45</w:t>
+            </w:r>
+          </w:p>
+        </w:tc>
+        <w:tc>
+          <w:tcPr>
+            <w:tcW w:type="dxa" w:w="966"/>
+            <w:vAlign w:val="center"/>
+          </w:tcPr>
+          <w:p>
+            <w:pPr>
+              <w:spacing w:before="0" w:after="0" w:line="240" w:lineRule="auto"/>
+              <w:jc w:val="center"/>
+            </w:pPr>
+            <w:r>
+              <w:rPr>
+                <w:b w:val="0"/>
+                <w:sz w:val="15"/>
+              </w:rPr>
+              <w:t>86.09</w:t>
+            </w:r>
+          </w:p>
+        </w:tc>
+        <w:tc>
+          <w:tcPr>
+            <w:tcW w:type="dxa" w:w="767"/>
+            <w:vAlign w:val="center"/>
+          </w:tcPr>
+          <w:p>
+            <w:pPr>
+              <w:spacing w:before="0" w:after="0" w:line="240" w:lineRule="auto"/>
+              <w:jc w:val="center"/>
+            </w:pPr>
+            <w:r>
+              <w:rPr>
+                <w:b w:val="0"/>
+                <w:sz w:val="15"/>
+              </w:rPr>
+              <w:t>28</w:t>
+            </w:r>
+          </w:p>
+        </w:tc>
+        <w:tc>
+          <w:tcPr>
+            <w:tcW w:type="dxa" w:w="773"/>
+            <w:vAlign w:val="center"/>
+          </w:tcPr>
+          <w:p>
+            <w:pPr>
+              <w:spacing w:before="0" w:after="0" w:line="240" w:lineRule="auto"/>
+              <w:jc w:val="center"/>
+            </w:pPr>
+            <w:r>
+              <w:rPr>
+                <w:b w:val="0"/>
+                <w:sz w:val="15"/>
+              </w:rPr>
+              <w:t>345.0</w:t>
+            </w:r>
+          </w:p>
+        </w:tc>
+      </w:tr>
+      <w:tr>
+        <w:trPr>
+          <w:cantSplit/>
+        </w:trPr>
+        <w:tc>
+          <w:tcPr>
+            <w:tcW w:type="dxa" w:w="1394"/>
+            <w:vAlign w:val="center"/>
+          </w:tcPr>
+          <w:p>
+            <w:pPr>
+              <w:spacing w:before="0" w:after="0" w:line="240" w:lineRule="auto"/>
+              <w:jc w:val="center"/>
+            </w:pPr>
+            <w:r>
+              <w:rPr>
+                <w:b w:val="0"/>
+                <w:sz w:val="15"/>
+              </w:rPr>
+              <w:t>DenseNet-121</w:t>
+            </w:r>
+          </w:p>
+        </w:tc>
+        <w:tc>
+          <w:tcPr>
+            <w:tcW w:type="dxa" w:w="867"/>
+            <w:vAlign w:val="center"/>
+          </w:tcPr>
+          <w:p>
+            <w:pPr>
+              <w:spacing w:before="0" w:after="0" w:line="240" w:lineRule="auto"/>
+              <w:jc w:val="center"/>
+            </w:pPr>
+            <w:r>
+              <w:rPr>
+                <w:b w:val="0"/>
+                <w:sz w:val="15"/>
+              </w:rPr>
+              <w:t>Trucha</w:t>
+            </w:r>
+          </w:p>
+        </w:tc>
+        <w:tc>
+          <w:tcPr>
+            <w:tcW w:type="dxa" w:w="667"/>
+            <w:vAlign w:val="center"/>
+          </w:tcPr>
+          <w:p>
+            <w:pPr>
+              <w:spacing w:before="0" w:after="0" w:line="240" w:lineRule="auto"/>
+              <w:jc w:val="center"/>
+            </w:pPr>
+            <w:r>
+              <w:rPr>
+                <w:b w:val="0"/>
+                <w:sz w:val="15"/>
+              </w:rPr>
+              <w:t>Fold 4</w:t>
+            </w:r>
+          </w:p>
+        </w:tc>
+        <w:tc>
+          <w:tcPr>
+            <w:tcW w:type="dxa" w:w="1434"/>
+            <w:vAlign w:val="center"/>
+          </w:tcPr>
+          <w:p>
+            <w:pPr>
+              <w:spacing w:before="0" w:after="0" w:line="240" w:lineRule="auto"/>
+              <w:jc w:val="center"/>
+            </w:pPr>
+            <w:r>
+              <w:rPr>
+                <w:b w:val="0"/>
+                <w:sz w:val="15"/>
+              </w:rPr>
+              <w:t>920</w:t>
+            </w:r>
+          </w:p>
+        </w:tc>
+        <w:tc>
+          <w:tcPr>
+            <w:tcW w:type="dxa" w:w="1135"/>
+            <w:vAlign w:val="center"/>
+          </w:tcPr>
+          <w:p>
+            <w:pPr>
+              <w:spacing w:before="0" w:after="0" w:line="240" w:lineRule="auto"/>
+              <w:jc w:val="center"/>
+            </w:pPr>
+            <w:r>
+              <w:rPr>
+                <w:b w:val="0"/>
+                <w:sz w:val="15"/>
+              </w:rPr>
+              <w:t>230</w:t>
+            </w:r>
+          </w:p>
+        </w:tc>
+        <w:tc>
+          <w:tcPr>
+            <w:tcW w:type="dxa" w:w="637"/>
+            <w:vAlign w:val="center"/>
+          </w:tcPr>
+          <w:p>
+            <w:pPr>
+              <w:spacing w:before="0" w:after="0" w:line="240" w:lineRule="auto"/>
+              <w:jc w:val="center"/>
+            </w:pPr>
+            <w:r>
+              <w:rPr>
+                <w:b w:val="0"/>
+                <w:sz w:val="15"/>
+              </w:rPr>
+              <w:t>76.59</w:t>
+            </w:r>
+          </w:p>
+        </w:tc>
+        <w:tc>
+          <w:tcPr>
+            <w:tcW w:type="dxa" w:w="966"/>
+            <w:vAlign w:val="center"/>
+          </w:tcPr>
+          <w:p>
+            <w:pPr>
+              <w:spacing w:before="0" w:after="0" w:line="240" w:lineRule="auto"/>
+              <w:jc w:val="center"/>
+            </w:pPr>
+            <w:r>
+              <w:rPr>
+                <w:b w:val="0"/>
+                <w:sz w:val="15"/>
+              </w:rPr>
+              <w:t>78.70</w:t>
+            </w:r>
+          </w:p>
+        </w:tc>
+        <w:tc>
+          <w:tcPr>
+            <w:tcW w:type="dxa" w:w="767"/>
+            <w:vAlign w:val="center"/>
+          </w:tcPr>
+          <w:p>
+            <w:pPr>
+              <w:spacing w:before="0" w:after="0" w:line="240" w:lineRule="auto"/>
+              <w:jc w:val="center"/>
+            </w:pPr>
+            <w:r>
+              <w:rPr>
+                <w:b w:val="0"/>
+                <w:sz w:val="15"/>
+              </w:rPr>
+              <w:t>28</w:t>
+            </w:r>
+          </w:p>
+        </w:tc>
+        <w:tc>
+          <w:tcPr>
+            <w:tcW w:type="dxa" w:w="773"/>
+            <w:vAlign w:val="center"/>
+          </w:tcPr>
+          <w:p>
+            <w:pPr>
+              <w:spacing w:before="0" w:after="0" w:line="240" w:lineRule="auto"/>
+              <w:jc w:val="center"/>
+            </w:pPr>
+            <w:r>
+              <w:rPr>
+                <w:b w:val="0"/>
+                <w:sz w:val="15"/>
+              </w:rPr>
+              <w:t>351.2</w:t>
+            </w:r>
+          </w:p>
+        </w:tc>
+      </w:tr>
+      <w:tr>
+        <w:trPr>
+          <w:cantSplit/>
+        </w:trPr>
+        <w:tc>
+          <w:tcPr>
+            <w:tcW w:type="dxa" w:w="1394"/>
+            <w:vAlign w:val="center"/>
+          </w:tcPr>
+          <w:p>
+            <w:pPr>
+              <w:spacing w:before="0" w:after="0" w:line="240" w:lineRule="auto"/>
+              <w:jc w:val="center"/>
+            </w:pPr>
+            <w:r>
+              <w:rPr>
+                <w:b w:val="0"/>
+                <w:sz w:val="15"/>
+              </w:rPr>
+              <w:t>DenseNet-121</w:t>
+            </w:r>
+          </w:p>
+        </w:tc>
+        <w:tc>
+          <w:tcPr>
+            <w:tcW w:type="dxa" w:w="867"/>
+            <w:vAlign w:val="center"/>
+          </w:tcPr>
+          <w:p>
+            <w:pPr>
+              <w:spacing w:before="0" w:after="0" w:line="240" w:lineRule="auto"/>
+              <w:jc w:val="center"/>
+            </w:pPr>
+            <w:r>
+              <w:rPr>
+                <w:b w:val="0"/>
+                <w:sz w:val="15"/>
+              </w:rPr>
+              <w:t>Trucha</w:t>
+            </w:r>
+          </w:p>
+        </w:tc>
+        <w:tc>
+          <w:tcPr>
+            <w:tcW w:type="dxa" w:w="667"/>
+            <w:vAlign w:val="center"/>
+          </w:tcPr>
+          <w:p>
+            <w:pPr>
+              <w:spacing w:before="0" w:after="0" w:line="240" w:lineRule="auto"/>
+              <w:jc w:val="center"/>
+            </w:pPr>
+            <w:r>
+              <w:rPr>
+                <w:b w:val="0"/>
+                <w:sz w:val="15"/>
+              </w:rPr>
+              <w:t>Fold 5</w:t>
+            </w:r>
+          </w:p>
+        </w:tc>
+        <w:tc>
+          <w:tcPr>
+            <w:tcW w:type="dxa" w:w="1434"/>
+            <w:vAlign w:val="center"/>
+          </w:tcPr>
+          <w:p>
+            <w:pPr>
+              <w:spacing w:before="0" w:after="0" w:line="240" w:lineRule="auto"/>
+              <w:jc w:val="center"/>
+            </w:pPr>
+            <w:r>
+              <w:rPr>
+                <w:b w:val="0"/>
+                <w:sz w:val="15"/>
+              </w:rPr>
+              <w:t>920</w:t>
+            </w:r>
+          </w:p>
+        </w:tc>
+        <w:tc>
+          <w:tcPr>
+            <w:tcW w:type="dxa" w:w="1135"/>
+            <w:vAlign w:val="center"/>
+          </w:tcPr>
+          <w:p>
+            <w:pPr>
+              <w:spacing w:before="0" w:after="0" w:line="240" w:lineRule="auto"/>
+              <w:jc w:val="center"/>
+            </w:pPr>
+            <w:r>
+              <w:rPr>
+                <w:b w:val="0"/>
+                <w:sz w:val="15"/>
+              </w:rPr>
+              <w:t>230</w:t>
+            </w:r>
+          </w:p>
+        </w:tc>
+        <w:tc>
+          <w:tcPr>
+            <w:tcW w:type="dxa" w:w="637"/>
+            <w:vAlign w:val="center"/>
+          </w:tcPr>
+          <w:p>
+            <w:pPr>
+              <w:spacing w:before="0" w:after="0" w:line="240" w:lineRule="auto"/>
+              <w:jc w:val="center"/>
+            </w:pPr>
+            <w:r>
+              <w:rPr>
+                <w:b w:val="0"/>
+                <w:sz w:val="15"/>
+              </w:rPr>
+              <w:t>81.76</w:t>
+            </w:r>
+          </w:p>
+        </w:tc>
+        <w:tc>
+          <w:tcPr>
+            <w:tcW w:type="dxa" w:w="966"/>
+            <w:vAlign w:val="center"/>
+          </w:tcPr>
+          <w:p>
+            <w:pPr>
+              <w:spacing w:before="0" w:after="0" w:line="240" w:lineRule="auto"/>
+              <w:jc w:val="center"/>
+            </w:pPr>
+            <w:r>
+              <w:rPr>
+                <w:b w:val="0"/>
+                <w:sz w:val="15"/>
+              </w:rPr>
+              <w:t>83.04</w:t>
+            </w:r>
+          </w:p>
+        </w:tc>
+        <w:tc>
+          <w:tcPr>
+            <w:tcW w:type="dxa" w:w="767"/>
+            <w:vAlign w:val="center"/>
+          </w:tcPr>
+          <w:p>
+            <w:pPr>
+              <w:spacing w:before="0" w:after="0" w:line="240" w:lineRule="auto"/>
+              <w:jc w:val="center"/>
+            </w:pPr>
+            <w:r>
+              <w:rPr>
+                <w:b w:val="0"/>
+                <w:sz w:val="15"/>
+              </w:rPr>
+              <w:t>23</w:t>
+            </w:r>
+          </w:p>
+        </w:tc>
+        <w:tc>
+          <w:tcPr>
+            <w:tcW w:type="dxa" w:w="773"/>
+            <w:vAlign w:val="center"/>
+          </w:tcPr>
+          <w:p>
+            <w:pPr>
+              <w:spacing w:before="0" w:after="0" w:line="240" w:lineRule="auto"/>
+              <w:jc w:val="center"/>
+            </w:pPr>
+            <w:r>
+              <w:rPr>
+                <w:b w:val="0"/>
+                <w:sz w:val="15"/>
+              </w:rPr>
+              <w:t>285.0</w:t>
+            </w:r>
+          </w:p>
+        </w:tc>
+      </w:tr>
+      <w:tr>
+        <w:trPr>
+          <w:cantSplit/>
+        </w:trPr>
+        <w:tc>
+          <w:tcPr>
+            <w:tcW w:type="dxa" w:w="1394"/>
+            <w:shd w:val="clear" w:color="auto" w:fill="FFE699"/>
+            <w:vAlign w:val="center"/>
+          </w:tcPr>
+          <w:p>
+            <w:pPr>
+              <w:spacing w:before="0" w:after="0" w:line="240" w:lineRule="auto"/>
+              <w:jc w:val="center"/>
+            </w:pPr>
+            <w:r>
+              <w:rPr>
+                <w:b/>
+                <w:sz w:val="15"/>
+              </w:rPr>
+              <w:t>DenseNet-121</w:t>
+            </w:r>
+          </w:p>
+        </w:tc>
+        <w:tc>
+          <w:tcPr>
+            <w:tcW w:type="dxa" w:w="867"/>
+            <w:shd w:val="clear" w:color="auto" w:fill="FFE699"/>
+            <w:vAlign w:val="center"/>
+          </w:tcPr>
+          <w:p>
+            <w:pPr>
+              <w:spacing w:before="0" w:after="0" w:line="240" w:lineRule="auto"/>
+              <w:jc w:val="center"/>
+            </w:pPr>
+            <w:r>
+              <w:rPr>
+                <w:b/>
+                <w:sz w:val="15"/>
+              </w:rPr>
+              <w:t>Trucha</w:t>
+            </w:r>
+          </w:p>
+        </w:tc>
+        <w:tc>
+          <w:tcPr>
+            <w:tcW w:type="dxa" w:w="667"/>
+            <w:shd w:val="clear" w:color="auto" w:fill="FFE699"/>
+            <w:vAlign w:val="center"/>
+          </w:tcPr>
+          <w:p>
+            <w:pPr>
+              <w:spacing w:before="0" w:after="0" w:line="240" w:lineRule="auto"/>
+              <w:jc w:val="center"/>
+            </w:pPr>
+            <w:r>
+              <w:rPr>
+                <w:b/>
+                <w:sz w:val="15"/>
+              </w:rPr>
+              <w:t>Media</w:t>
+            </w:r>
+          </w:p>
+        </w:tc>
+        <w:tc>
+          <w:tcPr>
+            <w:tcW w:type="dxa" w:w="1434"/>
+            <w:shd w:val="clear" w:color="auto" w:fill="FFE699"/>
+            <w:vAlign w:val="center"/>
+          </w:tcPr>
+          <w:p>
+            <w:pPr>
+              <w:spacing w:before="0" w:after="0" w:line="240" w:lineRule="auto"/>
+              <w:jc w:val="center"/>
+            </w:pPr>
+            <w:r>
+              <w:rPr>
+                <w:b/>
+                <w:sz w:val="15"/>
+              </w:rPr>
+            </w:r>
+          </w:p>
+        </w:tc>
+        <w:tc>
+          <w:tcPr>
+            <w:tcW w:type="dxa" w:w="1135"/>
+            <w:shd w:val="clear" w:color="auto" w:fill="FFE699"/>
+            <w:vAlign w:val="center"/>
+          </w:tcPr>
+          <w:p>
+            <w:pPr>
+              <w:spacing w:before="0" w:after="0" w:line="240" w:lineRule="auto"/>
+              <w:jc w:val="center"/>
+            </w:pPr>
+            <w:r>
+              <w:rPr>
+                <w:b/>
+                <w:sz w:val="15"/>
+              </w:rPr>
+            </w:r>
+          </w:p>
+        </w:tc>
+        <w:tc>
+          <w:tcPr>
+            <w:tcW w:type="dxa" w:w="637"/>
+            <w:shd w:val="clear" w:color="auto" w:fill="FFE699"/>
+            <w:vAlign w:val="center"/>
+          </w:tcPr>
+          <w:p>
+            <w:pPr>
+              <w:spacing w:before="0" w:after="0" w:line="240" w:lineRule="auto"/>
+              <w:jc w:val="center"/>
+            </w:pPr>
+            <w:r>
+              <w:rPr>
+                <w:b/>
+                <w:sz w:val="15"/>
+              </w:rPr>
+              <w:t>80.88</w:t>
+            </w:r>
+          </w:p>
+        </w:tc>
+        <w:tc>
+          <w:tcPr>
+            <w:tcW w:type="dxa" w:w="966"/>
+            <w:shd w:val="clear" w:color="auto" w:fill="FFE699"/>
+            <w:vAlign w:val="center"/>
+          </w:tcPr>
+          <w:p>
+            <w:pPr>
+              <w:spacing w:before="0" w:after="0" w:line="240" w:lineRule="auto"/>
+              <w:jc w:val="center"/>
+            </w:pPr>
+            <w:r>
+              <w:rPr>
+                <w:b/>
+                <w:sz w:val="15"/>
+              </w:rPr>
+            </w:r>
+          </w:p>
+        </w:tc>
+        <w:tc>
+          <w:tcPr>
+            <w:tcW w:type="dxa" w:w="767"/>
+            <w:shd w:val="clear" w:color="auto" w:fill="FFE699"/>
+            <w:vAlign w:val="center"/>
+          </w:tcPr>
+          <w:p>
+            <w:pPr>
+              <w:spacing w:before="0" w:after="0" w:line="240" w:lineRule="auto"/>
+              <w:jc w:val="center"/>
+            </w:pPr>
+            <w:r>
+              <w:rPr>
+                <w:b/>
+                <w:sz w:val="15"/>
+              </w:rPr>
+            </w:r>
+          </w:p>
+        </w:tc>
+        <w:tc>
+          <w:tcPr>
+            <w:tcW w:type="dxa" w:w="773"/>
+            <w:shd w:val="clear" w:color="auto" w:fill="FFE699"/>
+            <w:vAlign w:val="center"/>
+          </w:tcPr>
+          <w:p>
+            <w:pPr>
+              <w:spacing w:before="0" w:after="0" w:line="240" w:lineRule="auto"/>
+              <w:jc w:val="center"/>
+            </w:pPr>
+            <w:r>
+              <w:rPr>
+                <w:b/>
+                <w:sz w:val="15"/>
+              </w:rPr>
+            </w:r>
+          </w:p>
+        </w:tc>
+      </w:tr>
+      <w:tr>
+        <w:trPr>
+          <w:cantSplit/>
+        </w:trPr>
+        <w:tc>
+          <w:tcPr>
+            <w:tcW w:type="dxa" w:w="1394"/>
+            <w:vAlign w:val="center"/>
+          </w:tcPr>
+          <w:p>
+            <w:pPr>
+              <w:spacing w:before="0" w:after="0" w:line="240" w:lineRule="auto"/>
+              <w:jc w:val="center"/>
+            </w:pPr>
+            <w:r>
+              <w:rPr>
+                <w:b w:val="0"/>
+                <w:sz w:val="15"/>
+              </w:rPr>
+              <w:t>ViT-Base/16</w:t>
+            </w:r>
+          </w:p>
+        </w:tc>
+        <w:tc>
+          <w:tcPr>
+            <w:tcW w:type="dxa" w:w="867"/>
+            <w:vAlign w:val="center"/>
+          </w:tcPr>
+          <w:p>
+            <w:pPr>
+              <w:spacing w:before="0" w:after="0" w:line="240" w:lineRule="auto"/>
+              <w:jc w:val="center"/>
+            </w:pPr>
+            <w:r>
+              <w:rPr>
+                <w:b w:val="0"/>
+                <w:sz w:val="15"/>
+              </w:rPr>
+              <w:t>Rohu</w:t>
+            </w:r>
+          </w:p>
+        </w:tc>
+        <w:tc>
+          <w:tcPr>
+            <w:tcW w:type="dxa" w:w="667"/>
+            <w:vAlign w:val="center"/>
+          </w:tcPr>
+          <w:p>
+            <w:pPr>
+              <w:spacing w:before="0" w:after="0" w:line="240" w:lineRule="auto"/>
+              <w:jc w:val="center"/>
+            </w:pPr>
+            <w:r>
+              <w:rPr>
+                <w:b w:val="0"/>
+                <w:sz w:val="15"/>
+              </w:rPr>
+              <w:t>Fold 1</w:t>
+            </w:r>
+          </w:p>
+        </w:tc>
+        <w:tc>
+          <w:tcPr>
+            <w:tcW w:type="dxa" w:w="1434"/>
+            <w:vAlign w:val="center"/>
+          </w:tcPr>
+          <w:p>
+            <w:pPr>
+              <w:spacing w:before="0" w:after="0" w:line="240" w:lineRule="auto"/>
+              <w:jc w:val="center"/>
+            </w:pPr>
+            <w:r>
+              <w:rPr>
+                <w:b w:val="0"/>
+                <w:sz w:val="15"/>
+              </w:rPr>
+              <w:t>1012</w:t>
+            </w:r>
+          </w:p>
+        </w:tc>
+        <w:tc>
+          <w:tcPr>
+            <w:tcW w:type="dxa" w:w="1135"/>
+            <w:vAlign w:val="center"/>
+          </w:tcPr>
+          <w:p>
+            <w:pPr>
+              <w:spacing w:before="0" w:after="0" w:line="240" w:lineRule="auto"/>
+              <w:jc w:val="center"/>
+            </w:pPr>
+            <w:r>
+              <w:rPr>
+                <w:b w:val="0"/>
+                <w:sz w:val="15"/>
+              </w:rPr>
+              <w:t>249 (160 Trucha / 89 Rohu)</w:t>
+            </w:r>
+          </w:p>
+        </w:tc>
+        <w:tc>
+          <w:tcPr>
+            <w:tcW w:type="dxa" w:w="637"/>
+            <w:vAlign w:val="center"/>
+          </w:tcPr>
+          <w:p>
+            <w:pPr>
+              <w:spacing w:before="0" w:after="0" w:line="240" w:lineRule="auto"/>
+              <w:jc w:val="center"/>
+            </w:pPr>
+            <w:r>
+              <w:rPr>
+                <w:b w:val="0"/>
+                <w:sz w:val="15"/>
+              </w:rPr>
+              <w:t>84.04</w:t>
+            </w:r>
+          </w:p>
+        </w:tc>
+        <w:tc>
+          <w:tcPr>
+            <w:tcW w:type="dxa" w:w="966"/>
+            <w:vAlign w:val="center"/>
+          </w:tcPr>
+          <w:p>
+            <w:pPr>
+              <w:spacing w:before="0" w:after="0" w:line="240" w:lineRule="auto"/>
+              <w:jc w:val="center"/>
+            </w:pPr>
+            <w:r>
+              <w:rPr>
+                <w:b w:val="0"/>
+                <w:sz w:val="15"/>
+              </w:rPr>
+              <w:t>85.94</w:t>
+            </w:r>
+          </w:p>
+        </w:tc>
+        <w:tc>
+          <w:tcPr>
+            <w:tcW w:type="dxa" w:w="767"/>
+            <w:vAlign w:val="center"/>
+          </w:tcPr>
+          <w:p>
+            <w:pPr>
+              <w:spacing w:before="0" w:after="0" w:line="240" w:lineRule="auto"/>
+              <w:jc w:val="center"/>
+            </w:pPr>
+            <w:r>
+              <w:rPr>
+                <w:b w:val="0"/>
+                <w:sz w:val="15"/>
+              </w:rPr>
+              <w:t>30</w:t>
+            </w:r>
+          </w:p>
+        </w:tc>
+        <w:tc>
+          <w:tcPr>
+            <w:tcW w:type="dxa" w:w="773"/>
+            <w:vAlign w:val="center"/>
+          </w:tcPr>
+          <w:p>
+            <w:pPr>
+              <w:spacing w:before="0" w:after="0" w:line="240" w:lineRule="auto"/>
+              <w:jc w:val="center"/>
+            </w:pPr>
+            <w:r>
+              <w:rPr>
+                <w:b w:val="0"/>
+                <w:sz w:val="15"/>
+              </w:rPr>
+              <w:t>737.9</w:t>
+            </w:r>
+          </w:p>
+        </w:tc>
+      </w:tr>
+      <w:tr>
+        <w:trPr>
+          <w:cantSplit/>
+        </w:trPr>
+        <w:tc>
+          <w:tcPr>
+            <w:tcW w:type="dxa" w:w="1394"/>
+            <w:vAlign w:val="center"/>
+          </w:tcPr>
+          <w:p>
+            <w:pPr>
+              <w:spacing w:before="0" w:after="0" w:line="240" w:lineRule="auto"/>
+              <w:jc w:val="center"/>
+            </w:pPr>
+            <w:r>
+              <w:rPr>
+                <w:b w:val="0"/>
+                <w:sz w:val="15"/>
+              </w:rPr>
+              <w:t>ViT-Base/16</w:t>
+            </w:r>
+          </w:p>
+        </w:tc>
+        <w:tc>
+          <w:tcPr>
+            <w:tcW w:type="dxa" w:w="867"/>
+            <w:vAlign w:val="center"/>
+          </w:tcPr>
+          <w:p>
+            <w:pPr>
+              <w:spacing w:before="0" w:after="0" w:line="240" w:lineRule="auto"/>
+              <w:jc w:val="center"/>
+            </w:pPr>
+            <w:r>
+              <w:rPr>
+                <w:b w:val="0"/>
+                <w:sz w:val="15"/>
+              </w:rPr>
+              <w:t>Rohu</w:t>
+            </w:r>
+          </w:p>
+        </w:tc>
+        <w:tc>
+          <w:tcPr>
+            <w:tcW w:type="dxa" w:w="667"/>
+            <w:vAlign w:val="center"/>
+          </w:tcPr>
+          <w:p>
+            <w:pPr>
+              <w:spacing w:before="0" w:after="0" w:line="240" w:lineRule="auto"/>
+              <w:jc w:val="center"/>
+            </w:pPr>
+            <w:r>
+              <w:rPr>
+                <w:b w:val="0"/>
+                <w:sz w:val="15"/>
+              </w:rPr>
+              <w:t>Fold 2</w:t>
+            </w:r>
+          </w:p>
+        </w:tc>
+        <w:tc>
+          <w:tcPr>
+            <w:tcW w:type="dxa" w:w="1434"/>
+            <w:vAlign w:val="center"/>
+          </w:tcPr>
+          <w:p>
+            <w:pPr>
+              <w:spacing w:before="0" w:after="0" w:line="240" w:lineRule="auto"/>
+              <w:jc w:val="center"/>
+            </w:pPr>
+            <w:r>
+              <w:rPr>
+                <w:b w:val="0"/>
+                <w:sz w:val="15"/>
+              </w:rPr>
+              <w:t>1007</w:t>
+            </w:r>
+          </w:p>
+        </w:tc>
+        <w:tc>
+          <w:tcPr>
+            <w:tcW w:type="dxa" w:w="1135"/>
+            <w:vAlign w:val="center"/>
+          </w:tcPr>
+          <w:p>
+            <w:pPr>
+              <w:spacing w:before="0" w:after="0" w:line="240" w:lineRule="auto"/>
+              <w:jc w:val="center"/>
+            </w:pPr>
+            <w:r>
+              <w:rPr>
+                <w:b w:val="0"/>
+                <w:sz w:val="15"/>
+              </w:rPr>
+              <w:t>254 (160 Trucha / 94 Rohu)</w:t>
+            </w:r>
+          </w:p>
+        </w:tc>
+        <w:tc>
+          <w:tcPr>
+            <w:tcW w:type="dxa" w:w="637"/>
+            <w:vAlign w:val="center"/>
+          </w:tcPr>
+          <w:p>
+            <w:pPr>
+              <w:spacing w:before="0" w:after="0" w:line="240" w:lineRule="auto"/>
+              <w:jc w:val="center"/>
+            </w:pPr>
+            <w:r>
+              <w:rPr>
+                <w:b w:val="0"/>
+                <w:sz w:val="15"/>
+              </w:rPr>
+              <w:t>90.03</w:t>
+            </w:r>
+          </w:p>
+        </w:tc>
+        <w:tc>
+          <w:tcPr>
+            <w:tcW w:type="dxa" w:w="966"/>
+            <w:vAlign w:val="center"/>
+          </w:tcPr>
+          <w:p>
+            <w:pPr>
+              <w:spacing w:before="0" w:after="0" w:line="240" w:lineRule="auto"/>
+              <w:jc w:val="center"/>
+            </w:pPr>
+            <w:r>
+              <w:rPr>
+                <w:b w:val="0"/>
+                <w:sz w:val="15"/>
+              </w:rPr>
+              <w:t>91.73</w:t>
+            </w:r>
+          </w:p>
+        </w:tc>
+        <w:tc>
+          <w:tcPr>
+            <w:tcW w:type="dxa" w:w="767"/>
+            <w:vAlign w:val="center"/>
+          </w:tcPr>
+          <w:p>
+            <w:pPr>
+              <w:spacing w:before="0" w:after="0" w:line="240" w:lineRule="auto"/>
+              <w:jc w:val="center"/>
+            </w:pPr>
+            <w:r>
+              <w:rPr>
+                <w:b w:val="0"/>
+                <w:sz w:val="15"/>
+              </w:rPr>
+              <w:t>23</w:t>
+            </w:r>
+          </w:p>
+        </w:tc>
+        <w:tc>
+          <w:tcPr>
+            <w:tcW w:type="dxa" w:w="773"/>
+            <w:vAlign w:val="center"/>
+          </w:tcPr>
+          <w:p>
+            <w:pPr>
+              <w:spacing w:before="0" w:after="0" w:line="240" w:lineRule="auto"/>
+              <w:jc w:val="center"/>
+            </w:pPr>
+            <w:r>
+              <w:rPr>
+                <w:b w:val="0"/>
+                <w:sz w:val="15"/>
+              </w:rPr>
+              <w:t>563.8</w:t>
+            </w:r>
+          </w:p>
+        </w:tc>
+      </w:tr>
+      <w:tr>
+        <w:trPr>
+          <w:cantSplit/>
+        </w:trPr>
+        <w:tc>
+          <w:tcPr>
+            <w:tcW w:type="dxa" w:w="1394"/>
+            <w:vAlign w:val="center"/>
+          </w:tcPr>
+          <w:p>
+            <w:pPr>
+              <w:spacing w:before="0" w:after="0" w:line="240" w:lineRule="auto"/>
+              <w:jc w:val="center"/>
+            </w:pPr>
+            <w:r>
+              <w:rPr>
+                <w:b w:val="0"/>
+                <w:sz w:val="15"/>
+              </w:rPr>
+              <w:t>ViT-Base/16</w:t>
+            </w:r>
+          </w:p>
+        </w:tc>
+        <w:tc>
+          <w:tcPr>
+            <w:tcW w:type="dxa" w:w="867"/>
+            <w:vAlign w:val="center"/>
+          </w:tcPr>
+          <w:p>
+            <w:pPr>
+              <w:spacing w:before="0" w:after="0" w:line="240" w:lineRule="auto"/>
+              <w:jc w:val="center"/>
+            </w:pPr>
+            <w:r>
+              <w:rPr>
+                <w:b w:val="0"/>
+                <w:sz w:val="15"/>
+              </w:rPr>
+              <w:t>Rohu</w:t>
+            </w:r>
+          </w:p>
+        </w:tc>
+        <w:tc>
+          <w:tcPr>
+            <w:tcW w:type="dxa" w:w="667"/>
+            <w:vAlign w:val="center"/>
+          </w:tcPr>
+          <w:p>
+            <w:pPr>
+              <w:spacing w:before="0" w:after="0" w:line="240" w:lineRule="auto"/>
+              <w:jc w:val="center"/>
+            </w:pPr>
+            <w:r>
+              <w:rPr>
+                <w:b w:val="0"/>
+                <w:sz w:val="15"/>
+              </w:rPr>
+              <w:t>Fold 3</w:t>
+            </w:r>
+          </w:p>
+        </w:tc>
+        <w:tc>
+          <w:tcPr>
+            <w:tcW w:type="dxa" w:w="1434"/>
+            <w:vAlign w:val="center"/>
+          </w:tcPr>
+          <w:p>
+            <w:pPr>
+              <w:spacing w:before="0" w:after="0" w:line="240" w:lineRule="auto"/>
+              <w:jc w:val="center"/>
+            </w:pPr>
+            <w:r>
+              <w:rPr>
+                <w:b w:val="0"/>
+                <w:sz w:val="15"/>
+              </w:rPr>
+              <w:t>1015</w:t>
+            </w:r>
+          </w:p>
+        </w:tc>
+        <w:tc>
+          <w:tcPr>
+            <w:tcW w:type="dxa" w:w="1135"/>
+            <w:vAlign w:val="center"/>
+          </w:tcPr>
+          <w:p>
+            <w:pPr>
+              <w:spacing w:before="0" w:after="0" w:line="240" w:lineRule="auto"/>
+              <w:jc w:val="center"/>
+            </w:pPr>
+            <w:r>
+              <w:rPr>
+                <w:b w:val="0"/>
+                <w:sz w:val="15"/>
+              </w:rPr>
+              <w:t>246 (162 Trucha / 84 Rohu)</w:t>
+            </w:r>
+          </w:p>
+        </w:tc>
+        <w:tc>
+          <w:tcPr>
+            <w:tcW w:type="dxa" w:w="637"/>
+            <w:vAlign w:val="center"/>
+          </w:tcPr>
+          <w:p>
+            <w:pPr>
+              <w:spacing w:before="0" w:after="0" w:line="240" w:lineRule="auto"/>
+              <w:jc w:val="center"/>
+            </w:pPr>
+            <w:r>
+              <w:rPr>
+                <w:b w:val="0"/>
+                <w:sz w:val="15"/>
+              </w:rPr>
+              <w:t>91.55</w:t>
+            </w:r>
+          </w:p>
+        </w:tc>
+        <w:tc>
+          <w:tcPr>
+            <w:tcW w:type="dxa" w:w="966"/>
+            <w:vAlign w:val="center"/>
+          </w:tcPr>
+          <w:p>
+            <w:pPr>
+              <w:spacing w:before="0" w:after="0" w:line="240" w:lineRule="auto"/>
+              <w:jc w:val="center"/>
+            </w:pPr>
+            <w:r>
+              <w:rPr>
+                <w:b w:val="0"/>
+                <w:sz w:val="15"/>
+              </w:rPr>
+              <w:t>92.68</w:t>
+            </w:r>
+          </w:p>
+        </w:tc>
+        <w:tc>
+          <w:tcPr>
+            <w:tcW w:type="dxa" w:w="767"/>
+            <w:vAlign w:val="center"/>
+          </w:tcPr>
+          <w:p>
+            <w:pPr>
+              <w:spacing w:before="0" w:after="0" w:line="240" w:lineRule="auto"/>
+              <w:jc w:val="center"/>
+            </w:pPr>
+            <w:r>
+              <w:rPr>
+                <w:b w:val="0"/>
+                <w:sz w:val="15"/>
+              </w:rPr>
+              <w:t>17</w:t>
+            </w:r>
+          </w:p>
+        </w:tc>
+        <w:tc>
+          <w:tcPr>
+            <w:tcW w:type="dxa" w:w="773"/>
+            <w:vAlign w:val="center"/>
+          </w:tcPr>
+          <w:p>
+            <w:pPr>
+              <w:spacing w:before="0" w:after="0" w:line="240" w:lineRule="auto"/>
+              <w:jc w:val="center"/>
+            </w:pPr>
+            <w:r>
+              <w:rPr>
+                <w:b w:val="0"/>
+                <w:sz w:val="15"/>
+              </w:rPr>
+              <w:t>410.8</w:t>
+            </w:r>
+          </w:p>
+        </w:tc>
+      </w:tr>
+      <w:tr>
+        <w:trPr>
+          <w:cantSplit/>
+        </w:trPr>
+        <w:tc>
+          <w:tcPr>
+            <w:tcW w:type="dxa" w:w="1394"/>
+            <w:vAlign w:val="center"/>
+          </w:tcPr>
+          <w:p>
+            <w:pPr>
+              <w:spacing w:before="0" w:after="0" w:line="240" w:lineRule="auto"/>
+              <w:jc w:val="center"/>
+            </w:pPr>
+            <w:r>
+              <w:rPr>
+                <w:b w:val="0"/>
+                <w:sz w:val="15"/>
+              </w:rPr>
+              <w:t>ViT-Base/16</w:t>
+            </w:r>
+          </w:p>
+        </w:tc>
+        <w:tc>
+          <w:tcPr>
+            <w:tcW w:type="dxa" w:w="867"/>
+            <w:vAlign w:val="center"/>
+          </w:tcPr>
+          <w:p>
+            <w:pPr>
+              <w:spacing w:before="0" w:after="0" w:line="240" w:lineRule="auto"/>
+              <w:jc w:val="center"/>
+            </w:pPr>
+            <w:r>
+              <w:rPr>
+                <w:b w:val="0"/>
+                <w:sz w:val="15"/>
+              </w:rPr>
+              <w:t>Rohu</w:t>
+            </w:r>
+          </w:p>
+        </w:tc>
+        <w:tc>
+          <w:tcPr>
+            <w:tcW w:type="dxa" w:w="667"/>
+            <w:vAlign w:val="center"/>
+          </w:tcPr>
+          <w:p>
+            <w:pPr>
+              <w:spacing w:before="0" w:after="0" w:line="240" w:lineRule="auto"/>
+              <w:jc w:val="center"/>
+            </w:pPr>
+            <w:r>
+              <w:rPr>
+                <w:b w:val="0"/>
+                <w:sz w:val="15"/>
+              </w:rPr>
+              <w:t>Fold 4</w:t>
+            </w:r>
+          </w:p>
+        </w:tc>
+        <w:tc>
+          <w:tcPr>
+            <w:tcW w:type="dxa" w:w="1434"/>
+            <w:vAlign w:val="center"/>
+          </w:tcPr>
+          <w:p>
+            <w:pPr>
+              <w:spacing w:before="0" w:after="0" w:line="240" w:lineRule="auto"/>
+              <w:jc w:val="center"/>
+            </w:pPr>
+            <w:r>
+              <w:rPr>
+                <w:b w:val="0"/>
+                <w:sz w:val="15"/>
+              </w:rPr>
+              <w:t>977</w:t>
+            </w:r>
+          </w:p>
+        </w:tc>
+        <w:tc>
+          <w:tcPr>
+            <w:tcW w:type="dxa" w:w="1135"/>
+            <w:vAlign w:val="center"/>
+          </w:tcPr>
+          <w:p>
+            <w:pPr>
+              <w:spacing w:before="0" w:after="0" w:line="240" w:lineRule="auto"/>
+              <w:jc w:val="center"/>
+            </w:pPr>
+            <w:r>
+              <w:rPr>
+                <w:b w:val="0"/>
+                <w:sz w:val="15"/>
+              </w:rPr>
+              <w:t>284 (162 Trucha / 122 Rohu)</w:t>
+            </w:r>
+          </w:p>
+        </w:tc>
+        <w:tc>
+          <w:tcPr>
+            <w:tcW w:type="dxa" w:w="637"/>
+            <w:vAlign w:val="center"/>
+          </w:tcPr>
+          <w:p>
+            <w:pPr>
+              <w:spacing w:before="0" w:after="0" w:line="240" w:lineRule="auto"/>
+              <w:jc w:val="center"/>
+            </w:pPr>
+            <w:r>
+              <w:rPr>
+                <w:b w:val="0"/>
+                <w:sz w:val="15"/>
+              </w:rPr>
+              <w:t>87.63</w:t>
+            </w:r>
+          </w:p>
+        </w:tc>
+        <w:tc>
+          <w:tcPr>
+            <w:tcW w:type="dxa" w:w="966"/>
+            <w:vAlign w:val="center"/>
+          </w:tcPr>
+          <w:p>
+            <w:pPr>
+              <w:spacing w:before="0" w:after="0" w:line="240" w:lineRule="auto"/>
+              <w:jc w:val="center"/>
+            </w:pPr>
+            <w:r>
+              <w:rPr>
+                <w:b w:val="0"/>
+                <w:sz w:val="15"/>
+              </w:rPr>
+              <w:t>90.14</w:t>
+            </w:r>
+          </w:p>
+        </w:tc>
+        <w:tc>
+          <w:tcPr>
+            <w:tcW w:type="dxa" w:w="767"/>
+            <w:vAlign w:val="center"/>
+          </w:tcPr>
+          <w:p>
+            <w:pPr>
+              <w:spacing w:before="0" w:after="0" w:line="240" w:lineRule="auto"/>
+              <w:jc w:val="center"/>
+            </w:pPr>
+            <w:r>
+              <w:rPr>
+                <w:b w:val="0"/>
+                <w:sz w:val="15"/>
+              </w:rPr>
+              <w:t>30</w:t>
+            </w:r>
+          </w:p>
+        </w:tc>
+        <w:tc>
+          <w:tcPr>
+            <w:tcW w:type="dxa" w:w="773"/>
+            <w:vAlign w:val="center"/>
+          </w:tcPr>
+          <w:p>
+            <w:pPr>
+              <w:spacing w:before="0" w:after="0" w:line="240" w:lineRule="auto"/>
+              <w:jc w:val="center"/>
+            </w:pPr>
+            <w:r>
+              <w:rPr>
+                <w:b w:val="0"/>
+                <w:sz w:val="15"/>
+              </w:rPr>
+              <w:t>728.4</w:t>
+            </w:r>
+          </w:p>
+        </w:tc>
+      </w:tr>
+      <w:tr>
+        <w:trPr>
+          <w:cantSplit/>
+        </w:trPr>
+        <w:tc>
+          <w:tcPr>
+            <w:tcW w:type="dxa" w:w="1394"/>
+            <w:vAlign w:val="center"/>
+          </w:tcPr>
+          <w:p>
+            <w:pPr>
+              <w:spacing w:before="0" w:after="0" w:line="240" w:lineRule="auto"/>
+              <w:jc w:val="center"/>
+            </w:pPr>
+            <w:r>
+              <w:rPr>
+                <w:b w:val="0"/>
+                <w:sz w:val="15"/>
+              </w:rPr>
+              <w:t>ViT-Base/16</w:t>
+            </w:r>
+          </w:p>
+        </w:tc>
+        <w:tc>
+          <w:tcPr>
+            <w:tcW w:type="dxa" w:w="867"/>
+            <w:vAlign w:val="center"/>
+          </w:tcPr>
+          <w:p>
+            <w:pPr>
+              <w:spacing w:before="0" w:after="0" w:line="240" w:lineRule="auto"/>
+              <w:jc w:val="center"/>
+            </w:pPr>
+            <w:r>
+              <w:rPr>
+                <w:b w:val="0"/>
+                <w:sz w:val="15"/>
+              </w:rPr>
+              <w:t>Rohu</w:t>
+            </w:r>
+          </w:p>
+        </w:tc>
+        <w:tc>
+          <w:tcPr>
+            <w:tcW w:type="dxa" w:w="667"/>
+            <w:vAlign w:val="center"/>
+          </w:tcPr>
+          <w:p>
+            <w:pPr>
+              <w:spacing w:before="0" w:after="0" w:line="240" w:lineRule="auto"/>
+              <w:jc w:val="center"/>
+            </w:pPr>
+            <w:r>
+              <w:rPr>
+                <w:b w:val="0"/>
+                <w:sz w:val="15"/>
+              </w:rPr>
+              <w:t>Fold 5</w:t>
+            </w:r>
+          </w:p>
+        </w:tc>
+        <w:tc>
+          <w:tcPr>
+            <w:tcW w:type="dxa" w:w="1434"/>
+            <w:vAlign w:val="center"/>
+          </w:tcPr>
+          <w:p>
+            <w:pPr>
+              <w:spacing w:before="0" w:after="0" w:line="240" w:lineRule="auto"/>
+              <w:jc w:val="center"/>
+            </w:pPr>
+            <w:r>
+              <w:rPr>
+                <w:b w:val="0"/>
+                <w:sz w:val="15"/>
+              </w:rPr>
+              <w:t>1033</w:t>
+            </w:r>
+          </w:p>
+        </w:tc>
+        <w:tc>
+          <w:tcPr>
+            <w:tcW w:type="dxa" w:w="1135"/>
+            <w:vAlign w:val="center"/>
+          </w:tcPr>
+          <w:p>
+            <w:pPr>
+              <w:spacing w:before="0" w:after="0" w:line="240" w:lineRule="auto"/>
+              <w:jc w:val="center"/>
+            </w:pPr>
+            <w:r>
+              <w:rPr>
+                <w:b w:val="0"/>
+                <w:sz w:val="15"/>
+              </w:rPr>
+              <w:t>228 (161 Trucha / 67 Rohu)</w:t>
+            </w:r>
+          </w:p>
+        </w:tc>
+        <w:tc>
+          <w:tcPr>
+            <w:tcW w:type="dxa" w:w="637"/>
+            <w:vAlign w:val="center"/>
+          </w:tcPr>
+          <w:p>
+            <w:pPr>
+              <w:spacing w:before="0" w:after="0" w:line="240" w:lineRule="auto"/>
+              <w:jc w:val="center"/>
+            </w:pPr>
+            <w:r>
+              <w:rPr>
+                <w:b w:val="0"/>
+                <w:sz w:val="15"/>
+              </w:rPr>
+              <w:t>87.62</w:t>
+            </w:r>
+          </w:p>
+        </w:tc>
+        <w:tc>
+          <w:tcPr>
+            <w:tcW w:type="dxa" w:w="966"/>
+            <w:vAlign w:val="center"/>
+          </w:tcPr>
+          <w:p>
+            <w:pPr>
+              <w:spacing w:before="0" w:after="0" w:line="240" w:lineRule="auto"/>
+              <w:jc w:val="center"/>
+            </w:pPr>
+            <w:r>
+              <w:rPr>
+                <w:b w:val="0"/>
+                <w:sz w:val="15"/>
+              </w:rPr>
+              <w:t>88.60</w:t>
+            </w:r>
+          </w:p>
+        </w:tc>
+        <w:tc>
+          <w:tcPr>
+            <w:tcW w:type="dxa" w:w="767"/>
+            <w:vAlign w:val="center"/>
+          </w:tcPr>
+          <w:p>
+            <w:pPr>
+              <w:spacing w:before="0" w:after="0" w:line="240" w:lineRule="auto"/>
+              <w:jc w:val="center"/>
+            </w:pPr>
+            <w:r>
+              <w:rPr>
+                <w:b w:val="0"/>
+                <w:sz w:val="15"/>
+              </w:rPr>
+              <w:t>20</w:t>
+            </w:r>
+          </w:p>
+        </w:tc>
+        <w:tc>
+          <w:tcPr>
+            <w:tcW w:type="dxa" w:w="773"/>
+            <w:vAlign w:val="center"/>
+          </w:tcPr>
+          <w:p>
+            <w:pPr>
+              <w:spacing w:before="0" w:after="0" w:line="240" w:lineRule="auto"/>
+              <w:jc w:val="center"/>
+            </w:pPr>
+            <w:r>
+              <w:rPr>
+                <w:b w:val="0"/>
+                <w:sz w:val="15"/>
+              </w:rPr>
+              <w:t>482.0</w:t>
+            </w:r>
+          </w:p>
+        </w:tc>
+      </w:tr>
+      <w:tr>
+        <w:trPr>
+          <w:cantSplit/>
+        </w:trPr>
+        <w:tc>
+          <w:tcPr>
+            <w:tcW w:type="dxa" w:w="1394"/>
+            <w:shd w:val="clear" w:color="auto" w:fill="FFE699"/>
+            <w:vAlign w:val="center"/>
+          </w:tcPr>
+          <w:p>
+            <w:pPr>
+              <w:spacing w:before="0" w:after="0" w:line="240" w:lineRule="auto"/>
+              <w:jc w:val="center"/>
+            </w:pPr>
+            <w:r>
+              <w:rPr>
+                <w:b/>
+                <w:sz w:val="15"/>
+              </w:rPr>
+              <w:t>ViT-Base/16</w:t>
+            </w:r>
+          </w:p>
+        </w:tc>
+        <w:tc>
+          <w:tcPr>
+            <w:tcW w:type="dxa" w:w="867"/>
+            <w:shd w:val="clear" w:color="auto" w:fill="FFE699"/>
+            <w:vAlign w:val="center"/>
+          </w:tcPr>
+          <w:p>
+            <w:pPr>
+              <w:spacing w:before="0" w:after="0" w:line="240" w:lineRule="auto"/>
+              <w:jc w:val="center"/>
+            </w:pPr>
+            <w:r>
+              <w:rPr>
+                <w:b/>
+                <w:sz w:val="15"/>
+              </w:rPr>
+              <w:t>Rohu</w:t>
+            </w:r>
+          </w:p>
+        </w:tc>
+        <w:tc>
+          <w:tcPr>
+            <w:tcW w:type="dxa" w:w="667"/>
+            <w:shd w:val="clear" w:color="auto" w:fill="FFE699"/>
+            <w:vAlign w:val="center"/>
+          </w:tcPr>
+          <w:p>
+            <w:pPr>
+              <w:spacing w:before="0" w:after="0" w:line="240" w:lineRule="auto"/>
+              <w:jc w:val="center"/>
+            </w:pPr>
+            <w:r>
+              <w:rPr>
+                <w:b/>
+                <w:sz w:val="15"/>
+              </w:rPr>
+              <w:t>Media</w:t>
+            </w:r>
+          </w:p>
+        </w:tc>
+        <w:tc>
+          <w:tcPr>
+            <w:tcW w:type="dxa" w:w="1434"/>
+            <w:shd w:val="clear" w:color="auto" w:fill="FFE699"/>
+            <w:vAlign w:val="center"/>
+          </w:tcPr>
+          <w:p>
+            <w:pPr>
+              <w:spacing w:before="0" w:after="0" w:line="240" w:lineRule="auto"/>
+              <w:jc w:val="center"/>
+            </w:pPr>
+            <w:r>
+              <w:rPr>
+                <w:b/>
+                <w:sz w:val="15"/>
+              </w:rPr>
+            </w:r>
+          </w:p>
+        </w:tc>
+        <w:tc>
+          <w:tcPr>
+            <w:tcW w:type="dxa" w:w="1135"/>
+            <w:shd w:val="clear" w:color="auto" w:fill="FFE699"/>
+            <w:vAlign w:val="center"/>
+          </w:tcPr>
+          <w:p>
+            <w:pPr>
+              <w:spacing w:before="0" w:after="0" w:line="240" w:lineRule="auto"/>
+              <w:jc w:val="center"/>
+            </w:pPr>
+            <w:r>
+              <w:rPr>
+                <w:b/>
+                <w:sz w:val="15"/>
+              </w:rPr>
+            </w:r>
+          </w:p>
+        </w:tc>
+        <w:tc>
+          <w:tcPr>
+            <w:tcW w:type="dxa" w:w="637"/>
+            <w:shd w:val="clear" w:color="auto" w:fill="FFE699"/>
+            <w:vAlign w:val="center"/>
+          </w:tcPr>
+          <w:p>
+            <w:pPr>
+              <w:spacing w:before="0" w:after="0" w:line="240" w:lineRule="auto"/>
+              <w:jc w:val="center"/>
+            </w:pPr>
+            <w:r>
+              <w:rPr>
+                <w:b/>
+                <w:sz w:val="15"/>
+              </w:rPr>
+              <w:t>88.17</w:t>
+            </w:r>
+          </w:p>
+        </w:tc>
+        <w:tc>
+          <w:tcPr>
+            <w:tcW w:type="dxa" w:w="966"/>
+            <w:shd w:val="clear" w:color="auto" w:fill="FFE699"/>
+            <w:vAlign w:val="center"/>
+          </w:tcPr>
+          <w:p>
+            <w:pPr>
+              <w:spacing w:before="0" w:after="0" w:line="240" w:lineRule="auto"/>
+              <w:jc w:val="center"/>
+            </w:pPr>
+            <w:r>
+              <w:rPr>
+                <w:b/>
+                <w:sz w:val="15"/>
+              </w:rPr>
+            </w:r>
+          </w:p>
+        </w:tc>
+        <w:tc>
+          <w:tcPr>
+            <w:tcW w:type="dxa" w:w="767"/>
+            <w:shd w:val="clear" w:color="auto" w:fill="FFE699"/>
+            <w:vAlign w:val="center"/>
+          </w:tcPr>
+          <w:p>
+            <w:pPr>
+              <w:spacing w:before="0" w:after="0" w:line="240" w:lineRule="auto"/>
+              <w:jc w:val="center"/>
+            </w:pPr>
+            <w:r>
+              <w:rPr>
+                <w:b/>
+                <w:sz w:val="15"/>
+              </w:rPr>
+            </w:r>
+          </w:p>
+        </w:tc>
+        <w:tc>
+          <w:tcPr>
+            <w:tcW w:type="dxa" w:w="773"/>
+            <w:shd w:val="clear" w:color="auto" w:fill="FFE699"/>
+            <w:vAlign w:val="center"/>
+          </w:tcPr>
+          <w:p>
+            <w:pPr>
+              <w:spacing w:before="0" w:after="0" w:line="240" w:lineRule="auto"/>
+              <w:jc w:val="center"/>
+            </w:pPr>
+            <w:r>
+              <w:rPr>
+                <w:b/>
+                <w:sz w:val="15"/>
+              </w:rPr>
+            </w:r>
+          </w:p>
+        </w:tc>
+      </w:tr>
+      <w:tr>
+        <w:trPr>
+          <w:cantSplit/>
+        </w:trPr>
+        <w:tc>
+          <w:tcPr>
+            <w:tcW w:type="dxa" w:w="1394"/>
+            <w:vAlign w:val="center"/>
+          </w:tcPr>
+          <w:p>
+            <w:pPr>
+              <w:spacing w:before="0" w:after="0" w:line="240" w:lineRule="auto"/>
+              <w:jc w:val="center"/>
+            </w:pPr>
+            <w:r>
+              <w:rPr>
+                <w:b w:val="0"/>
+                <w:sz w:val="15"/>
+              </w:rPr>
+              <w:t>DenseNet-121</w:t>
+            </w:r>
+          </w:p>
+        </w:tc>
+        <w:tc>
+          <w:tcPr>
+            <w:tcW w:type="dxa" w:w="867"/>
+            <w:vAlign w:val="center"/>
+          </w:tcPr>
+          <w:p>
+            <w:pPr>
+              <w:spacing w:before="0" w:after="0" w:line="240" w:lineRule="auto"/>
+              <w:jc w:val="center"/>
+            </w:pPr>
+            <w:r>
+              <w:rPr>
+                <w:b w:val="0"/>
+                <w:sz w:val="15"/>
+              </w:rPr>
+              <w:t>Rohu</w:t>
+            </w:r>
+          </w:p>
+        </w:tc>
+        <w:tc>
+          <w:tcPr>
+            <w:tcW w:type="dxa" w:w="667"/>
+            <w:vAlign w:val="center"/>
+          </w:tcPr>
+          <w:p>
+            <w:pPr>
+              <w:spacing w:before="0" w:after="0" w:line="240" w:lineRule="auto"/>
+              <w:jc w:val="center"/>
+            </w:pPr>
+            <w:r>
+              <w:rPr>
+                <w:b w:val="0"/>
+                <w:sz w:val="15"/>
+              </w:rPr>
+              <w:t>Fold 1</w:t>
+            </w:r>
+          </w:p>
+        </w:tc>
+        <w:tc>
+          <w:tcPr>
+            <w:tcW w:type="dxa" w:w="1434"/>
+            <w:vAlign w:val="center"/>
+          </w:tcPr>
+          <w:p>
+            <w:pPr>
+              <w:spacing w:before="0" w:after="0" w:line="240" w:lineRule="auto"/>
+              <w:jc w:val="center"/>
+            </w:pPr>
+            <w:r>
+              <w:rPr>
+                <w:b w:val="0"/>
+                <w:sz w:val="15"/>
+              </w:rPr>
+              <w:t>1012</w:t>
+            </w:r>
+          </w:p>
+        </w:tc>
+        <w:tc>
+          <w:tcPr>
+            <w:tcW w:type="dxa" w:w="1135"/>
+            <w:vAlign w:val="center"/>
+          </w:tcPr>
+          <w:p>
+            <w:pPr>
+              <w:spacing w:before="0" w:after="0" w:line="240" w:lineRule="auto"/>
+              <w:jc w:val="center"/>
+            </w:pPr>
+            <w:r>
+              <w:rPr>
+                <w:b w:val="0"/>
+                <w:sz w:val="15"/>
+              </w:rPr>
+              <w:t>249 (160 Trucha / 89 Rohu)</w:t>
+            </w:r>
+          </w:p>
+        </w:tc>
+        <w:tc>
+          <w:tcPr>
+            <w:tcW w:type="dxa" w:w="637"/>
+            <w:vAlign w:val="center"/>
+          </w:tcPr>
+          <w:p>
+            <w:pPr>
+              <w:spacing w:before="0" w:after="0" w:line="240" w:lineRule="auto"/>
+              <w:jc w:val="center"/>
+            </w:pPr>
+            <w:r>
+              <w:rPr>
+                <w:b w:val="0"/>
+                <w:sz w:val="15"/>
+              </w:rPr>
+              <w:t>85.75</w:t>
+            </w:r>
+          </w:p>
+        </w:tc>
+        <w:tc>
+          <w:tcPr>
+            <w:tcW w:type="dxa" w:w="966"/>
+            <w:vAlign w:val="center"/>
+          </w:tcPr>
+          <w:p>
+            <w:pPr>
+              <w:spacing w:before="0" w:after="0" w:line="240" w:lineRule="auto"/>
+              <w:jc w:val="center"/>
+            </w:pPr>
+            <w:r>
+              <w:rPr>
+                <w:b w:val="0"/>
+                <w:sz w:val="15"/>
+              </w:rPr>
+              <w:t>86.75</w:t>
+            </w:r>
+          </w:p>
+        </w:tc>
+        <w:tc>
+          <w:tcPr>
+            <w:tcW w:type="dxa" w:w="767"/>
+            <w:vAlign w:val="center"/>
+          </w:tcPr>
+          <w:p>
+            <w:pPr>
+              <w:spacing w:before="0" w:after="0" w:line="240" w:lineRule="auto"/>
+              <w:jc w:val="center"/>
+            </w:pPr>
+            <w:r>
+              <w:rPr>
+                <w:b w:val="0"/>
+                <w:sz w:val="15"/>
+              </w:rPr>
+              <w:t>24</w:t>
+            </w:r>
+          </w:p>
+        </w:tc>
+        <w:tc>
+          <w:tcPr>
+            <w:tcW w:type="dxa" w:w="773"/>
+            <w:vAlign w:val="center"/>
+          </w:tcPr>
+          <w:p>
+            <w:pPr>
+              <w:spacing w:before="0" w:after="0" w:line="240" w:lineRule="auto"/>
+              <w:jc w:val="center"/>
+            </w:pPr>
+            <w:r>
+              <w:rPr>
+                <w:b w:val="0"/>
+                <w:sz w:val="15"/>
+              </w:rPr>
+              <w:t>331.0</w:t>
+            </w:r>
+          </w:p>
+        </w:tc>
+      </w:tr>
+      <w:tr>
+        <w:trPr>
+          <w:cantSplit/>
+        </w:trPr>
+        <w:tc>
+          <w:tcPr>
+            <w:tcW w:type="dxa" w:w="1394"/>
+            <w:vAlign w:val="center"/>
+          </w:tcPr>
+          <w:p>
+            <w:pPr>
+              <w:spacing w:before="0" w:after="0" w:line="240" w:lineRule="auto"/>
+              <w:jc w:val="center"/>
+            </w:pPr>
+            <w:r>
+              <w:rPr>
+                <w:b w:val="0"/>
+                <w:sz w:val="15"/>
+              </w:rPr>
+              <w:t>DenseNet-121</w:t>
+            </w:r>
+          </w:p>
+        </w:tc>
+        <w:tc>
+          <w:tcPr>
+            <w:tcW w:type="dxa" w:w="867"/>
+            <w:vAlign w:val="center"/>
+          </w:tcPr>
+          <w:p>
+            <w:pPr>
+              <w:spacing w:before="0" w:after="0" w:line="240" w:lineRule="auto"/>
+              <w:jc w:val="center"/>
+            </w:pPr>
+            <w:r>
+              <w:rPr>
+                <w:b w:val="0"/>
+                <w:sz w:val="15"/>
+              </w:rPr>
+              <w:t>Rohu</w:t>
+            </w:r>
+          </w:p>
+        </w:tc>
+        <w:tc>
+          <w:tcPr>
+            <w:tcW w:type="dxa" w:w="667"/>
+            <w:vAlign w:val="center"/>
+          </w:tcPr>
+          <w:p>
+            <w:pPr>
+              <w:spacing w:before="0" w:after="0" w:line="240" w:lineRule="auto"/>
+              <w:jc w:val="center"/>
+            </w:pPr>
+            <w:r>
+              <w:rPr>
+                <w:b w:val="0"/>
+                <w:sz w:val="15"/>
+              </w:rPr>
+              <w:t>Fold 2</w:t>
+            </w:r>
+          </w:p>
+        </w:tc>
+        <w:tc>
+          <w:tcPr>
+            <w:tcW w:type="dxa" w:w="1434"/>
+            <w:vAlign w:val="center"/>
+          </w:tcPr>
+          <w:p>
+            <w:pPr>
+              <w:spacing w:before="0" w:after="0" w:line="240" w:lineRule="auto"/>
+              <w:jc w:val="center"/>
+            </w:pPr>
+            <w:r>
+              <w:rPr>
+                <w:b w:val="0"/>
+                <w:sz w:val="15"/>
+              </w:rPr>
+              <w:t>1007</w:t>
+            </w:r>
+          </w:p>
+        </w:tc>
+        <w:tc>
+          <w:tcPr>
+            <w:tcW w:type="dxa" w:w="1135"/>
+            <w:vAlign w:val="center"/>
+          </w:tcPr>
+          <w:p>
+            <w:pPr>
+              <w:spacing w:before="0" w:after="0" w:line="240" w:lineRule="auto"/>
+              <w:jc w:val="center"/>
+            </w:pPr>
+            <w:r>
+              <w:rPr>
+                <w:b w:val="0"/>
+                <w:sz w:val="15"/>
+              </w:rPr>
+              <w:t>254 (160 Trucha / 94 Rohu)</w:t>
+            </w:r>
+          </w:p>
+        </w:tc>
+        <w:tc>
+          <w:tcPr>
+            <w:tcW w:type="dxa" w:w="637"/>
+            <w:vAlign w:val="center"/>
+          </w:tcPr>
+          <w:p>
+            <w:pPr>
+              <w:spacing w:before="0" w:after="0" w:line="240" w:lineRule="auto"/>
+              <w:jc w:val="center"/>
+            </w:pPr>
+            <w:r>
+              <w:rPr>
+                <w:b w:val="0"/>
+                <w:sz w:val="15"/>
+              </w:rPr>
+              <w:t>83.25</w:t>
+            </w:r>
+          </w:p>
+        </w:tc>
+        <w:tc>
+          <w:tcPr>
+            <w:tcW w:type="dxa" w:w="966"/>
+            <w:vAlign w:val="center"/>
+          </w:tcPr>
+          <w:p>
+            <w:pPr>
+              <w:spacing w:before="0" w:after="0" w:line="240" w:lineRule="auto"/>
+              <w:jc w:val="center"/>
+            </w:pPr>
+            <w:r>
+              <w:rPr>
+                <w:b w:val="0"/>
+                <w:sz w:val="15"/>
+              </w:rPr>
+              <w:t>86.22</w:t>
+            </w:r>
+          </w:p>
+        </w:tc>
+        <w:tc>
+          <w:tcPr>
+            <w:tcW w:type="dxa" w:w="767"/>
+            <w:vAlign w:val="center"/>
+          </w:tcPr>
+          <w:p>
+            <w:pPr>
+              <w:spacing w:before="0" w:after="0" w:line="240" w:lineRule="auto"/>
+              <w:jc w:val="center"/>
+            </w:pPr>
+            <w:r>
+              <w:rPr>
+                <w:b w:val="0"/>
+                <w:sz w:val="15"/>
+              </w:rPr>
+              <w:t>26</w:t>
+            </w:r>
+          </w:p>
+        </w:tc>
+        <w:tc>
+          <w:tcPr>
+            <w:tcW w:type="dxa" w:w="773"/>
+            <w:vAlign w:val="center"/>
+          </w:tcPr>
+          <w:p>
+            <w:pPr>
+              <w:spacing w:before="0" w:after="0" w:line="240" w:lineRule="auto"/>
+              <w:jc w:val="center"/>
+            </w:pPr>
+            <w:r>
+              <w:rPr>
+                <w:b w:val="0"/>
+                <w:sz w:val="15"/>
+              </w:rPr>
+              <w:t>358.5</w:t>
+            </w:r>
+          </w:p>
+        </w:tc>
+      </w:tr>
+      <w:tr>
+        <w:trPr>
+          <w:cantSplit/>
+        </w:trPr>
+        <w:tc>
+          <w:tcPr>
+            <w:tcW w:type="dxa" w:w="1394"/>
+            <w:vAlign w:val="center"/>
+          </w:tcPr>
+          <w:p>
+            <w:pPr>
+              <w:spacing w:before="0" w:after="0" w:line="240" w:lineRule="auto"/>
+              <w:jc w:val="center"/>
+            </w:pPr>
+            <w:r>
+              <w:rPr>
+                <w:b w:val="0"/>
+                <w:sz w:val="15"/>
+              </w:rPr>
+              <w:t>DenseNet-121</w:t>
+            </w:r>
+          </w:p>
+        </w:tc>
+        <w:tc>
+          <w:tcPr>
+            <w:tcW w:type="dxa" w:w="867"/>
+            <w:vAlign w:val="center"/>
+          </w:tcPr>
+          <w:p>
+            <w:pPr>
+              <w:spacing w:before="0" w:after="0" w:line="240" w:lineRule="auto"/>
+              <w:jc w:val="center"/>
+            </w:pPr>
+            <w:r>
+              <w:rPr>
+                <w:b w:val="0"/>
+                <w:sz w:val="15"/>
+              </w:rPr>
+              <w:t>Rohu</w:t>
+            </w:r>
+          </w:p>
+        </w:tc>
+        <w:tc>
+          <w:tcPr>
+            <w:tcW w:type="dxa" w:w="667"/>
+            <w:vAlign w:val="center"/>
+          </w:tcPr>
+          <w:p>
+            <w:pPr>
+              <w:spacing w:before="0" w:after="0" w:line="240" w:lineRule="auto"/>
+              <w:jc w:val="center"/>
+            </w:pPr>
+            <w:r>
+              <w:rPr>
+                <w:b w:val="0"/>
+                <w:sz w:val="15"/>
+              </w:rPr>
+              <w:t>Fold 3</w:t>
+            </w:r>
+          </w:p>
+        </w:tc>
+        <w:tc>
+          <w:tcPr>
+            <w:tcW w:type="dxa" w:w="1434"/>
+            <w:vAlign w:val="center"/>
+          </w:tcPr>
+          <w:p>
+            <w:pPr>
+              <w:spacing w:before="0" w:after="0" w:line="240" w:lineRule="auto"/>
+              <w:jc w:val="center"/>
+            </w:pPr>
+            <w:r>
+              <w:rPr>
+                <w:b w:val="0"/>
+                <w:sz w:val="15"/>
+              </w:rPr>
+              <w:t>1015</w:t>
+            </w:r>
+          </w:p>
+        </w:tc>
+        <w:tc>
+          <w:tcPr>
+            <w:tcW w:type="dxa" w:w="1135"/>
+            <w:vAlign w:val="center"/>
+          </w:tcPr>
+          <w:p>
+            <w:pPr>
+              <w:spacing w:before="0" w:after="0" w:line="240" w:lineRule="auto"/>
+              <w:jc w:val="center"/>
+            </w:pPr>
+            <w:r>
+              <w:rPr>
+                <w:b w:val="0"/>
+                <w:sz w:val="15"/>
+              </w:rPr>
+              <w:t>246 (162 Trucha / 84 Rohu)</w:t>
+            </w:r>
+          </w:p>
+        </w:tc>
+        <w:tc>
+          <w:tcPr>
+            <w:tcW w:type="dxa" w:w="637"/>
+            <w:vAlign w:val="center"/>
+          </w:tcPr>
+          <w:p>
+            <w:pPr>
+              <w:spacing w:before="0" w:after="0" w:line="240" w:lineRule="auto"/>
+              <w:jc w:val="center"/>
+            </w:pPr>
+            <w:r>
+              <w:rPr>
+                <w:b w:val="0"/>
+                <w:sz w:val="15"/>
+              </w:rPr>
+              <w:t>86.25</w:t>
+            </w:r>
+          </w:p>
+        </w:tc>
+        <w:tc>
+          <w:tcPr>
+            <w:tcW w:type="dxa" w:w="966"/>
+            <w:vAlign w:val="center"/>
+          </w:tcPr>
+          <w:p>
+            <w:pPr>
+              <w:spacing w:before="0" w:after="0" w:line="240" w:lineRule="auto"/>
+              <w:jc w:val="center"/>
+            </w:pPr>
+            <w:r>
+              <w:rPr>
+                <w:b w:val="0"/>
+                <w:sz w:val="15"/>
+              </w:rPr>
+              <w:t>88.62</w:t>
+            </w:r>
+          </w:p>
+        </w:tc>
+        <w:tc>
+          <w:tcPr>
+            <w:tcW w:type="dxa" w:w="767"/>
+            <w:vAlign w:val="center"/>
+          </w:tcPr>
+          <w:p>
+            <w:pPr>
+              <w:spacing w:before="0" w:after="0" w:line="240" w:lineRule="auto"/>
+              <w:jc w:val="center"/>
+            </w:pPr>
+            <w:r>
+              <w:rPr>
+                <w:b w:val="0"/>
+                <w:sz w:val="15"/>
+              </w:rPr>
+              <w:t>30</w:t>
+            </w:r>
+          </w:p>
+        </w:tc>
+        <w:tc>
+          <w:tcPr>
+            <w:tcW w:type="dxa" w:w="773"/>
+            <w:vAlign w:val="center"/>
+          </w:tcPr>
+          <w:p>
+            <w:pPr>
+              <w:spacing w:before="0" w:after="0" w:line="240" w:lineRule="auto"/>
+              <w:jc w:val="center"/>
+            </w:pPr>
+            <w:r>
+              <w:rPr>
+                <w:b w:val="0"/>
+                <w:sz w:val="15"/>
+              </w:rPr>
+              <w:t>413.6</w:t>
+            </w:r>
+          </w:p>
+        </w:tc>
+      </w:tr>
+      <w:tr>
+        <w:trPr>
+          <w:cantSplit/>
+        </w:trPr>
+        <w:tc>
+          <w:tcPr>
+            <w:tcW w:type="dxa" w:w="1394"/>
+            <w:vAlign w:val="center"/>
+          </w:tcPr>
+          <w:p>
+            <w:pPr>
+              <w:spacing w:before="0" w:after="0" w:line="240" w:lineRule="auto"/>
+              <w:jc w:val="center"/>
+            </w:pPr>
+            <w:r>
+              <w:rPr>
+                <w:b w:val="0"/>
+                <w:sz w:val="15"/>
+              </w:rPr>
+              <w:t>DenseNet-121</w:t>
+            </w:r>
+          </w:p>
+        </w:tc>
+        <w:tc>
+          <w:tcPr>
+            <w:tcW w:type="dxa" w:w="867"/>
+            <w:vAlign w:val="center"/>
+          </w:tcPr>
+          <w:p>
+            <w:pPr>
+              <w:spacing w:before="0" w:after="0" w:line="240" w:lineRule="auto"/>
+              <w:jc w:val="center"/>
+            </w:pPr>
+            <w:r>
+              <w:rPr>
+                <w:b w:val="0"/>
+                <w:sz w:val="15"/>
+              </w:rPr>
+              <w:t>Rohu</w:t>
+            </w:r>
+          </w:p>
+        </w:tc>
+        <w:tc>
+          <w:tcPr>
+            <w:tcW w:type="dxa" w:w="667"/>
+            <w:vAlign w:val="center"/>
+          </w:tcPr>
+          <w:p>
+            <w:pPr>
+              <w:spacing w:before="0" w:after="0" w:line="240" w:lineRule="auto"/>
+              <w:jc w:val="center"/>
+            </w:pPr>
+            <w:r>
+              <w:rPr>
+                <w:b w:val="0"/>
+                <w:sz w:val="15"/>
+              </w:rPr>
+              <w:t>Fold 4</w:t>
+            </w:r>
+          </w:p>
+        </w:tc>
+        <w:tc>
+          <w:tcPr>
+            <w:tcW w:type="dxa" w:w="1434"/>
+            <w:vAlign w:val="center"/>
+          </w:tcPr>
+          <w:p>
+            <w:pPr>
+              <w:spacing w:before="0" w:after="0" w:line="240" w:lineRule="auto"/>
+              <w:jc w:val="center"/>
+            </w:pPr>
+            <w:r>
+              <w:rPr>
+                <w:b w:val="0"/>
+                <w:sz w:val="15"/>
+              </w:rPr>
+              <w:t>977</w:t>
+            </w:r>
+          </w:p>
+        </w:tc>
+        <w:tc>
+          <w:tcPr>
+            <w:tcW w:type="dxa" w:w="1135"/>
+            <w:vAlign w:val="center"/>
+          </w:tcPr>
+          <w:p>
+            <w:pPr>
+              <w:spacing w:before="0" w:after="0" w:line="240" w:lineRule="auto"/>
+              <w:jc w:val="center"/>
+            </w:pPr>
+            <w:r>
+              <w:rPr>
+                <w:b w:val="0"/>
+                <w:sz w:val="15"/>
+              </w:rPr>
+              <w:t>284 (162 Trucha / 122 Rohu)</w:t>
+            </w:r>
+          </w:p>
+        </w:tc>
+        <w:tc>
+          <w:tcPr>
+            <w:tcW w:type="dxa" w:w="637"/>
+            <w:vAlign w:val="center"/>
+          </w:tcPr>
+          <w:p>
+            <w:pPr>
+              <w:spacing w:before="0" w:after="0" w:line="240" w:lineRule="auto"/>
+              <w:jc w:val="center"/>
+            </w:pPr>
+            <w:r>
+              <w:rPr>
+                <w:b w:val="0"/>
+                <w:sz w:val="15"/>
+              </w:rPr>
+              <w:t>77.10</w:t>
+            </w:r>
+          </w:p>
+        </w:tc>
+        <w:tc>
+          <w:tcPr>
+            <w:tcW w:type="dxa" w:w="966"/>
+            <w:vAlign w:val="center"/>
+          </w:tcPr>
+          <w:p>
+            <w:pPr>
+              <w:spacing w:before="0" w:after="0" w:line="240" w:lineRule="auto"/>
+              <w:jc w:val="center"/>
+            </w:pPr>
+            <w:r>
+              <w:rPr>
+                <w:b w:val="0"/>
+                <w:sz w:val="15"/>
+              </w:rPr>
+              <w:t>82.75</w:t>
+            </w:r>
+          </w:p>
+        </w:tc>
+        <w:tc>
+          <w:tcPr>
+            <w:tcW w:type="dxa" w:w="767"/>
+            <w:vAlign w:val="center"/>
+          </w:tcPr>
+          <w:p>
+            <w:pPr>
+              <w:spacing w:before="0" w:after="0" w:line="240" w:lineRule="auto"/>
+              <w:jc w:val="center"/>
+            </w:pPr>
+            <w:r>
+              <w:rPr>
+                <w:b w:val="0"/>
+                <w:sz w:val="15"/>
+              </w:rPr>
+              <w:t>26</w:t>
+            </w:r>
+          </w:p>
+        </w:tc>
+        <w:tc>
+          <w:tcPr>
+            <w:tcW w:type="dxa" w:w="773"/>
+            <w:vAlign w:val="center"/>
+          </w:tcPr>
+          <w:p>
+            <w:pPr>
+              <w:spacing w:before="0" w:after="0" w:line="240" w:lineRule="auto"/>
+              <w:jc w:val="center"/>
+            </w:pPr>
+            <w:r>
+              <w:rPr>
+                <w:b w:val="0"/>
+                <w:sz w:val="15"/>
+              </w:rPr>
+              <w:t>359.7</w:t>
+            </w:r>
+          </w:p>
+        </w:tc>
+      </w:tr>
+      <w:tr>
+        <w:trPr>
+          <w:cantSplit/>
+        </w:trPr>
+        <w:tc>
+          <w:tcPr>
+            <w:tcW w:type="dxa" w:w="1394"/>
+            <w:vAlign w:val="center"/>
+          </w:tcPr>
+          <w:p>
+            <w:pPr>
+              <w:spacing w:before="0" w:after="0" w:line="240" w:lineRule="auto"/>
+              <w:jc w:val="center"/>
+            </w:pPr>
+            <w:r>
+              <w:rPr>
+                <w:b w:val="0"/>
+                <w:sz w:val="15"/>
+              </w:rPr>
+              <w:t>DenseNet-121</w:t>
+            </w:r>
+          </w:p>
+        </w:tc>
+        <w:tc>
+          <w:tcPr>
+            <w:tcW w:type="dxa" w:w="867"/>
+            <w:vAlign w:val="center"/>
+          </w:tcPr>
+          <w:p>
+            <w:pPr>
+              <w:spacing w:before="0" w:after="0" w:line="240" w:lineRule="auto"/>
+              <w:jc w:val="center"/>
+            </w:pPr>
+            <w:r>
+              <w:rPr>
+                <w:b w:val="0"/>
+                <w:sz w:val="15"/>
+              </w:rPr>
+              <w:t>Rohu</w:t>
+            </w:r>
+          </w:p>
+        </w:tc>
+        <w:tc>
+          <w:tcPr>
+            <w:tcW w:type="dxa" w:w="667"/>
+            <w:vAlign w:val="center"/>
+          </w:tcPr>
+          <w:p>
+            <w:pPr>
+              <w:spacing w:before="0" w:after="0" w:line="240" w:lineRule="auto"/>
+              <w:jc w:val="center"/>
+            </w:pPr>
+            <w:r>
+              <w:rPr>
+                <w:b w:val="0"/>
+                <w:sz w:val="15"/>
+              </w:rPr>
+              <w:t>Fold 5</w:t>
+            </w:r>
+          </w:p>
+        </w:tc>
+        <w:tc>
+          <w:tcPr>
+            <w:tcW w:type="dxa" w:w="1434"/>
+            <w:vAlign w:val="center"/>
+          </w:tcPr>
+          <w:p>
+            <w:pPr>
+              <w:spacing w:before="0" w:after="0" w:line="240" w:lineRule="auto"/>
+              <w:jc w:val="center"/>
+            </w:pPr>
+            <w:r>
+              <w:rPr>
+                <w:b w:val="0"/>
+                <w:sz w:val="15"/>
+              </w:rPr>
+              <w:t>1033</w:t>
+            </w:r>
+          </w:p>
+        </w:tc>
+        <w:tc>
+          <w:tcPr>
+            <w:tcW w:type="dxa" w:w="1135"/>
+            <w:vAlign w:val="center"/>
+          </w:tcPr>
+          <w:p>
+            <w:pPr>
+              <w:spacing w:before="0" w:after="0" w:line="240" w:lineRule="auto"/>
+              <w:jc w:val="center"/>
+            </w:pPr>
+            <w:r>
+              <w:rPr>
+                <w:b w:val="0"/>
+                <w:sz w:val="15"/>
+              </w:rPr>
+              <w:t>228 (161 Trucha / 67 Rohu)</w:t>
+            </w:r>
+          </w:p>
+        </w:tc>
+        <w:tc>
+          <w:tcPr>
+            <w:tcW w:type="dxa" w:w="637"/>
+            <w:vAlign w:val="center"/>
+          </w:tcPr>
+          <w:p>
+            <w:pPr>
+              <w:spacing w:before="0" w:after="0" w:line="240" w:lineRule="auto"/>
+              <w:jc w:val="center"/>
+            </w:pPr>
+            <w:r>
+              <w:rPr>
+                <w:b w:val="0"/>
+                <w:sz w:val="15"/>
+              </w:rPr>
+              <w:t>81.92</w:t>
+            </w:r>
+          </w:p>
+        </w:tc>
+        <w:tc>
+          <w:tcPr>
+            <w:tcW w:type="dxa" w:w="966"/>
+            <w:vAlign w:val="center"/>
+          </w:tcPr>
+          <w:p>
+            <w:pPr>
+              <w:spacing w:before="0" w:after="0" w:line="240" w:lineRule="auto"/>
+              <w:jc w:val="center"/>
+            </w:pPr>
+            <w:r>
+              <w:rPr>
+                <w:b w:val="0"/>
+                <w:sz w:val="15"/>
+              </w:rPr>
+              <w:t>83.77</w:t>
+            </w:r>
+          </w:p>
+        </w:tc>
+        <w:tc>
+          <w:tcPr>
+            <w:tcW w:type="dxa" w:w="767"/>
+            <w:vAlign w:val="center"/>
+          </w:tcPr>
+          <w:p>
+            <w:pPr>
+              <w:spacing w:before="0" w:after="0" w:line="240" w:lineRule="auto"/>
+              <w:jc w:val="center"/>
+            </w:pPr>
+            <w:r>
+              <w:rPr>
+                <w:b w:val="0"/>
+                <w:sz w:val="15"/>
+              </w:rPr>
+              <w:t>20</w:t>
+            </w:r>
+          </w:p>
+        </w:tc>
+        <w:tc>
+          <w:tcPr>
+            <w:tcW w:type="dxa" w:w="773"/>
+            <w:vAlign w:val="center"/>
+          </w:tcPr>
+          <w:p>
+            <w:pPr>
+              <w:spacing w:before="0" w:after="0" w:line="240" w:lineRule="auto"/>
+              <w:jc w:val="center"/>
+            </w:pPr>
+            <w:r>
+              <w:rPr>
+                <w:b w:val="0"/>
+                <w:sz w:val="15"/>
+              </w:rPr>
+              <w:t>272.3</w:t>
+            </w:r>
+          </w:p>
+        </w:tc>
+      </w:tr>
+      <w:tr>
+        <w:trPr>
+          <w:cantSplit/>
+        </w:trPr>
+        <w:tc>
+          <w:tcPr>
+            <w:tcW w:type="dxa" w:w="1394"/>
+            <w:shd w:val="clear" w:color="auto" w:fill="FFE699"/>
+            <w:vAlign w:val="center"/>
+          </w:tcPr>
+          <w:p>
+            <w:pPr>
+              <w:spacing w:before="0" w:after="0" w:line="240" w:lineRule="auto"/>
+              <w:jc w:val="center"/>
+            </w:pPr>
+            <w:r>
+              <w:rPr>
+                <w:b/>
+                <w:sz w:val="15"/>
+              </w:rPr>
+              <w:t>DenseNet-121</w:t>
+            </w:r>
+          </w:p>
+        </w:tc>
+        <w:tc>
+          <w:tcPr>
+            <w:tcW w:type="dxa" w:w="867"/>
+            <w:shd w:val="clear" w:color="auto" w:fill="FFE699"/>
+            <w:vAlign w:val="center"/>
+          </w:tcPr>
+          <w:p>
+            <w:pPr>
+              <w:spacing w:before="0" w:after="0" w:line="240" w:lineRule="auto"/>
+              <w:jc w:val="center"/>
+            </w:pPr>
+            <w:r>
+              <w:rPr>
+                <w:b/>
+                <w:sz w:val="15"/>
+              </w:rPr>
+              <w:t>Rohu</w:t>
+            </w:r>
+          </w:p>
+        </w:tc>
+        <w:tc>
+          <w:tcPr>
+            <w:tcW w:type="dxa" w:w="667"/>
+            <w:shd w:val="clear" w:color="auto" w:fill="FFE699"/>
+            <w:vAlign w:val="center"/>
+          </w:tcPr>
+          <w:p>
+            <w:pPr>
+              <w:spacing w:before="0" w:after="0" w:line="240" w:lineRule="auto"/>
+              <w:jc w:val="center"/>
+            </w:pPr>
+            <w:r>
+              <w:rPr>
+                <w:b/>
+                <w:sz w:val="15"/>
+              </w:rPr>
+              <w:t>Media</w:t>
+            </w:r>
+          </w:p>
+        </w:tc>
+        <w:tc>
+          <w:tcPr>
+            <w:tcW w:type="dxa" w:w="1434"/>
+            <w:shd w:val="clear" w:color="auto" w:fill="FFE699"/>
+            <w:vAlign w:val="center"/>
+          </w:tcPr>
+          <w:p>
+            <w:pPr>
+              <w:spacing w:before="0" w:after="0" w:line="240" w:lineRule="auto"/>
+              <w:jc w:val="center"/>
+            </w:pPr>
+            <w:r>
+              <w:rPr>
+                <w:b/>
+                <w:sz w:val="15"/>
+              </w:rPr>
+            </w:r>
+          </w:p>
+        </w:tc>
+        <w:tc>
+          <w:tcPr>
+            <w:tcW w:type="dxa" w:w="1135"/>
+            <w:shd w:val="clear" w:color="auto" w:fill="FFE699"/>
+            <w:vAlign w:val="center"/>
+          </w:tcPr>
+          <w:p>
+            <w:pPr>
+              <w:spacing w:before="0" w:after="0" w:line="240" w:lineRule="auto"/>
+              <w:jc w:val="center"/>
+            </w:pPr>
+            <w:r>
+              <w:rPr>
+                <w:b/>
+                <w:sz w:val="15"/>
+              </w:rPr>
+            </w:r>
+          </w:p>
+        </w:tc>
+        <w:tc>
+          <w:tcPr>
+            <w:tcW w:type="dxa" w:w="637"/>
+            <w:shd w:val="clear" w:color="auto" w:fill="FFE699"/>
+            <w:vAlign w:val="center"/>
+          </w:tcPr>
+          <w:p>
+            <w:pPr>
+              <w:spacing w:before="0" w:after="0" w:line="240" w:lineRule="auto"/>
+              <w:jc w:val="center"/>
+            </w:pPr>
+            <w:r>
+              <w:rPr>
+                <w:b/>
+                <w:sz w:val="15"/>
+              </w:rPr>
+              <w:t>82.85</w:t>
+            </w:r>
+          </w:p>
+        </w:tc>
+        <w:tc>
+          <w:tcPr>
+            <w:tcW w:type="dxa" w:w="966"/>
+            <w:shd w:val="clear" w:color="auto" w:fill="FFE699"/>
+            <w:vAlign w:val="center"/>
+          </w:tcPr>
+          <w:p>
+            <w:pPr>
+              <w:spacing w:before="0" w:after="0" w:line="240" w:lineRule="auto"/>
+              <w:jc w:val="center"/>
+            </w:pPr>
+            <w:r>
+              <w:rPr>
+                <w:b/>
+                <w:sz w:val="15"/>
+              </w:rPr>
+            </w:r>
+          </w:p>
+        </w:tc>
+        <w:tc>
+          <w:tcPr>
+            <w:tcW w:type="dxa" w:w="767"/>
+            <w:shd w:val="clear" w:color="auto" w:fill="FFE699"/>
+            <w:vAlign w:val="center"/>
+          </w:tcPr>
+          <w:p>
+            <w:pPr>
+              <w:spacing w:before="0" w:after="0" w:line="240" w:lineRule="auto"/>
+              <w:jc w:val="center"/>
+            </w:pPr>
+            <w:r>
+              <w:rPr>
+                <w:b/>
+                <w:sz w:val="15"/>
+              </w:rPr>
+            </w:r>
+          </w:p>
+        </w:tc>
+        <w:tc>
+          <w:tcPr>
+            <w:tcW w:type="dxa" w:w="773"/>
+            <w:shd w:val="clear" w:color="auto" w:fill="FFE699"/>
+            <w:vAlign w:val="center"/>
+          </w:tcPr>
+          <w:p>
+            <w:pPr>
+              <w:spacing w:before="0" w:after="0" w:line="240" w:lineRule="auto"/>
+              <w:jc w:val="center"/>
+            </w:pPr>
+            <w:r>
+              <w:rPr>
+                <w:b/>
+                <w:sz w:val="15"/>
+              </w:rPr>
+            </w:r>
+          </w:p>
+        </w:tc>
+      </w:tr>
+    </w:tbl>
+    <w:p>
+      <w:r>
+        <w:rPr>
+          <w:b/>
+        </w:rPr>
+        <w:t xml:space="preserve">Nota: </w:t>
+      </w:r>
+      <w:r>
+        <w:rPr>
+          <w:i/>
+          <w:sz w:val="19"/>
+        </w:rPr>
+        <w:t>corrida de finetune_target_x2.py (Trucha) y experimento_dataset_mixto.py (Rohu): mismo método y semilla que la corrida de matrices de confusión, pero ejecutada aparte; por eso el F1 de cada fold difiere levemente del de las secciones 3.x. Logs: 2_logs/trucha_congelado_sinx2.log y 2_logs/rohu_congelado_sinx2.log.</w:t>
       </w:r>
     </w:p>
     <w:p>

</xml_diff>

<commit_message>
Documentacion tecnica: el dominio Rohu se describe solo como Rohu (1,261 imagenes), sin el detalle de su composicion
Co-Authored-By: Claude Opus 5.5 <noreply@anthropic.com>
Claude-Session: https://claude.ai/code/session_01H57NiR1mJmA9jsiQrmrPSF
</commit_message>
<xml_diff>
--- a/Documentacion_Tecnica_ViT_DenseNet.docx
+++ b/Documentacion_Tecnica_ViT_DenseNet.docx
@@ -482,18 +482,6 @@
     </w:p>
     <w:p>
       <w:r>
-        <w:rPr>
-          <w:b/>
-        </w:rPr>
-        <w:t xml:space="preserve">Composición de Rohu: </w:t>
-      </w:r>
-      <w:r>
-        <w:rPr/>
-        <w:t>el conjunto de Rohu combina 805 imágenes de Trucha (70 % de su pool, submuestra estratificada) y 456 de Rohu Kaggle (30 % de su pool), porque Rohu puro tiene un atajo de fecha/sesión que infla el F1 a ~99–100 % (experimento_dataset_mixto.py, construir_dataset_mixto; ver 2_logs/rohu_congelado_sinx2.log).</w:t>
-      </w:r>
-    </w:p>
-    <w:p>
-      <w:r>
         <w:rPr/>
         <w:t>Las clases no están balanceadas en ninguno de los dos dominios (Mendeley sí lo está, 50/50); por eso la métrica central es el F1 macro, que pesa igual a fresco y no_fresco (ver 2.3).</w:t>
       </w:r>
@@ -550,7 +538,7 @@
       </w:r>
       <w:r>
         <w:rPr/>
-        <w:t>StratifiedGroupKFold(n_splits=5, shuffle=True, random_state=42), agrupando las fotos casi idénticas (tomadas en ráfaga, detectadas con detectar_duplicados.py) para que una foto y su casi gemela nunca queden una en entrenamiento y otra en evaluación. Por eso el tamaño del fold de evaluación varía entre 228 y 284 imágenes. Las 456 imágenes de Rohu Kaggle forman 193 grupos (108 grupos con 2 o más imágenes casi idénticas; el grupo más grande tiene 15); cada imagen de Trucha es su propio grupo.</w:t>
+        <w:t>StratifiedGroupKFold(n_splits=5, shuffle=True, random_state=42), agrupando las fotos casi idénticas (tomadas en ráfaga, detectadas con detectar_duplicados.py) para que una foto y su casi gemela nunca queden una en entrenamiento y otra en evaluación. Por eso el tamaño del fold de evaluación varía entre 228 y 284 imágenes. Se detectaron 108 grupos de 2 o más fotos casi idénticas (el más grande con 15); cada una de las demás imágenes es su propio grupo.</w:t>
       </w:r>
     </w:p>
     <w:p>
@@ -6603,7 +6591,7 @@
                 <w:b w:val="0"/>
                 <w:sz w:val="15"/>
               </w:rPr>
-              <w:t>249 (160 Trucha / 89 Rohu)</w:t>
+              <w:t>249</w:t>
             </w:r>
           </w:p>
         </w:tc>
@@ -6779,7 +6767,7 @@
                 <w:b w:val="0"/>
                 <w:sz w:val="15"/>
               </w:rPr>
-              <w:t>254 (160 Trucha / 94 Rohu)</w:t>
+              <w:t>254</w:t>
             </w:r>
           </w:p>
         </w:tc>
@@ -6955,7 +6943,7 @@
                 <w:b w:val="0"/>
                 <w:sz w:val="15"/>
               </w:rPr>
-              <w:t>246 (162 Trucha / 84 Rohu)</w:t>
+              <w:t>246</w:t>
             </w:r>
           </w:p>
         </w:tc>
@@ -7131,7 +7119,7 @@
                 <w:b w:val="0"/>
                 <w:sz w:val="15"/>
               </w:rPr>
-              <w:t>284 (162 Trucha / 122 Rohu)</w:t>
+              <w:t>284</w:t>
             </w:r>
           </w:p>
         </w:tc>
@@ -7307,7 +7295,7 @@
                 <w:b w:val="0"/>
                 <w:sz w:val="15"/>
               </w:rPr>
-              <w:t>228 (161 Trucha / 67 Rohu)</w:t>
+              <w:t>228</w:t>
             </w:r>
           </w:p>
         </w:tc>
@@ -7663,7 +7651,7 @@
                 <w:b w:val="0"/>
                 <w:sz w:val="15"/>
               </w:rPr>
-              <w:t>249 (160 Trucha / 89 Rohu)</w:t>
+              <w:t>249</w:t>
             </w:r>
           </w:p>
         </w:tc>
@@ -7839,7 +7827,7 @@
                 <w:b w:val="0"/>
                 <w:sz w:val="15"/>
               </w:rPr>
-              <w:t>254 (160 Trucha / 94 Rohu)</w:t>
+              <w:t>254</w:t>
             </w:r>
           </w:p>
         </w:tc>
@@ -8015,7 +8003,7 @@
                 <w:b w:val="0"/>
                 <w:sz w:val="15"/>
               </w:rPr>
-              <w:t>246 (162 Trucha / 84 Rohu)</w:t>
+              <w:t>246</w:t>
             </w:r>
           </w:p>
         </w:tc>
@@ -8191,7 +8179,7 @@
                 <w:b w:val="0"/>
                 <w:sz w:val="15"/>
               </w:rPr>
-              <w:t>284 (162 Trucha / 122 Rohu)</w:t>
+              <w:t>284</w:t>
             </w:r>
           </w:p>
         </w:tc>
@@ -8367,7 +8355,7 @@
                 <w:b w:val="0"/>
                 <w:sz w:val="15"/>
               </w:rPr>
-              <w:t>228 (161 Trucha / 67 Rohu)</w:t>
+              <w:t>228</w:t>
             </w:r>
           </w:p>
         </w:tc>

</xml_diff>

<commit_message>
Renombra el dominio a Rohu en codigo y documentacion
- experimento_dataset_mixto.py -> experimento_rohu.py; construir_dataset_mixto -> construir_dataset_rohu
- Defaults de fraccion 0.7/0.3 (los del experimento presentado); linear_probe_confmat_roc.py ya no dependia de pasarlos
- README, Documentacion_Tecnica e Indicadores: el dominio se llama solo Rohu
- Logs de 2_logs/ sin modificar (salida original de las corridas)

Co-Authored-By: Claude Opus 5.5 <noreply@anthropic.com>
Claude-Session: https://claude.ai/code/session_01H57NiR1mJmA9jsiQrmrPSF
</commit_message>
<xml_diff>
--- a/Documentacion_Tecnica_ViT_DenseNet.docx
+++ b/Documentacion_Tecnica_ViT_DenseNet.docx
@@ -4143,7 +4143,7 @@
           <w:i/>
           <w:sz w:val="19"/>
         </w:rPr>
-        <w:t>los valores pooled provienen de la corrida de matrices de confusión y ROC (linear_probe_confmat_roc.py, misma configuración, reentrenada), por eso difieren levemente del F1 oficial (finetune_target_x2.py y experimento_dataset_mixto.py, 3_resultados/{trucha,rohu}/congelado_sinx2_resumen.csv). Los indicadores de robustez usan el F1 oficial.</w:t>
+        <w:t>los valores pooled provienen de la corrida de matrices de confusión y ROC (linear_probe_confmat_roc.py, misma configuración, reentrenada), por eso difieren levemente del F1 oficial (finetune_target_x2.py y experimento_rohu.py, 3_resultados/{trucha,rohu}/congelado_sinx2_resumen.csv). Los indicadores de robustez usan el F1 oficial.</w:t>
       </w:r>
     </w:p>
     <w:p>
@@ -8629,7 +8629,7 @@
           <w:i/>
           <w:sz w:val="19"/>
         </w:rPr>
-        <w:t>corrida de finetune_target_x2.py (Trucha) y experimento_dataset_mixto.py (Rohu): mismo método y semilla que la corrida de matrices de confusión, pero ejecutada aparte; por eso el F1 de cada fold difiere levemente del de las secciones 3.x. Logs: 2_logs/trucha_congelado_sinx2.log y 2_logs/rohu_congelado_sinx2.log.</w:t>
+        <w:t>corrida de finetune_target_x2.py (Trucha) y experimento_rohu.py (Rohu): mismo método y semilla que la corrida de matrices de confusión, pero ejecutada aparte; por eso el F1 de cada fold difiere levemente del de las secciones 3.x. Logs: 2_logs/trucha_congelado_sinx2.log y 2_logs/rohu_congelado_sinx2.log.</w:t>
       </w:r>
     </w:p>
     <w:p>
@@ -20431,7 +20431,7 @@
                 <w:b w:val="0"/>
                 <w:sz w:val="14"/>
               </w:rPr>
-              <w:t>1_codigo/finetune_target_x2.py, experimento_dataset_mixto.py, linear_probe_confmat_roc.py</w:t>
+              <w:t>1_codigo/finetune_target_x2.py, experimento_rohu.py, linear_probe_confmat_roc.py</w:t>
             </w:r>
           </w:p>
         </w:tc>

</xml_diff>

<commit_message>
Iguala la documentacion tecnica a la estructura de Mendeley
- Figura de flujo metodologico (7 etapas) al inicio de la seccion 1
- Arquitectura del sistema en 1.3 (generar_arquitectura_sistema.py, adaptado del de Mendeley)
- Subseccion 3.x.1 "Entrenamiento - val_F1 por epoch" con nota: la corrida presentada no registro val_F1 por epoch
- Anexo B. Glosario de terminos tecnicos

Co-Authored-By: Claude Opus 5.5 <noreply@anthropic.com>
Claude-Session: https://claude.ai/code/session_01H57NiR1mJmA9jsiQrmrPSF
</commit_message>
<xml_diff>
--- a/Documentacion_Tecnica_ViT_DenseNet.docx
+++ b/Documentacion_Tecnica_ViT_DenseNet.docx
@@ -70,381 +70,70 @@
       </w:r>
     </w:p>
     <w:p>
+      <w:r>
+        <w:rPr/>
+        <w:t>El experimento mide cuánto conservan ViT-Base/16 y DenseNet-121, entrenados sobre Mendeley (dominio fuente; ver Documentacion_Tecnica_10_Modelos.docx), al pasar a dos dominios objetivo: Trucha y Rohu.</w:t>
+      </w:r>
+    </w:p>
+    <w:p>
       <w:pPr>
         <w:keepNext/>
+        <w:jc w:val="center"/>
       </w:pPr>
       <w:r>
-        <w:rPr/>
-        <w:t>El experimento mide cuánto conservan ViT-Base/16 y DenseNet-121, entrenados sobre Mendeley (dominio fuente; ver Documentacion_Tecnica_10_Modelos.docx), al pasar a dos dominios objetivo: Trucha y Rohu. Cada etapa del flujo se documenta en una subsección: la etapa k corresponde a la sección 1.k.</w:t>
+        <w:drawing>
+          <wp:inline xmlns:a="http://schemas.openxmlformats.org/drawingml/2006/main" xmlns:pic="http://schemas.openxmlformats.org/drawingml/2006/picture">
+            <wp:extent cx="4320000" cy="4215866"/>
+            <wp:docPr id="1" name="Picture 1"/>
+            <wp:cNvGraphicFramePr>
+              <a:graphicFrameLocks noChangeAspect="1"/>
+            </wp:cNvGraphicFramePr>
+            <a:graphic>
+              <a:graphicData uri="http://schemas.openxmlformats.org/drawingml/2006/picture">
+                <pic:pic>
+                  <pic:nvPicPr>
+                    <pic:cNvPr id="0" name="flujo_metodologico.png"/>
+                    <pic:cNvPicPr/>
+                  </pic:nvPicPr>
+                  <pic:blipFill>
+                    <a:blip r:embed="rId9"/>
+                    <a:stretch>
+                      <a:fillRect/>
+                    </a:stretch>
+                  </pic:blipFill>
+                  <pic:spPr>
+                    <a:xfrm>
+                      <a:off x="0" y="0"/>
+                      <a:ext cx="4320000" cy="4215866"/>
+                    </a:xfrm>
+                    <a:prstGeom prst="rect"/>
+                  </pic:spPr>
+                </pic:pic>
+              </a:graphicData>
+            </a:graphic>
+          </wp:inline>
+        </w:drawing>
       </w:r>
     </w:p>
-    <w:tbl>
-      <w:tblPr>
-        <w:tblW w:type="pct" w:w="5000"/>
-        <w:tblLook w:firstColumn="1" w:firstRow="1" w:lastColumn="0" w:lastRow="0" w:noHBand="0" w:noVBand="1" w:val="04A0"/>
+    <w:p>
+      <w:pPr>
         <w:jc w:val="center"/>
-        <w:tblLayout w:type="fixed"/>
-        <w:tblCellMar>
-          <w:top w:w="45" w:type="dxa"/>
-          <w:bottom w:w="45" w:type="dxa"/>
-          <w:left w:w="70" w:type="dxa"/>
-          <w:right w:w="70" w:type="dxa"/>
-        </w:tblCellMar>
-      </w:tblPr>
-      <w:tblGrid>
-        <w:gridCol w:w="4989"/>
-        <w:gridCol w:w="3651"/>
-      </w:tblGrid>
-      <w:tr>
-        <w:trPr>
-          <w:cantSplit/>
-          <w:tblHeader/>
-        </w:trPr>
-        <w:tc>
-          <w:tcPr>
-            <w:tcW w:type="dxa" w:w="4989"/>
-            <w:shd w:val="clear" w:color="auto" w:fill="2A4D7A"/>
-            <w:vAlign w:val="center"/>
-          </w:tcPr>
-          <w:p>
-            <w:pPr>
-              <w:spacing w:before="0" w:after="0" w:line="240" w:lineRule="auto"/>
-              <w:jc w:val="center"/>
-            </w:pPr>
-            <w:r>
-              <w:rPr>
-                <w:b/>
-                <w:color w:val="FFFFFF"/>
-                <w:sz w:val="19"/>
-              </w:rPr>
-              <w:t>Etapa del flujo</w:t>
-            </w:r>
-          </w:p>
-        </w:tc>
-        <w:tc>
-          <w:tcPr>
-            <w:tcW w:type="dxa" w:w="3651"/>
-            <w:shd w:val="clear" w:color="auto" w:fill="2A4D7A"/>
-            <w:vAlign w:val="center"/>
-          </w:tcPr>
-          <w:p>
-            <w:pPr>
-              <w:spacing w:before="0" w:after="0" w:line="240" w:lineRule="auto"/>
-              <w:jc w:val="center"/>
-            </w:pPr>
-            <w:r>
-              <w:rPr>
-                <w:b/>
-                <w:color w:val="FFFFFF"/>
-                <w:sz w:val="19"/>
-              </w:rPr>
-              <w:t>Dónde se documenta</w:t>
-            </w:r>
-          </w:p>
-        </w:tc>
-      </w:tr>
-      <w:tr>
-        <w:trPr>
-          <w:cantSplit/>
-        </w:trPr>
-        <w:tc>
-          <w:tcPr>
-            <w:tcW w:type="dxa" w:w="4989"/>
-            <w:vAlign w:val="center"/>
-          </w:tcPr>
-          <w:p>
-            <w:pPr>
-              <w:spacing w:before="0" w:after="0" w:line="240" w:lineRule="auto"/>
-              <w:jc w:val="center"/>
-            </w:pPr>
-            <w:r>
-              <w:rPr>
-                <w:b w:val="0"/>
-                <w:sz w:val="19"/>
-              </w:rPr>
-              <w:t>1. Dominios objetivo y preparación de datos</w:t>
-            </w:r>
-          </w:p>
-        </w:tc>
-        <w:tc>
-          <w:tcPr>
-            <w:tcW w:type="dxa" w:w="3651"/>
-            <w:vAlign w:val="center"/>
-          </w:tcPr>
-          <w:p>
-            <w:pPr>
-              <w:spacing w:before="0" w:after="0" w:line="240" w:lineRule="auto"/>
-              <w:jc w:val="center"/>
-            </w:pPr>
-            <w:r>
-              <w:rPr>
-                <w:b w:val="0"/>
-                <w:sz w:val="19"/>
-              </w:rPr>
-              <w:t>1.1</w:t>
-            </w:r>
-          </w:p>
-        </w:tc>
-      </w:tr>
-      <w:tr>
-        <w:trPr>
-          <w:cantSplit/>
-        </w:trPr>
-        <w:tc>
-          <w:tcPr>
-            <w:tcW w:type="dxa" w:w="4989"/>
-            <w:vAlign w:val="center"/>
-          </w:tcPr>
-          <w:p>
-            <w:pPr>
-              <w:spacing w:before="0" w:after="0" w:line="240" w:lineRule="auto"/>
-              <w:jc w:val="center"/>
-            </w:pPr>
-            <w:r>
-              <w:rPr>
-                <w:b w:val="0"/>
-                <w:sz w:val="19"/>
-              </w:rPr>
-              <w:t>2. Validación cruzada 5-fold en cada dominio</w:t>
-            </w:r>
-          </w:p>
-        </w:tc>
-        <w:tc>
-          <w:tcPr>
-            <w:tcW w:type="dxa" w:w="3651"/>
-            <w:vAlign w:val="center"/>
-          </w:tcPr>
-          <w:p>
-            <w:pPr>
-              <w:spacing w:before="0" w:after="0" w:line="240" w:lineRule="auto"/>
-              <w:jc w:val="center"/>
-            </w:pPr>
-            <w:r>
-              <w:rPr>
-                <w:b w:val="0"/>
-                <w:sz w:val="19"/>
-              </w:rPr>
-              <w:t>1.2</w:t>
-            </w:r>
-          </w:p>
-        </w:tc>
-      </w:tr>
-      <w:tr>
-        <w:trPr>
-          <w:cantSplit/>
-        </w:trPr>
-        <w:tc>
-          <w:tcPr>
-            <w:tcW w:type="dxa" w:w="4989"/>
-            <w:vAlign w:val="center"/>
-          </w:tcPr>
-          <w:p>
-            <w:pPr>
-              <w:spacing w:before="0" w:after="0" w:line="240" w:lineRule="auto"/>
-              <w:jc w:val="center"/>
-            </w:pPr>
-            <w:r>
-              <w:rPr>
-                <w:b w:val="0"/>
-                <w:sz w:val="19"/>
-              </w:rPr>
-              <w:t>3. Configuración de los 2 modelos (congelado)</w:t>
-            </w:r>
-          </w:p>
-        </w:tc>
-        <w:tc>
-          <w:tcPr>
-            <w:tcW w:type="dxa" w:w="3651"/>
-            <w:vAlign w:val="center"/>
-          </w:tcPr>
-          <w:p>
-            <w:pPr>
-              <w:spacing w:before="0" w:after="0" w:line="240" w:lineRule="auto"/>
-              <w:jc w:val="center"/>
-            </w:pPr>
-            <w:r>
-              <w:rPr>
-                <w:b w:val="0"/>
-                <w:sz w:val="19"/>
-              </w:rPr>
-              <w:t>1.3</w:t>
-            </w:r>
-          </w:p>
-        </w:tc>
-      </w:tr>
-      <w:tr>
-        <w:trPr>
-          <w:cantSplit/>
-        </w:trPr>
-        <w:tc>
-          <w:tcPr>
-            <w:tcW w:type="dxa" w:w="4989"/>
-            <w:vAlign w:val="center"/>
-          </w:tcPr>
-          <w:p>
-            <w:pPr>
-              <w:spacing w:before="0" w:after="0" w:line="240" w:lineRule="auto"/>
-              <w:jc w:val="center"/>
-            </w:pPr>
-            <w:r>
-              <w:rPr>
-                <w:b w:val="0"/>
-                <w:sz w:val="19"/>
-              </w:rPr>
-              <w:t>4. Entrenamiento de la cabeza y selección del mejor epoch</w:t>
-            </w:r>
-          </w:p>
-        </w:tc>
-        <w:tc>
-          <w:tcPr>
-            <w:tcW w:type="dxa" w:w="3651"/>
-            <w:vAlign w:val="center"/>
-          </w:tcPr>
-          <w:p>
-            <w:pPr>
-              <w:spacing w:before="0" w:after="0" w:line="240" w:lineRule="auto"/>
-              <w:jc w:val="center"/>
-            </w:pPr>
-            <w:r>
-              <w:rPr>
-                <w:b w:val="0"/>
-                <w:sz w:val="19"/>
-              </w:rPr>
-              <w:t>1.4</w:t>
-            </w:r>
-          </w:p>
-        </w:tc>
-      </w:tr>
-      <w:tr>
-        <w:trPr>
-          <w:cantSplit/>
-        </w:trPr>
-        <w:tc>
-          <w:tcPr>
-            <w:tcW w:type="dxa" w:w="4989"/>
-            <w:vAlign w:val="center"/>
-          </w:tcPr>
-          <w:p>
-            <w:pPr>
-              <w:spacing w:before="0" w:after="0" w:line="240" w:lineRule="auto"/>
-              <w:jc w:val="center"/>
-            </w:pPr>
-            <w:r>
-              <w:rPr>
-                <w:b w:val="0"/>
-                <w:sz w:val="19"/>
-              </w:rPr>
-              <w:t>5. Evaluación por fold</w:t>
-            </w:r>
-          </w:p>
-        </w:tc>
-        <w:tc>
-          <w:tcPr>
-            <w:tcW w:type="dxa" w:w="3651"/>
-            <w:vAlign w:val="center"/>
-          </w:tcPr>
-          <w:p>
-            <w:pPr>
-              <w:spacing w:before="0" w:after="0" w:line="240" w:lineRule="auto"/>
-              <w:jc w:val="center"/>
-            </w:pPr>
-            <w:r>
-              <w:rPr>
-                <w:b w:val="0"/>
-                <w:sz w:val="19"/>
-              </w:rPr>
-              <w:t>1.5 y 3.x (resultados por fold)</w:t>
-            </w:r>
-          </w:p>
-        </w:tc>
-      </w:tr>
-      <w:tr>
-        <w:trPr>
-          <w:cantSplit/>
-        </w:trPr>
-        <w:tc>
-          <w:tcPr>
-            <w:tcW w:type="dxa" w:w="4989"/>
-            <w:vAlign w:val="center"/>
-          </w:tcPr>
-          <w:p>
-            <w:pPr>
-              <w:spacing w:before="0" w:after="0" w:line="240" w:lineRule="auto"/>
-              <w:jc w:val="center"/>
-            </w:pPr>
-            <w:r>
-              <w:rPr>
-                <w:b w:val="0"/>
-                <w:sz w:val="19"/>
-              </w:rPr>
-              <w:t>6. Consolidación OOF / pooled</w:t>
-            </w:r>
-          </w:p>
-        </w:tc>
-        <w:tc>
-          <w:tcPr>
-            <w:tcW w:type="dxa" w:w="3651"/>
-            <w:vAlign w:val="center"/>
-          </w:tcPr>
-          <w:p>
-            <w:pPr>
-              <w:spacing w:before="0" w:after="0" w:line="240" w:lineRule="auto"/>
-              <w:jc w:val="center"/>
-            </w:pPr>
-            <w:r>
-              <w:rPr>
-                <w:b w:val="0"/>
-                <w:sz w:val="19"/>
-              </w:rPr>
-              <w:t>1.6 y 3.x (resultado pooled)</w:t>
-            </w:r>
-          </w:p>
-        </w:tc>
-      </w:tr>
-      <w:tr>
-        <w:trPr>
-          <w:cantSplit/>
-        </w:trPr>
-        <w:tc>
-          <w:tcPr>
-            <w:tcW w:type="dxa" w:w="4989"/>
-            <w:vAlign w:val="center"/>
-          </w:tcPr>
-          <w:p>
-            <w:pPr>
-              <w:spacing w:before="0" w:after="0" w:line="240" w:lineRule="auto"/>
-              <w:jc w:val="center"/>
-            </w:pPr>
-            <w:r>
-              <w:rPr>
-                <w:b w:val="0"/>
-                <w:sz w:val="19"/>
-              </w:rPr>
-              <w:t>7. Comparación e indicadores de robustez (TRD, Gap, RBE)</w:t>
-            </w:r>
-          </w:p>
-        </w:tc>
-        <w:tc>
-          <w:tcPr>
-            <w:tcW w:type="dxa" w:w="3651"/>
-            <w:vAlign w:val="center"/>
-          </w:tcPr>
-          <w:p>
-            <w:pPr>
-              <w:spacing w:before="0" w:after="0" w:line="240" w:lineRule="auto"/>
-              <w:jc w:val="center"/>
-            </w:pPr>
-            <w:r>
-              <w:rPr>
-                <w:b w:val="0"/>
-                <w:sz w:val="19"/>
-              </w:rPr>
-              <w:t>1.7 y 2.6</w:t>
-            </w:r>
-          </w:p>
-        </w:tc>
-      </w:tr>
-    </w:tbl>
+      </w:pPr>
+      <w:r>
+        <w:rPr>
+          <w:i/>
+          <w:color w:val="666666"/>
+          <w:sz w:val="18"/>
+        </w:rPr>
+        <w:t>Flujo metodológico — generalización cross-dataset de ViT-Base/16 y DenseNet-121 (7 etapas, de la preparación de los dominios objetivo a los indicadores de robustez).</w:t>
+      </w:r>
+    </w:p>
+    <w:p>
+      <w:r>
+        <w:rPr/>
+        <w:t>Cada etapa del flujo se documenta en una subsección: la etapa k corresponde a la sección 1.k. El glosario de fórmulas está en la sección 2, el detalle por modelo y dominio en la sección 3 y el glosario de términos técnicos en el Anexo B.</w:t>
+      </w:r>
+    </w:p>
     <w:p>
       <w:pPr>
         <w:pStyle w:val="Heading2"/>
@@ -997,7 +686,64 @@
         <w:rPr>
           <w:b/>
         </w:rPr>
-        <w:t>Entorno de ejecución</w:t>
+        <w:t>Arquitectura del sistema y entorno de ejecución</w:t>
+      </w:r>
+    </w:p>
+    <w:p>
+      <w:r>
+        <w:rPr/>
+        <w:t>Flujo de datos entre las cuatro etapas del pipeline (ingesta, entrenamiento, evaluación y reportes) y los scripts que las ejecutan — desde las imágenes de Trucha y Rohu y los checkpoints de Mendeley hasta los resultados documentados.</w:t>
+      </w:r>
+    </w:p>
+    <w:p>
+      <w:pPr>
+        <w:keepNext/>
+        <w:jc w:val="center"/>
+      </w:pPr>
+      <w:r>
+        <w:drawing>
+          <wp:inline xmlns:a="http://schemas.openxmlformats.org/drawingml/2006/main" xmlns:pic="http://schemas.openxmlformats.org/drawingml/2006/picture">
+            <wp:extent cx="5760000" cy="3398857"/>
+            <wp:docPr id="2" name="Picture 2"/>
+            <wp:cNvGraphicFramePr>
+              <a:graphicFrameLocks noChangeAspect="1"/>
+            </wp:cNvGraphicFramePr>
+            <a:graphic>
+              <a:graphicData uri="http://schemas.openxmlformats.org/drawingml/2006/picture">
+                <pic:pic>
+                  <pic:nvPicPr>
+                    <pic:cNvPr id="0" name="arquitectura_sistema.png"/>
+                    <pic:cNvPicPr/>
+                  </pic:nvPicPr>
+                  <pic:blipFill>
+                    <a:blip r:embed="rId10"/>
+                    <a:stretch>
+                      <a:fillRect/>
+                    </a:stretch>
+                  </pic:blipFill>
+                  <pic:spPr>
+                    <a:xfrm>
+                      <a:off x="0" y="0"/>
+                      <a:ext cx="5760000" cy="3398857"/>
+                    </a:xfrm>
+                    <a:prstGeom prst="rect"/>
+                  </pic:spPr>
+                </pic:pic>
+              </a:graphicData>
+            </a:graphic>
+          </wp:inline>
+        </w:drawing>
+      </w:r>
+    </w:p>
+    <w:p>
+      <w:pPr>
+        <w:keepNext/>
+      </w:pPr>
+      <w:r>
+        <w:rPr>
+          <w:b/>
+        </w:rPr>
+        <w:t>Especificaciones técnicas del entorno de ejecución:</w:t>
       </w:r>
     </w:p>
     <w:tbl>
@@ -10823,7 +10569,30 @@
         <w:rPr>
           <w:color w:val="1F4E78"/>
         </w:rPr>
-        <w:t>3.1.1 Trucha — resultados por fold</w:t>
+        <w:t>3.1.1 Entrenamiento — val_F1 por epoch</w:t>
+      </w:r>
+    </w:p>
+    <w:p>
+      <w:r>
+        <w:rPr>
+          <w:b/>
+        </w:rPr>
+        <w:t xml:space="preserve">Nota. </w:t>
+      </w:r>
+      <w:r>
+        <w:rPr/>
+        <w:t>La corrida presentada no registró val_F1 por epoch: el código solo guardó las predicciones y métricas del mejor epoch de cada fold (con el número de epochs ejecutados, ver 1.4). Por eso esta subsección no incluye la gráfica de entrenamiento que sí tiene la documentación de Mendeley.</w:t>
+      </w:r>
+    </w:p>
+    <w:p>
+      <w:pPr>
+        <w:pStyle w:val="Heading3"/>
+      </w:pPr>
+      <w:r>
+        <w:rPr>
+          <w:color w:val="1F4E78"/>
+        </w:rPr>
+        <w:t>3.1.2 Trucha — resultados por fold</w:t>
       </w:r>
     </w:p>
     <w:p>
@@ -12206,7 +11975,7 @@
         <w:drawing>
           <wp:inline xmlns:a="http://schemas.openxmlformats.org/drawingml/2006/main" xmlns:pic="http://schemas.openxmlformats.org/drawingml/2006/picture">
             <wp:extent cx="5400000" cy="1242000"/>
-            <wp:docPr id="1" name="Picture 1"/>
+            <wp:docPr id="3" name="Picture 3"/>
             <wp:cNvGraphicFramePr>
               <a:graphicFrameLocks noChangeAspect="1"/>
             </wp:cNvGraphicFramePr>
@@ -12218,7 +11987,7 @@
                     <pic:cNvPicPr/>
                   </pic:nvPicPr>
                   <pic:blipFill>
-                    <a:blip r:embed="rId9"/>
+                    <a:blip r:embed="rId11"/>
                     <a:stretch>
                       <a:fillRect/>
                     </a:stretch>
@@ -12258,7 +12027,7 @@
         <w:rPr>
           <w:color w:val="1F4E78"/>
         </w:rPr>
-        <w:t>3.1.2 Trucha — curvas ROC por fold</w:t>
+        <w:t>3.1.3 Trucha — curvas ROC por fold</w:t>
       </w:r>
     </w:p>
     <w:p>
@@ -12312,7 +12081,7 @@
         <w:drawing>
           <wp:inline xmlns:a="http://schemas.openxmlformats.org/drawingml/2006/main" xmlns:pic="http://schemas.openxmlformats.org/drawingml/2006/picture">
             <wp:extent cx="3600000" cy="3600000"/>
-            <wp:docPr id="2" name="Picture 2"/>
+            <wp:docPr id="4" name="Picture 4"/>
             <wp:cNvGraphicFramePr>
               <a:graphicFrameLocks noChangeAspect="1"/>
             </wp:cNvGraphicFramePr>
@@ -12324,7 +12093,7 @@
                     <pic:cNvPicPr/>
                   </pic:nvPicPr>
                   <pic:blipFill>
-                    <a:blip r:embed="rId10"/>
+                    <a:blip r:embed="rId12"/>
                     <a:stretch>
                       <a:fillRect/>
                     </a:stretch>
@@ -12364,7 +12133,7 @@
         <w:rPr>
           <w:color w:val="1F4E78"/>
         </w:rPr>
-        <w:t>3.1.3 Trucha — resultado pooled, cómo se calculó cada número</w:t>
+        <w:t>3.1.4 Trucha — resultado pooled, cómo se calculó cada número</w:t>
       </w:r>
     </w:p>
     <w:p>
@@ -13106,7 +12875,7 @@
         <w:drawing>
           <wp:inline xmlns:a="http://schemas.openxmlformats.org/drawingml/2006/main" xmlns:pic="http://schemas.openxmlformats.org/drawingml/2006/picture">
             <wp:extent cx="2520000" cy="2520000"/>
-            <wp:docPr id="3" name="Picture 3"/>
+            <wp:docPr id="5" name="Picture 5"/>
             <wp:cNvGraphicFramePr>
               <a:graphicFrameLocks noChangeAspect="1"/>
             </wp:cNvGraphicFramePr>
@@ -13118,7 +12887,7 @@
                     <pic:cNvPicPr/>
                   </pic:nvPicPr>
                   <pic:blipFill>
-                    <a:blip r:embed="rId11"/>
+                    <a:blip r:embed="rId13"/>
                     <a:stretch>
                       <a:fillRect/>
                     </a:stretch>
@@ -13140,7 +12909,7 @@
         <w:drawing>
           <wp:inline xmlns:a="http://schemas.openxmlformats.org/drawingml/2006/main" xmlns:pic="http://schemas.openxmlformats.org/drawingml/2006/picture">
             <wp:extent cx="2520000" cy="2520000"/>
-            <wp:docPr id="4" name="Picture 4"/>
+            <wp:docPr id="6" name="Picture 6"/>
             <wp:cNvGraphicFramePr>
               <a:graphicFrameLocks noChangeAspect="1"/>
             </wp:cNvGraphicFramePr>
@@ -13152,7 +12921,7 @@
                     <pic:cNvPicPr/>
                   </pic:nvPicPr>
                   <pic:blipFill>
-                    <a:blip r:embed="rId12"/>
+                    <a:blip r:embed="rId14"/>
                     <a:stretch>
                       <a:fillRect/>
                     </a:stretch>
@@ -13192,7 +12961,7 @@
         <w:rPr>
           <w:color w:val="1F4E78"/>
         </w:rPr>
-        <w:t>3.1.4 Rohu — resultados por fold</w:t>
+        <w:t>3.1.5 Rohu — resultados por fold</w:t>
       </w:r>
     </w:p>
     <w:p>
@@ -14575,7 +14344,7 @@
         <w:drawing>
           <wp:inline xmlns:a="http://schemas.openxmlformats.org/drawingml/2006/main" xmlns:pic="http://schemas.openxmlformats.org/drawingml/2006/picture">
             <wp:extent cx="5400000" cy="1242000"/>
-            <wp:docPr id="5" name="Picture 5"/>
+            <wp:docPr id="7" name="Picture 7"/>
             <wp:cNvGraphicFramePr>
               <a:graphicFrameLocks noChangeAspect="1"/>
             </wp:cNvGraphicFramePr>
@@ -14587,7 +14356,7 @@
                     <pic:cNvPicPr/>
                   </pic:nvPicPr>
                   <pic:blipFill>
-                    <a:blip r:embed="rId13"/>
+                    <a:blip r:embed="rId15"/>
                     <a:stretch>
                       <a:fillRect/>
                     </a:stretch>
@@ -14627,7 +14396,7 @@
         <w:rPr>
           <w:color w:val="1F4E78"/>
         </w:rPr>
-        <w:t>3.1.5 Rohu — curvas ROC por fold</w:t>
+        <w:t>3.1.6 Rohu — curvas ROC por fold</w:t>
       </w:r>
     </w:p>
     <w:p>
@@ -14681,7 +14450,7 @@
         <w:drawing>
           <wp:inline xmlns:a="http://schemas.openxmlformats.org/drawingml/2006/main" xmlns:pic="http://schemas.openxmlformats.org/drawingml/2006/picture">
             <wp:extent cx="3600000" cy="3600000"/>
-            <wp:docPr id="6" name="Picture 6"/>
+            <wp:docPr id="8" name="Picture 8"/>
             <wp:cNvGraphicFramePr>
               <a:graphicFrameLocks noChangeAspect="1"/>
             </wp:cNvGraphicFramePr>
@@ -14693,7 +14462,7 @@
                     <pic:cNvPicPr/>
                   </pic:nvPicPr>
                   <pic:blipFill>
-                    <a:blip r:embed="rId14"/>
+                    <a:blip r:embed="rId16"/>
                     <a:stretch>
                       <a:fillRect/>
                     </a:stretch>
@@ -14733,7 +14502,7 @@
         <w:rPr>
           <w:color w:val="1F4E78"/>
         </w:rPr>
-        <w:t>3.1.6 Rohu — resultado pooled, cómo se calculó cada número</w:t>
+        <w:t>3.1.7 Rohu — resultado pooled, cómo se calculó cada número</w:t>
       </w:r>
     </w:p>
     <w:p>
@@ -15475,7 +15244,7 @@
         <w:drawing>
           <wp:inline xmlns:a="http://schemas.openxmlformats.org/drawingml/2006/main" xmlns:pic="http://schemas.openxmlformats.org/drawingml/2006/picture">
             <wp:extent cx="2520000" cy="2520000"/>
-            <wp:docPr id="7" name="Picture 7"/>
+            <wp:docPr id="9" name="Picture 9"/>
             <wp:cNvGraphicFramePr>
               <a:graphicFrameLocks noChangeAspect="1"/>
             </wp:cNvGraphicFramePr>
@@ -15487,7 +15256,7 @@
                     <pic:cNvPicPr/>
                   </pic:nvPicPr>
                   <pic:blipFill>
-                    <a:blip r:embed="rId15"/>
+                    <a:blip r:embed="rId17"/>
                     <a:stretch>
                       <a:fillRect/>
                     </a:stretch>
@@ -15509,7 +15278,7 @@
         <w:drawing>
           <wp:inline xmlns:a="http://schemas.openxmlformats.org/drawingml/2006/main" xmlns:pic="http://schemas.openxmlformats.org/drawingml/2006/picture">
             <wp:extent cx="2520000" cy="2520000"/>
-            <wp:docPr id="8" name="Picture 8"/>
+            <wp:docPr id="10" name="Picture 10"/>
             <wp:cNvGraphicFramePr>
               <a:graphicFrameLocks noChangeAspect="1"/>
             </wp:cNvGraphicFramePr>
@@ -15521,7 +15290,7 @@
                     <pic:cNvPicPr/>
                   </pic:nvPicPr>
                   <pic:blipFill>
-                    <a:blip r:embed="rId16"/>
+                    <a:blip r:embed="rId18"/>
                     <a:stretch>
                       <a:fillRect/>
                     </a:stretch>
@@ -15578,7 +15347,30 @@
         <w:rPr>
           <w:color w:val="1F4E78"/>
         </w:rPr>
-        <w:t>3.2.1 Trucha — resultados por fold</w:t>
+        <w:t>3.2.1 Entrenamiento — val_F1 por epoch</w:t>
+      </w:r>
+    </w:p>
+    <w:p>
+      <w:r>
+        <w:rPr>
+          <w:b/>
+        </w:rPr>
+        <w:t xml:space="preserve">Nota. </w:t>
+      </w:r>
+      <w:r>
+        <w:rPr/>
+        <w:t>La corrida presentada no registró val_F1 por epoch: el código solo guardó las predicciones y métricas del mejor epoch de cada fold (con el número de epochs ejecutados, ver 1.4). Por eso esta subsección no incluye la gráfica de entrenamiento que sí tiene la documentación de Mendeley.</w:t>
+      </w:r>
+    </w:p>
+    <w:p>
+      <w:pPr>
+        <w:pStyle w:val="Heading3"/>
+      </w:pPr>
+      <w:r>
+        <w:rPr>
+          <w:color w:val="1F4E78"/>
+        </w:rPr>
+        <w:t>3.2.2 Trucha — resultados por fold</w:t>
       </w:r>
     </w:p>
     <w:p>
@@ -16961,7 +16753,7 @@
         <w:drawing>
           <wp:inline xmlns:a="http://schemas.openxmlformats.org/drawingml/2006/main" xmlns:pic="http://schemas.openxmlformats.org/drawingml/2006/picture">
             <wp:extent cx="5400000" cy="1242000"/>
-            <wp:docPr id="9" name="Picture 9"/>
+            <wp:docPr id="11" name="Picture 11"/>
             <wp:cNvGraphicFramePr>
               <a:graphicFrameLocks noChangeAspect="1"/>
             </wp:cNvGraphicFramePr>
@@ -16973,7 +16765,7 @@
                     <pic:cNvPicPr/>
                   </pic:nvPicPr>
                   <pic:blipFill>
-                    <a:blip r:embed="rId17"/>
+                    <a:blip r:embed="rId19"/>
                     <a:stretch>
                       <a:fillRect/>
                     </a:stretch>
@@ -17013,7 +16805,7 @@
         <w:rPr>
           <w:color w:val="1F4E78"/>
         </w:rPr>
-        <w:t>3.2.2 Trucha — curvas ROC por fold</w:t>
+        <w:t>3.2.3 Trucha — curvas ROC por fold</w:t>
       </w:r>
     </w:p>
     <w:p>
@@ -17067,7 +16859,7 @@
         <w:drawing>
           <wp:inline xmlns:a="http://schemas.openxmlformats.org/drawingml/2006/main" xmlns:pic="http://schemas.openxmlformats.org/drawingml/2006/picture">
             <wp:extent cx="3600000" cy="3600000"/>
-            <wp:docPr id="10" name="Picture 10"/>
+            <wp:docPr id="12" name="Picture 12"/>
             <wp:cNvGraphicFramePr>
               <a:graphicFrameLocks noChangeAspect="1"/>
             </wp:cNvGraphicFramePr>
@@ -17079,7 +16871,7 @@
                     <pic:cNvPicPr/>
                   </pic:nvPicPr>
                   <pic:blipFill>
-                    <a:blip r:embed="rId18"/>
+                    <a:blip r:embed="rId20"/>
                     <a:stretch>
                       <a:fillRect/>
                     </a:stretch>
@@ -17119,7 +16911,7 @@
         <w:rPr>
           <w:color w:val="1F4E78"/>
         </w:rPr>
-        <w:t>3.2.3 Trucha — resultado pooled, cómo se calculó cada número</w:t>
+        <w:t>3.2.4 Trucha — resultado pooled, cómo se calculó cada número</w:t>
       </w:r>
     </w:p>
     <w:p>
@@ -17861,7 +17653,7 @@
         <w:drawing>
           <wp:inline xmlns:a="http://schemas.openxmlformats.org/drawingml/2006/main" xmlns:pic="http://schemas.openxmlformats.org/drawingml/2006/picture">
             <wp:extent cx="2520000" cy="2520000"/>
-            <wp:docPr id="11" name="Picture 11"/>
+            <wp:docPr id="13" name="Picture 13"/>
             <wp:cNvGraphicFramePr>
               <a:graphicFrameLocks noChangeAspect="1"/>
             </wp:cNvGraphicFramePr>
@@ -17873,7 +17665,7 @@
                     <pic:cNvPicPr/>
                   </pic:nvPicPr>
                   <pic:blipFill>
-                    <a:blip r:embed="rId19"/>
+                    <a:blip r:embed="rId21"/>
                     <a:stretch>
                       <a:fillRect/>
                     </a:stretch>
@@ -17895,7 +17687,7 @@
         <w:drawing>
           <wp:inline xmlns:a="http://schemas.openxmlformats.org/drawingml/2006/main" xmlns:pic="http://schemas.openxmlformats.org/drawingml/2006/picture">
             <wp:extent cx="2520000" cy="2520000"/>
-            <wp:docPr id="12" name="Picture 12"/>
+            <wp:docPr id="14" name="Picture 14"/>
             <wp:cNvGraphicFramePr>
               <a:graphicFrameLocks noChangeAspect="1"/>
             </wp:cNvGraphicFramePr>
@@ -17907,7 +17699,7 @@
                     <pic:cNvPicPr/>
                   </pic:nvPicPr>
                   <pic:blipFill>
-                    <a:blip r:embed="rId20"/>
+                    <a:blip r:embed="rId22"/>
                     <a:stretch>
                       <a:fillRect/>
                     </a:stretch>
@@ -17947,7 +17739,7 @@
         <w:rPr>
           <w:color w:val="1F4E78"/>
         </w:rPr>
-        <w:t>3.2.4 Rohu — resultados por fold</w:t>
+        <w:t>3.2.5 Rohu — resultados por fold</w:t>
       </w:r>
     </w:p>
     <w:p>
@@ -19330,7 +19122,7 @@
         <w:drawing>
           <wp:inline xmlns:a="http://schemas.openxmlformats.org/drawingml/2006/main" xmlns:pic="http://schemas.openxmlformats.org/drawingml/2006/picture">
             <wp:extent cx="5400000" cy="1242000"/>
-            <wp:docPr id="13" name="Picture 13"/>
+            <wp:docPr id="15" name="Picture 15"/>
             <wp:cNvGraphicFramePr>
               <a:graphicFrameLocks noChangeAspect="1"/>
             </wp:cNvGraphicFramePr>
@@ -19342,7 +19134,7 @@
                     <pic:cNvPicPr/>
                   </pic:nvPicPr>
                   <pic:blipFill>
-                    <a:blip r:embed="rId21"/>
+                    <a:blip r:embed="rId23"/>
                     <a:stretch>
                       <a:fillRect/>
                     </a:stretch>
@@ -19382,7 +19174,7 @@
         <w:rPr>
           <w:color w:val="1F4E78"/>
         </w:rPr>
-        <w:t>3.2.5 Rohu — curvas ROC por fold</w:t>
+        <w:t>3.2.6 Rohu — curvas ROC por fold</w:t>
       </w:r>
     </w:p>
     <w:p>
@@ -19436,7 +19228,7 @@
         <w:drawing>
           <wp:inline xmlns:a="http://schemas.openxmlformats.org/drawingml/2006/main" xmlns:pic="http://schemas.openxmlformats.org/drawingml/2006/picture">
             <wp:extent cx="3600000" cy="3600000"/>
-            <wp:docPr id="14" name="Picture 14"/>
+            <wp:docPr id="16" name="Picture 16"/>
             <wp:cNvGraphicFramePr>
               <a:graphicFrameLocks noChangeAspect="1"/>
             </wp:cNvGraphicFramePr>
@@ -19448,7 +19240,7 @@
                     <pic:cNvPicPr/>
                   </pic:nvPicPr>
                   <pic:blipFill>
-                    <a:blip r:embed="rId22"/>
+                    <a:blip r:embed="rId24"/>
                     <a:stretch>
                       <a:fillRect/>
                     </a:stretch>
@@ -19488,7 +19280,7 @@
         <w:rPr>
           <w:color w:val="1F4E78"/>
         </w:rPr>
-        <w:t>3.2.6 Rohu — resultado pooled, cómo se calculó cada número</w:t>
+        <w:t>3.2.7 Rohu — resultado pooled, cómo se calculó cada número</w:t>
       </w:r>
     </w:p>
     <w:p>
@@ -20230,7 +20022,7 @@
         <w:drawing>
           <wp:inline xmlns:a="http://schemas.openxmlformats.org/drawingml/2006/main" xmlns:pic="http://schemas.openxmlformats.org/drawingml/2006/picture">
             <wp:extent cx="2520000" cy="2520000"/>
-            <wp:docPr id="15" name="Picture 15"/>
+            <wp:docPr id="17" name="Picture 17"/>
             <wp:cNvGraphicFramePr>
               <a:graphicFrameLocks noChangeAspect="1"/>
             </wp:cNvGraphicFramePr>
@@ -20242,7 +20034,7 @@
                     <pic:cNvPicPr/>
                   </pic:nvPicPr>
                   <pic:blipFill>
-                    <a:blip r:embed="rId23"/>
+                    <a:blip r:embed="rId25"/>
                     <a:stretch>
                       <a:fillRect/>
                     </a:stretch>
@@ -20264,7 +20056,7 @@
         <w:drawing>
           <wp:inline xmlns:a="http://schemas.openxmlformats.org/drawingml/2006/main" xmlns:pic="http://schemas.openxmlformats.org/drawingml/2006/picture">
             <wp:extent cx="2520000" cy="2520000"/>
-            <wp:docPr id="16" name="Picture 16"/>
+            <wp:docPr id="18" name="Picture 18"/>
             <wp:cNvGraphicFramePr>
               <a:graphicFrameLocks noChangeAspect="1"/>
             </wp:cNvGraphicFramePr>
@@ -20276,7 +20068,7 @@
                     <pic:cNvPicPr/>
                   </pic:nvPicPr>
                   <pic:blipFill>
-                    <a:blip r:embed="rId24"/>
+                    <a:blip r:embed="rId26"/>
                     <a:stretch>
                       <a:fillRect/>
                     </a:stretch>
@@ -20690,6 +20482,2758 @@
                 <w:sz w:val="14"/>
               </w:rPr>
               <w:t>Mendeley_ViT_DenseNet/3_resultados_test_por_modelo/metricas_pooled_por_modelo.csv</w:t>
+            </w:r>
+          </w:p>
+        </w:tc>
+      </w:tr>
+    </w:tbl>
+    <w:p>
+      <w:pPr>
+        <w:pStyle w:val="Heading1"/>
+      </w:pPr>
+      <w:r>
+        <w:rPr>
+          <w:color w:val="1F4E78"/>
+        </w:rPr>
+        <w:t>Anexo B. Glosario de términos técnicos</w:t>
+      </w:r>
+    </w:p>
+    <w:p>
+      <w:pPr>
+        <w:keepNext/>
+      </w:pPr>
+      <w:r>
+        <w:rPr/>
+        <w:t>Términos técnicos usados en este documento, en orden alfabético. Las fórmulas de las métricas están en la sección 2.</w:t>
+      </w:r>
+    </w:p>
+    <w:tbl>
+      <w:tblPr>
+        <w:tblW w:type="pct" w:w="5000"/>
+        <w:tblLook w:firstColumn="1" w:firstRow="1" w:lastColumn="0" w:lastRow="0" w:noHBand="0" w:noVBand="1" w:val="04A0"/>
+        <w:jc w:val="center"/>
+        <w:tblLayout w:type="fixed"/>
+        <w:tblCellMar>
+          <w:top w:w="45" w:type="dxa"/>
+          <w:bottom w:w="45" w:type="dxa"/>
+          <w:left w:w="70" w:type="dxa"/>
+          <w:right w:w="70" w:type="dxa"/>
+        </w:tblCellMar>
+      </w:tblPr>
+      <w:tblGrid>
+        <w:gridCol w:w="4105"/>
+        <w:gridCol w:w="4535"/>
+      </w:tblGrid>
+      <w:tr>
+        <w:trPr>
+          <w:cantSplit/>
+          <w:tblHeader/>
+        </w:trPr>
+        <w:tc>
+          <w:tcPr>
+            <w:tcW w:type="dxa" w:w="4105"/>
+            <w:shd w:val="clear" w:color="auto" w:fill="2A4D7A"/>
+            <w:vAlign w:val="center"/>
+          </w:tcPr>
+          <w:p>
+            <w:pPr>
+              <w:spacing w:before="0" w:after="0" w:line="240" w:lineRule="auto"/>
+              <w:jc w:val="center"/>
+            </w:pPr>
+            <w:r>
+              <w:rPr>
+                <w:b/>
+                <w:color w:val="FFFFFF"/>
+                <w:sz w:val="19"/>
+              </w:rPr>
+              <w:t>Término</w:t>
+            </w:r>
+          </w:p>
+        </w:tc>
+        <w:tc>
+          <w:tcPr>
+            <w:tcW w:type="dxa" w:w="4535"/>
+            <w:shd w:val="clear" w:color="auto" w:fill="2A4D7A"/>
+            <w:vAlign w:val="center"/>
+          </w:tcPr>
+          <w:p>
+            <w:pPr>
+              <w:spacing w:before="0" w:after="0" w:line="240" w:lineRule="auto"/>
+              <w:jc w:val="center"/>
+            </w:pPr>
+            <w:r>
+              <w:rPr>
+                <w:b/>
+                <w:color w:val="FFFFFF"/>
+                <w:sz w:val="19"/>
+              </w:rPr>
+              <w:t>Definición</w:t>
+            </w:r>
+          </w:p>
+        </w:tc>
+      </w:tr>
+      <w:tr>
+        <w:trPr>
+          <w:cantSplit/>
+        </w:trPr>
+        <w:tc>
+          <w:tcPr>
+            <w:tcW w:type="dxa" w:w="4105"/>
+            <w:vAlign w:val="center"/>
+          </w:tcPr>
+          <w:p>
+            <w:pPr>
+              <w:spacing w:before="0" w:after="0" w:line="240" w:lineRule="auto"/>
+              <w:jc w:val="center"/>
+            </w:pPr>
+            <w:r>
+              <w:rPr>
+                <w:b w:val="0"/>
+                <w:sz w:val="19"/>
+              </w:rPr>
+              <w:t>Accuracy (exactitud)</w:t>
+            </w:r>
+          </w:p>
+        </w:tc>
+        <w:tc>
+          <w:tcPr>
+            <w:tcW w:type="dxa" w:w="4535"/>
+            <w:vAlign w:val="center"/>
+          </w:tcPr>
+          <w:p>
+            <w:pPr>
+              <w:spacing w:before="0" w:after="0" w:line="240" w:lineRule="auto"/>
+              <w:jc w:val="center"/>
+            </w:pPr>
+            <w:r>
+              <w:rPr>
+                <w:b w:val="0"/>
+                <w:sz w:val="19"/>
+              </w:rPr>
+              <w:t>Porcentaje de imágenes clasificadas correctamente sobre el total: (TP+TN)/total × 100.</w:t>
+            </w:r>
+          </w:p>
+        </w:tc>
+      </w:tr>
+      <w:tr>
+        <w:trPr>
+          <w:cantSplit/>
+        </w:trPr>
+        <w:tc>
+          <w:tcPr>
+            <w:tcW w:type="dxa" w:w="4105"/>
+            <w:vAlign w:val="center"/>
+          </w:tcPr>
+          <w:p>
+            <w:pPr>
+              <w:spacing w:before="0" w:after="0" w:line="240" w:lineRule="auto"/>
+              <w:jc w:val="center"/>
+            </w:pPr>
+            <w:r>
+              <w:rPr>
+                <w:b w:val="0"/>
+                <w:sz w:val="19"/>
+              </w:rPr>
+              <w:t>AdamW</w:t>
+            </w:r>
+          </w:p>
+        </w:tc>
+        <w:tc>
+          <w:tcPr>
+            <w:tcW w:type="dxa" w:w="4535"/>
+            <w:vAlign w:val="center"/>
+          </w:tcPr>
+          <w:p>
+            <w:pPr>
+              <w:spacing w:before="0" w:after="0" w:line="240" w:lineRule="auto"/>
+              <w:jc w:val="center"/>
+            </w:pPr>
+            <w:r>
+              <w:rPr>
+                <w:b w:val="0"/>
+                <w:sz w:val="19"/>
+              </w:rPr>
+              <w:t>Optimizador que ajusta los pesos con la regla de Adam y aplica el weight decay por separado del gradiente.</w:t>
+            </w:r>
+          </w:p>
+        </w:tc>
+      </w:tr>
+      <w:tr>
+        <w:trPr>
+          <w:cantSplit/>
+        </w:trPr>
+        <w:tc>
+          <w:tcPr>
+            <w:tcW w:type="dxa" w:w="4105"/>
+            <w:vAlign w:val="center"/>
+          </w:tcPr>
+          <w:p>
+            <w:pPr>
+              <w:spacing w:before="0" w:after="0" w:line="240" w:lineRule="auto"/>
+              <w:jc w:val="center"/>
+            </w:pPr>
+            <w:r>
+              <w:rPr>
+                <w:b w:val="0"/>
+                <w:sz w:val="19"/>
+              </w:rPr>
+              <w:t>AUC</w:t>
+            </w:r>
+          </w:p>
+        </w:tc>
+        <w:tc>
+          <w:tcPr>
+            <w:tcW w:type="dxa" w:w="4535"/>
+            <w:vAlign w:val="center"/>
+          </w:tcPr>
+          <w:p>
+            <w:pPr>
+              <w:spacing w:before="0" w:after="0" w:line="240" w:lineRule="auto"/>
+              <w:jc w:val="center"/>
+            </w:pPr>
+            <w:r>
+              <w:rPr>
+                <w:b w:val="0"/>
+                <w:sz w:val="19"/>
+              </w:rPr>
+              <w:t>Área bajo la curva ROC. Mide qué tan bien el modelo ordena las imágenes por probabilidad, sin depender de un umbral.</w:t>
+            </w:r>
+          </w:p>
+        </w:tc>
+      </w:tr>
+      <w:tr>
+        <w:trPr>
+          <w:cantSplit/>
+        </w:trPr>
+        <w:tc>
+          <w:tcPr>
+            <w:tcW w:type="dxa" w:w="4105"/>
+            <w:vAlign w:val="center"/>
+          </w:tcPr>
+          <w:p>
+            <w:pPr>
+              <w:spacing w:before="0" w:after="0" w:line="240" w:lineRule="auto"/>
+              <w:jc w:val="center"/>
+            </w:pPr>
+            <w:r>
+              <w:rPr>
+                <w:b w:val="0"/>
+                <w:sz w:val="19"/>
+              </w:rPr>
+              <w:t>Augmentación x2</w:t>
+            </w:r>
+          </w:p>
+        </w:tc>
+        <w:tc>
+          <w:tcPr>
+            <w:tcW w:type="dxa" w:w="4535"/>
+            <w:vAlign w:val="center"/>
+          </w:tcPr>
+          <w:p>
+            <w:pPr>
+              <w:spacing w:before="0" w:after="0" w:line="240" w:lineRule="auto"/>
+              <w:jc w:val="center"/>
+            </w:pPr>
+            <w:r>
+              <w:rPr>
+                <w:b w:val="0"/>
+                <w:sz w:val="19"/>
+              </w:rPr>
+              <w:t>Variante en la que cada imagen de entrenamiento aparece dos veces por epoch con transformaciones distintas. Este documento usa la corrida sin x2.</w:t>
+            </w:r>
+          </w:p>
+        </w:tc>
+      </w:tr>
+      <w:tr>
+        <w:trPr>
+          <w:cantSplit/>
+        </w:trPr>
+        <w:tc>
+          <w:tcPr>
+            <w:tcW w:type="dxa" w:w="4105"/>
+            <w:vAlign w:val="center"/>
+          </w:tcPr>
+          <w:p>
+            <w:pPr>
+              <w:spacing w:before="0" w:after="0" w:line="240" w:lineRule="auto"/>
+              <w:jc w:val="center"/>
+            </w:pPr>
+            <w:r>
+              <w:rPr>
+                <w:b w:val="0"/>
+                <w:sz w:val="19"/>
+              </w:rPr>
+              <w:t>Backbone</w:t>
+            </w:r>
+          </w:p>
+        </w:tc>
+        <w:tc>
+          <w:tcPr>
+            <w:tcW w:type="dxa" w:w="4535"/>
+            <w:vAlign w:val="center"/>
+          </w:tcPr>
+          <w:p>
+            <w:pPr>
+              <w:spacing w:before="0" w:after="0" w:line="240" w:lineRule="auto"/>
+              <w:jc w:val="center"/>
+            </w:pPr>
+            <w:r>
+              <w:rPr>
+                <w:b w:val="0"/>
+                <w:sz w:val="19"/>
+              </w:rPr>
+              <w:t>Parte de la red que extrae las características de la imagen; sobre ella va la cabeza de clasificación.</w:t>
+            </w:r>
+          </w:p>
+        </w:tc>
+      </w:tr>
+      <w:tr>
+        <w:trPr>
+          <w:cantSplit/>
+        </w:trPr>
+        <w:tc>
+          <w:tcPr>
+            <w:tcW w:type="dxa" w:w="4105"/>
+            <w:vAlign w:val="center"/>
+          </w:tcPr>
+          <w:p>
+            <w:pPr>
+              <w:spacing w:before="0" w:after="0" w:line="240" w:lineRule="auto"/>
+              <w:jc w:val="center"/>
+            </w:pPr>
+            <w:r>
+              <w:rPr>
+                <w:b w:val="0"/>
+                <w:sz w:val="19"/>
+              </w:rPr>
+              <w:t>Backbone congelado</w:t>
+            </w:r>
+          </w:p>
+        </w:tc>
+        <w:tc>
+          <w:tcPr>
+            <w:tcW w:type="dxa" w:w="4535"/>
+            <w:vAlign w:val="center"/>
+          </w:tcPr>
+          <w:p>
+            <w:pPr>
+              <w:spacing w:before="0" w:after="0" w:line="240" w:lineRule="auto"/>
+              <w:jc w:val="center"/>
+            </w:pPr>
+            <w:r>
+              <w:rPr>
+                <w:b w:val="0"/>
+                <w:sz w:val="19"/>
+              </w:rPr>
+              <w:t>Backbone con pesos fijos (sin gradiente) y en modo eval(); no cambia durante el entrenamiento en el dominio objetivo.</w:t>
+            </w:r>
+          </w:p>
+        </w:tc>
+      </w:tr>
+      <w:tr>
+        <w:trPr>
+          <w:cantSplit/>
+        </w:trPr>
+        <w:tc>
+          <w:tcPr>
+            <w:tcW w:type="dxa" w:w="4105"/>
+            <w:vAlign w:val="center"/>
+          </w:tcPr>
+          <w:p>
+            <w:pPr>
+              <w:spacing w:before="0" w:after="0" w:line="240" w:lineRule="auto"/>
+              <w:jc w:val="center"/>
+            </w:pPr>
+            <w:r>
+              <w:rPr>
+                <w:b w:val="0"/>
+                <w:sz w:val="19"/>
+              </w:rPr>
+              <w:t>Batch size</w:t>
+            </w:r>
+          </w:p>
+        </w:tc>
+        <w:tc>
+          <w:tcPr>
+            <w:tcW w:type="dxa" w:w="4535"/>
+            <w:vAlign w:val="center"/>
+          </w:tcPr>
+          <w:p>
+            <w:pPr>
+              <w:spacing w:before="0" w:after="0" w:line="240" w:lineRule="auto"/>
+              <w:jc w:val="center"/>
+            </w:pPr>
+            <w:r>
+              <w:rPr>
+                <w:b w:val="0"/>
+                <w:sz w:val="19"/>
+              </w:rPr>
+              <w:t>Cantidad de imágenes que el modelo procesa juntas antes de actualizar los pesos (8 en ViT-Base/16, 16 en DenseNet-121).</w:t>
+            </w:r>
+          </w:p>
+        </w:tc>
+      </w:tr>
+      <w:tr>
+        <w:trPr>
+          <w:cantSplit/>
+        </w:trPr>
+        <w:tc>
+          <w:tcPr>
+            <w:tcW w:type="dxa" w:w="4105"/>
+            <w:vAlign w:val="center"/>
+          </w:tcPr>
+          <w:p>
+            <w:pPr>
+              <w:spacing w:before="0" w:after="0" w:line="240" w:lineRule="auto"/>
+              <w:jc w:val="center"/>
+            </w:pPr>
+            <w:r>
+              <w:rPr>
+                <w:b w:val="0"/>
+                <w:sz w:val="19"/>
+              </w:rPr>
+              <w:t>BatchNorm</w:t>
+            </w:r>
+          </w:p>
+        </w:tc>
+        <w:tc>
+          <w:tcPr>
+            <w:tcW w:type="dxa" w:w="4535"/>
+            <w:vAlign w:val="center"/>
+          </w:tcPr>
+          <w:p>
+            <w:pPr>
+              <w:spacing w:before="0" w:after="0" w:line="240" w:lineRule="auto"/>
+              <w:jc w:val="center"/>
+            </w:pPr>
+            <w:r>
+              <w:rPr>
+                <w:b w:val="0"/>
+                <w:sz w:val="19"/>
+              </w:rPr>
+              <w:t>Capa que normaliza las activaciones con estadísticas de los datos; con el backbone en modo eval() esas estadísticas no se actualizan.</w:t>
+            </w:r>
+          </w:p>
+        </w:tc>
+      </w:tr>
+      <w:tr>
+        <w:trPr>
+          <w:cantSplit/>
+        </w:trPr>
+        <w:tc>
+          <w:tcPr>
+            <w:tcW w:type="dxa" w:w="4105"/>
+            <w:vAlign w:val="center"/>
+          </w:tcPr>
+          <w:p>
+            <w:pPr>
+              <w:spacing w:before="0" w:after="0" w:line="240" w:lineRule="auto"/>
+              <w:jc w:val="center"/>
+            </w:pPr>
+            <w:r>
+              <w:rPr>
+                <w:b w:val="0"/>
+                <w:sz w:val="19"/>
+              </w:rPr>
+              <w:t>Cabeza de clasificación</w:t>
+            </w:r>
+          </w:p>
+        </w:tc>
+        <w:tc>
+          <w:tcPr>
+            <w:tcW w:type="dxa" w:w="4535"/>
+            <w:vAlign w:val="center"/>
+          </w:tcPr>
+          <w:p>
+            <w:pPr>
+              <w:spacing w:before="0" w:after="0" w:line="240" w:lineRule="auto"/>
+              <w:jc w:val="center"/>
+            </w:pPr>
+            <w:r>
+              <w:rPr>
+                <w:b w:val="0"/>
+                <w:sz w:val="19"/>
+              </w:rPr>
+              <w:t>Última capa lineal del modelo, que convierte las características en las dos clases; es la única parte que se entrena aquí.</w:t>
+            </w:r>
+          </w:p>
+        </w:tc>
+      </w:tr>
+      <w:tr>
+        <w:trPr>
+          <w:cantSplit/>
+        </w:trPr>
+        <w:tc>
+          <w:tcPr>
+            <w:tcW w:type="dxa" w:w="4105"/>
+            <w:vAlign w:val="center"/>
+          </w:tcPr>
+          <w:p>
+            <w:pPr>
+              <w:spacing w:before="0" w:after="0" w:line="240" w:lineRule="auto"/>
+              <w:jc w:val="center"/>
+            </w:pPr>
+            <w:r>
+              <w:rPr>
+                <w:b w:val="0"/>
+                <w:sz w:val="19"/>
+              </w:rPr>
+              <w:t>Casi-duplicado</w:t>
+            </w:r>
+          </w:p>
+        </w:tc>
+        <w:tc>
+          <w:tcPr>
+            <w:tcW w:type="dxa" w:w="4535"/>
+            <w:vAlign w:val="center"/>
+          </w:tcPr>
+          <w:p>
+            <w:pPr>
+              <w:spacing w:before="0" w:after="0" w:line="240" w:lineRule="auto"/>
+              <w:jc w:val="center"/>
+            </w:pPr>
+            <w:r>
+              <w:rPr>
+                <w:b w:val="0"/>
+                <w:sz w:val="19"/>
+              </w:rPr>
+              <w:t>Foto prácticamente idéntica a otra (por ejemplo, tomada en ráfaga). Se detectan con detectar_duplicados.py y se mantienen en el mismo fold.</w:t>
+            </w:r>
+          </w:p>
+        </w:tc>
+      </w:tr>
+      <w:tr>
+        <w:trPr>
+          <w:cantSplit/>
+        </w:trPr>
+        <w:tc>
+          <w:tcPr>
+            <w:tcW w:type="dxa" w:w="4105"/>
+            <w:vAlign w:val="center"/>
+          </w:tcPr>
+          <w:p>
+            <w:pPr>
+              <w:spacing w:before="0" w:after="0" w:line="240" w:lineRule="auto"/>
+              <w:jc w:val="center"/>
+            </w:pPr>
+            <w:r>
+              <w:rPr>
+                <w:b w:val="0"/>
+                <w:sz w:val="19"/>
+              </w:rPr>
+              <w:t>Checkpoint</w:t>
+            </w:r>
+          </w:p>
+        </w:tc>
+        <w:tc>
+          <w:tcPr>
+            <w:tcW w:type="dxa" w:w="4535"/>
+            <w:vAlign w:val="center"/>
+          </w:tcPr>
+          <w:p>
+            <w:pPr>
+              <w:spacing w:before="0" w:after="0" w:line="240" w:lineRule="auto"/>
+              <w:jc w:val="center"/>
+            </w:pPr>
+            <w:r>
+              <w:rPr>
+                <w:b w:val="0"/>
+                <w:sz w:val="19"/>
+              </w:rPr>
+              <w:t>Archivo (.pt) con los pesos de un modelo. Aquí cada fold parte del checkpoint de Mendeley del mismo índice de fold.</w:t>
+            </w:r>
+          </w:p>
+        </w:tc>
+      </w:tr>
+      <w:tr>
+        <w:trPr>
+          <w:cantSplit/>
+        </w:trPr>
+        <w:tc>
+          <w:tcPr>
+            <w:tcW w:type="dxa" w:w="4105"/>
+            <w:vAlign w:val="center"/>
+          </w:tcPr>
+          <w:p>
+            <w:pPr>
+              <w:spacing w:before="0" w:after="0" w:line="240" w:lineRule="auto"/>
+              <w:jc w:val="center"/>
+            </w:pPr>
+            <w:r>
+              <w:rPr>
+                <w:b w:val="0"/>
+                <w:sz w:val="19"/>
+              </w:rPr>
+              <w:t>Clase positiva</w:t>
+            </w:r>
+          </w:p>
+        </w:tc>
+        <w:tc>
+          <w:tcPr>
+            <w:tcW w:type="dxa" w:w="4535"/>
+            <w:vAlign w:val="center"/>
+          </w:tcPr>
+          <w:p>
+            <w:pPr>
+              <w:spacing w:before="0" w:after="0" w:line="240" w:lineRule="auto"/>
+              <w:jc w:val="center"/>
+            </w:pPr>
+            <w:r>
+              <w:rPr>
+                <w:b w:val="0"/>
+                <w:sz w:val="19"/>
+              </w:rPr>
+              <w:t>Clase que se toma como referencia para contar TP, FP, FN y TN; en este documento es fresco, salvo cuando se indica lo contrario.</w:t>
+            </w:r>
+          </w:p>
+        </w:tc>
+      </w:tr>
+      <w:tr>
+        <w:trPr>
+          <w:cantSplit/>
+        </w:trPr>
+        <w:tc>
+          <w:tcPr>
+            <w:tcW w:type="dxa" w:w="4105"/>
+            <w:vAlign w:val="center"/>
+          </w:tcPr>
+          <w:p>
+            <w:pPr>
+              <w:spacing w:before="0" w:after="0" w:line="240" w:lineRule="auto"/>
+              <w:jc w:val="center"/>
+            </w:pPr>
+            <w:r>
+              <w:rPr>
+                <w:b w:val="0"/>
+                <w:sz w:val="19"/>
+              </w:rPr>
+              <w:t>CNN</w:t>
+            </w:r>
+          </w:p>
+        </w:tc>
+        <w:tc>
+          <w:tcPr>
+            <w:tcW w:type="dxa" w:w="4535"/>
+            <w:vAlign w:val="center"/>
+          </w:tcPr>
+          <w:p>
+            <w:pPr>
+              <w:spacing w:before="0" w:after="0" w:line="240" w:lineRule="auto"/>
+              <w:jc w:val="center"/>
+            </w:pPr>
+            <w:r>
+              <w:rPr>
+                <w:b w:val="0"/>
+                <w:sz w:val="19"/>
+              </w:rPr>
+              <w:t>Red neuronal convolucional: arquitectura que procesa la imagen con filtros locales (DenseNet-121).</w:t>
+            </w:r>
+          </w:p>
+        </w:tc>
+      </w:tr>
+      <w:tr>
+        <w:trPr>
+          <w:cantSplit/>
+        </w:trPr>
+        <w:tc>
+          <w:tcPr>
+            <w:tcW w:type="dxa" w:w="4105"/>
+            <w:vAlign w:val="center"/>
+          </w:tcPr>
+          <w:p>
+            <w:pPr>
+              <w:spacing w:before="0" w:after="0" w:line="240" w:lineRule="auto"/>
+              <w:jc w:val="center"/>
+            </w:pPr>
+            <w:r>
+              <w:rPr>
+                <w:b w:val="0"/>
+                <w:sz w:val="19"/>
+              </w:rPr>
+              <w:t>Cross-dataset</w:t>
+            </w:r>
+          </w:p>
+        </w:tc>
+        <w:tc>
+          <w:tcPr>
+            <w:tcW w:type="dxa" w:w="4535"/>
+            <w:vAlign w:val="center"/>
+          </w:tcPr>
+          <w:p>
+            <w:pPr>
+              <w:spacing w:before="0" w:after="0" w:line="240" w:lineRule="auto"/>
+              <w:jc w:val="center"/>
+            </w:pPr>
+            <w:r>
+              <w:rPr>
+                <w:b w:val="0"/>
+                <w:sz w:val="19"/>
+              </w:rPr>
+              <w:t>Evaluación de un modelo entrenado en un conjunto de datos sobre otro conjunto distinto.</w:t>
+            </w:r>
+          </w:p>
+        </w:tc>
+      </w:tr>
+      <w:tr>
+        <w:trPr>
+          <w:cantSplit/>
+        </w:trPr>
+        <w:tc>
+          <w:tcPr>
+            <w:tcW w:type="dxa" w:w="4105"/>
+            <w:vAlign w:val="center"/>
+          </w:tcPr>
+          <w:p>
+            <w:pPr>
+              <w:spacing w:before="0" w:after="0" w:line="240" w:lineRule="auto"/>
+              <w:jc w:val="center"/>
+            </w:pPr>
+            <w:r>
+              <w:rPr>
+                <w:b w:val="0"/>
+                <w:sz w:val="19"/>
+              </w:rPr>
+              <w:t>CrossEntropyLoss</w:t>
+            </w:r>
+          </w:p>
+        </w:tc>
+        <w:tc>
+          <w:tcPr>
+            <w:tcW w:type="dxa" w:w="4535"/>
+            <w:vAlign w:val="center"/>
+          </w:tcPr>
+          <w:p>
+            <w:pPr>
+              <w:spacing w:before="0" w:after="0" w:line="240" w:lineRule="auto"/>
+              <w:jc w:val="center"/>
+            </w:pPr>
+            <w:r>
+              <w:rPr>
+                <w:b w:val="0"/>
+                <w:sz w:val="19"/>
+              </w:rPr>
+              <w:t>Función de pérdida de clasificación que penaliza la probabilidad baja asignada a la clase correcta.</w:t>
+            </w:r>
+          </w:p>
+        </w:tc>
+      </w:tr>
+      <w:tr>
+        <w:trPr>
+          <w:cantSplit/>
+        </w:trPr>
+        <w:tc>
+          <w:tcPr>
+            <w:tcW w:type="dxa" w:w="4105"/>
+            <w:vAlign w:val="center"/>
+          </w:tcPr>
+          <w:p>
+            <w:pPr>
+              <w:spacing w:before="0" w:after="0" w:line="240" w:lineRule="auto"/>
+              <w:jc w:val="center"/>
+            </w:pPr>
+            <w:r>
+              <w:rPr>
+                <w:b w:val="0"/>
+                <w:sz w:val="19"/>
+              </w:rPr>
+              <w:t>Curva ROC</w:t>
+            </w:r>
+          </w:p>
+        </w:tc>
+        <w:tc>
+          <w:tcPr>
+            <w:tcW w:type="dxa" w:w="4535"/>
+            <w:vAlign w:val="center"/>
+          </w:tcPr>
+          <w:p>
+            <w:pPr>
+              <w:spacing w:before="0" w:after="0" w:line="240" w:lineRule="auto"/>
+              <w:jc w:val="center"/>
+            </w:pPr>
+            <w:r>
+              <w:rPr>
+                <w:b w:val="0"/>
+                <w:sz w:val="19"/>
+              </w:rPr>
+              <w:t>Gráfica de la tasa de verdaderos positivos frente a la de falsos positivos para todos los umbrales posibles.</w:t>
+            </w:r>
+          </w:p>
+        </w:tc>
+      </w:tr>
+      <w:tr>
+        <w:trPr>
+          <w:cantSplit/>
+        </w:trPr>
+        <w:tc>
+          <w:tcPr>
+            <w:tcW w:type="dxa" w:w="4105"/>
+            <w:vAlign w:val="center"/>
+          </w:tcPr>
+          <w:p>
+            <w:pPr>
+              <w:spacing w:before="0" w:after="0" w:line="240" w:lineRule="auto"/>
+              <w:jc w:val="center"/>
+            </w:pPr>
+            <w:r>
+              <w:rPr>
+                <w:b w:val="0"/>
+                <w:sz w:val="19"/>
+              </w:rPr>
+              <w:t>Data augmentation</w:t>
+            </w:r>
+          </w:p>
+        </w:tc>
+        <w:tc>
+          <w:tcPr>
+            <w:tcW w:type="dxa" w:w="4535"/>
+            <w:vAlign w:val="center"/>
+          </w:tcPr>
+          <w:p>
+            <w:pPr>
+              <w:spacing w:before="0" w:after="0" w:line="240" w:lineRule="auto"/>
+              <w:jc w:val="center"/>
+            </w:pPr>
+            <w:r>
+              <w:rPr>
+                <w:b w:val="0"/>
+                <w:sz w:val="19"/>
+              </w:rPr>
+              <w:t>Transformaciones aleatorias aplicadas solo a las imágenes de entrenamiento (recorte, volteo, color, blur, rotación, erasing).</w:t>
+            </w:r>
+          </w:p>
+        </w:tc>
+      </w:tr>
+      <w:tr>
+        <w:trPr>
+          <w:cantSplit/>
+        </w:trPr>
+        <w:tc>
+          <w:tcPr>
+            <w:tcW w:type="dxa" w:w="4105"/>
+            <w:vAlign w:val="center"/>
+          </w:tcPr>
+          <w:p>
+            <w:pPr>
+              <w:spacing w:before="0" w:after="0" w:line="240" w:lineRule="auto"/>
+              <w:jc w:val="center"/>
+            </w:pPr>
+            <w:r>
+              <w:rPr>
+                <w:b w:val="0"/>
+                <w:sz w:val="19"/>
+              </w:rPr>
+              <w:t>Desviación estándar muestral</w:t>
+            </w:r>
+          </w:p>
+        </w:tc>
+        <w:tc>
+          <w:tcPr>
+            <w:tcW w:type="dxa" w:w="4535"/>
+            <w:vAlign w:val="center"/>
+          </w:tcPr>
+          <w:p>
+            <w:pPr>
+              <w:spacing w:before="0" w:after="0" w:line="240" w:lineRule="auto"/>
+              <w:jc w:val="center"/>
+            </w:pPr>
+            <w:r>
+              <w:rPr>
+                <w:b w:val="0"/>
+                <w:sz w:val="19"/>
+              </w:rPr>
+              <w:t>Medida de dispersión de los 5 F1 de fold, calculada con n − 1 en el denominador. Un valor bajo indica un modelo estable.</w:t>
+            </w:r>
+          </w:p>
+        </w:tc>
+      </w:tr>
+      <w:tr>
+        <w:trPr>
+          <w:cantSplit/>
+        </w:trPr>
+        <w:tc>
+          <w:tcPr>
+            <w:tcW w:type="dxa" w:w="4105"/>
+            <w:vAlign w:val="center"/>
+          </w:tcPr>
+          <w:p>
+            <w:pPr>
+              <w:spacing w:before="0" w:after="0" w:line="240" w:lineRule="auto"/>
+              <w:jc w:val="center"/>
+            </w:pPr>
+            <w:r>
+              <w:rPr>
+                <w:b w:val="0"/>
+                <w:sz w:val="19"/>
+              </w:rPr>
+              <w:t>Dominio fuente</w:t>
+            </w:r>
+          </w:p>
+        </w:tc>
+        <w:tc>
+          <w:tcPr>
+            <w:tcW w:type="dxa" w:w="4535"/>
+            <w:vAlign w:val="center"/>
+          </w:tcPr>
+          <w:p>
+            <w:pPr>
+              <w:spacing w:before="0" w:after="0" w:line="240" w:lineRule="auto"/>
+              <w:jc w:val="center"/>
+            </w:pPr>
+            <w:r>
+              <w:rPr>
+                <w:b w:val="0"/>
+                <w:sz w:val="19"/>
+              </w:rPr>
+              <w:t>Conjunto con el que se entrenaron los modelos base: Mendeley (8,000 imágenes).</w:t>
+            </w:r>
+          </w:p>
+        </w:tc>
+      </w:tr>
+      <w:tr>
+        <w:trPr>
+          <w:cantSplit/>
+        </w:trPr>
+        <w:tc>
+          <w:tcPr>
+            <w:tcW w:type="dxa" w:w="4105"/>
+            <w:vAlign w:val="center"/>
+          </w:tcPr>
+          <w:p>
+            <w:pPr>
+              <w:spacing w:before="0" w:after="0" w:line="240" w:lineRule="auto"/>
+              <w:jc w:val="center"/>
+            </w:pPr>
+            <w:r>
+              <w:rPr>
+                <w:b w:val="0"/>
+                <w:sz w:val="19"/>
+              </w:rPr>
+              <w:t>Dominio objetivo</w:t>
+            </w:r>
+          </w:p>
+        </w:tc>
+        <w:tc>
+          <w:tcPr>
+            <w:tcW w:type="dxa" w:w="4535"/>
+            <w:vAlign w:val="center"/>
+          </w:tcPr>
+          <w:p>
+            <w:pPr>
+              <w:spacing w:before="0" w:after="0" w:line="240" w:lineRule="auto"/>
+              <w:jc w:val="center"/>
+            </w:pPr>
+            <w:r>
+              <w:rPr>
+                <w:b w:val="0"/>
+                <w:sz w:val="19"/>
+              </w:rPr>
+              <w:t>Conjunto nuevo al que se transfiere el modelo: Trucha o Rohu.</w:t>
+            </w:r>
+          </w:p>
+        </w:tc>
+      </w:tr>
+      <w:tr>
+        <w:trPr>
+          <w:cantSplit/>
+        </w:trPr>
+        <w:tc>
+          <w:tcPr>
+            <w:tcW w:type="dxa" w:w="4105"/>
+            <w:vAlign w:val="center"/>
+          </w:tcPr>
+          <w:p>
+            <w:pPr>
+              <w:spacing w:before="0" w:after="0" w:line="240" w:lineRule="auto"/>
+              <w:jc w:val="center"/>
+            </w:pPr>
+            <w:r>
+              <w:rPr>
+                <w:b w:val="0"/>
+                <w:sz w:val="19"/>
+              </w:rPr>
+              <w:t>Early stopping</w:t>
+            </w:r>
+          </w:p>
+        </w:tc>
+        <w:tc>
+          <w:tcPr>
+            <w:tcW w:type="dxa" w:w="4535"/>
+            <w:vAlign w:val="center"/>
+          </w:tcPr>
+          <w:p>
+            <w:pPr>
+              <w:spacing w:before="0" w:after="0" w:line="240" w:lineRule="auto"/>
+              <w:jc w:val="center"/>
+            </w:pPr>
+            <w:r>
+              <w:rPr>
+                <w:b w:val="0"/>
+                <w:sz w:val="19"/>
+              </w:rPr>
+              <w:t>Regla que detiene el entrenamiento cuando val_F1 no mejora durante un número de epochs (paciencia = 8).</w:t>
+            </w:r>
+          </w:p>
+        </w:tc>
+      </w:tr>
+      <w:tr>
+        <w:trPr>
+          <w:cantSplit/>
+        </w:trPr>
+        <w:tc>
+          <w:tcPr>
+            <w:tcW w:type="dxa" w:w="4105"/>
+            <w:vAlign w:val="center"/>
+          </w:tcPr>
+          <w:p>
+            <w:pPr>
+              <w:spacing w:before="0" w:after="0" w:line="240" w:lineRule="auto"/>
+              <w:jc w:val="center"/>
+            </w:pPr>
+            <w:r>
+              <w:rPr>
+                <w:b w:val="0"/>
+                <w:sz w:val="19"/>
+              </w:rPr>
+              <w:t>Epoch</w:t>
+            </w:r>
+          </w:p>
+        </w:tc>
+        <w:tc>
+          <w:tcPr>
+            <w:tcW w:type="dxa" w:w="4535"/>
+            <w:vAlign w:val="center"/>
+          </w:tcPr>
+          <w:p>
+            <w:pPr>
+              <w:spacing w:before="0" w:after="0" w:line="240" w:lineRule="auto"/>
+              <w:jc w:val="center"/>
+            </w:pPr>
+            <w:r>
+              <w:rPr>
+                <w:b w:val="0"/>
+                <w:sz w:val="19"/>
+              </w:rPr>
+              <w:t>Una pasada completa del modelo por todas las imágenes de entrenamiento.</w:t>
+            </w:r>
+          </w:p>
+        </w:tc>
+      </w:tr>
+      <w:tr>
+        <w:trPr>
+          <w:cantSplit/>
+        </w:trPr>
+        <w:tc>
+          <w:tcPr>
+            <w:tcW w:type="dxa" w:w="4105"/>
+            <w:vAlign w:val="center"/>
+          </w:tcPr>
+          <w:p>
+            <w:pPr>
+              <w:spacing w:before="0" w:after="0" w:line="240" w:lineRule="auto"/>
+              <w:jc w:val="center"/>
+            </w:pPr>
+            <w:r>
+              <w:rPr>
+                <w:b w:val="0"/>
+                <w:sz w:val="19"/>
+              </w:rPr>
+              <w:t>Especificidad</w:t>
+            </w:r>
+          </w:p>
+        </w:tc>
+        <w:tc>
+          <w:tcPr>
+            <w:tcW w:type="dxa" w:w="4535"/>
+            <w:vAlign w:val="center"/>
+          </w:tcPr>
+          <w:p>
+            <w:pPr>
+              <w:spacing w:before="0" w:after="0" w:line="240" w:lineRule="auto"/>
+              <w:jc w:val="center"/>
+            </w:pPr>
+            <w:r>
+              <w:rPr>
+                <w:b w:val="0"/>
+                <w:sz w:val="19"/>
+              </w:rPr>
+              <w:t>De las imágenes que no son de la clase evaluada, porcentaje que el modelo descartó correctamente: TN/(TN+FP) × 100.</w:t>
+            </w:r>
+          </w:p>
+        </w:tc>
+      </w:tr>
+      <w:tr>
+        <w:trPr>
+          <w:cantSplit/>
+        </w:trPr>
+        <w:tc>
+          <w:tcPr>
+            <w:tcW w:type="dxa" w:w="4105"/>
+            <w:vAlign w:val="center"/>
+          </w:tcPr>
+          <w:p>
+            <w:pPr>
+              <w:spacing w:before="0" w:after="0" w:line="240" w:lineRule="auto"/>
+              <w:jc w:val="center"/>
+            </w:pPr>
+            <w:r>
+              <w:rPr>
+                <w:b w:val="0"/>
+                <w:sz w:val="19"/>
+              </w:rPr>
+              <w:t>F1 macro</w:t>
+            </w:r>
+          </w:p>
+        </w:tc>
+        <w:tc>
+          <w:tcPr>
+            <w:tcW w:type="dxa" w:w="4535"/>
+            <w:vAlign w:val="center"/>
+          </w:tcPr>
+          <w:p>
+            <w:pPr>
+              <w:spacing w:before="0" w:after="0" w:line="240" w:lineRule="auto"/>
+              <w:jc w:val="center"/>
+            </w:pPr>
+            <w:r>
+              <w:rPr>
+                <w:b w:val="0"/>
+                <w:sz w:val="19"/>
+              </w:rPr>
+              <w:t>Promedio simple del F1 de las dos clases (fresco y no_fresco). Es la métrica principal de este documento.</w:t>
+            </w:r>
+          </w:p>
+        </w:tc>
+      </w:tr>
+      <w:tr>
+        <w:trPr>
+          <w:cantSplit/>
+        </w:trPr>
+        <w:tc>
+          <w:tcPr>
+            <w:tcW w:type="dxa" w:w="4105"/>
+            <w:vAlign w:val="center"/>
+          </w:tcPr>
+          <w:p>
+            <w:pPr>
+              <w:spacing w:before="0" w:after="0" w:line="240" w:lineRule="auto"/>
+              <w:jc w:val="center"/>
+            </w:pPr>
+            <w:r>
+              <w:rPr>
+                <w:b w:val="0"/>
+                <w:sz w:val="19"/>
+              </w:rPr>
+              <w:t>F1-Score</w:t>
+            </w:r>
+          </w:p>
+        </w:tc>
+        <w:tc>
+          <w:tcPr>
+            <w:tcW w:type="dxa" w:w="4535"/>
+            <w:vAlign w:val="center"/>
+          </w:tcPr>
+          <w:p>
+            <w:pPr>
+              <w:spacing w:before="0" w:after="0" w:line="240" w:lineRule="auto"/>
+              <w:jc w:val="center"/>
+            </w:pPr>
+            <w:r>
+              <w:rPr>
+                <w:b w:val="0"/>
+                <w:sz w:val="19"/>
+              </w:rPr>
+              <w:t>Media armónica de Precisión y Recall de una clase: 2 × P × R / (P + R).</w:t>
+            </w:r>
+          </w:p>
+        </w:tc>
+      </w:tr>
+      <w:tr>
+        <w:trPr>
+          <w:cantSplit/>
+        </w:trPr>
+        <w:tc>
+          <w:tcPr>
+            <w:tcW w:type="dxa" w:w="4105"/>
+            <w:vAlign w:val="center"/>
+          </w:tcPr>
+          <w:p>
+            <w:pPr>
+              <w:spacing w:before="0" w:after="0" w:line="240" w:lineRule="auto"/>
+              <w:jc w:val="center"/>
+            </w:pPr>
+            <w:r>
+              <w:rPr>
+                <w:b w:val="0"/>
+                <w:sz w:val="19"/>
+              </w:rPr>
+              <w:t>FN (falso negativo)</w:t>
+            </w:r>
+          </w:p>
+        </w:tc>
+        <w:tc>
+          <w:tcPr>
+            <w:tcW w:type="dxa" w:w="4535"/>
+            <w:vAlign w:val="center"/>
+          </w:tcPr>
+          <w:p>
+            <w:pPr>
+              <w:spacing w:before="0" w:after="0" w:line="240" w:lineRule="auto"/>
+              <w:jc w:val="center"/>
+            </w:pPr>
+            <w:r>
+              <w:rPr>
+                <w:b w:val="0"/>
+                <w:sz w:val="19"/>
+              </w:rPr>
+              <w:t>Imagen de la clase evaluada que el modelo asignó a la otra clase.</w:t>
+            </w:r>
+          </w:p>
+        </w:tc>
+      </w:tr>
+      <w:tr>
+        <w:trPr>
+          <w:cantSplit/>
+        </w:trPr>
+        <w:tc>
+          <w:tcPr>
+            <w:tcW w:type="dxa" w:w="4105"/>
+            <w:vAlign w:val="center"/>
+          </w:tcPr>
+          <w:p>
+            <w:pPr>
+              <w:spacing w:before="0" w:after="0" w:line="240" w:lineRule="auto"/>
+              <w:jc w:val="center"/>
+            </w:pPr>
+            <w:r>
+              <w:rPr>
+                <w:b w:val="0"/>
+                <w:sz w:val="19"/>
+              </w:rPr>
+              <w:t>Fold</w:t>
+            </w:r>
+          </w:p>
+        </w:tc>
+        <w:tc>
+          <w:tcPr>
+            <w:tcW w:type="dxa" w:w="4535"/>
+            <w:vAlign w:val="center"/>
+          </w:tcPr>
+          <w:p>
+            <w:pPr>
+              <w:spacing w:before="0" w:after="0" w:line="240" w:lineRule="auto"/>
+              <w:jc w:val="center"/>
+            </w:pPr>
+            <w:r>
+              <w:rPr>
+                <w:b w:val="0"/>
+                <w:sz w:val="19"/>
+              </w:rPr>
+              <w:t>Cada una de las 5 particiones de un dominio. En la corrida k, el fold k se evalúa y los otros 4 entrenan la cabeza.</w:t>
+            </w:r>
+          </w:p>
+        </w:tc>
+      </w:tr>
+      <w:tr>
+        <w:trPr>
+          <w:cantSplit/>
+        </w:trPr>
+        <w:tc>
+          <w:tcPr>
+            <w:tcW w:type="dxa" w:w="4105"/>
+            <w:vAlign w:val="center"/>
+          </w:tcPr>
+          <w:p>
+            <w:pPr>
+              <w:spacing w:before="0" w:after="0" w:line="240" w:lineRule="auto"/>
+              <w:jc w:val="center"/>
+            </w:pPr>
+            <w:r>
+              <w:rPr>
+                <w:b w:val="0"/>
+                <w:sz w:val="19"/>
+              </w:rPr>
+              <w:t>FP (falso positivo)</w:t>
+            </w:r>
+          </w:p>
+        </w:tc>
+        <w:tc>
+          <w:tcPr>
+            <w:tcW w:type="dxa" w:w="4535"/>
+            <w:vAlign w:val="center"/>
+          </w:tcPr>
+          <w:p>
+            <w:pPr>
+              <w:spacing w:before="0" w:after="0" w:line="240" w:lineRule="auto"/>
+              <w:jc w:val="center"/>
+            </w:pPr>
+            <w:r>
+              <w:rPr>
+                <w:b w:val="0"/>
+                <w:sz w:val="19"/>
+              </w:rPr>
+              <w:t>Imagen de la otra clase que el modelo asignó a la clase evaluada.</w:t>
+            </w:r>
+          </w:p>
+        </w:tc>
+      </w:tr>
+      <w:tr>
+        <w:trPr>
+          <w:cantSplit/>
+        </w:trPr>
+        <w:tc>
+          <w:tcPr>
+            <w:tcW w:type="dxa" w:w="4105"/>
+            <w:vAlign w:val="center"/>
+          </w:tcPr>
+          <w:p>
+            <w:pPr>
+              <w:spacing w:before="0" w:after="0" w:line="240" w:lineRule="auto"/>
+              <w:jc w:val="center"/>
+            </w:pPr>
+            <w:r>
+              <w:rPr>
+                <w:b w:val="0"/>
+                <w:sz w:val="19"/>
+              </w:rPr>
+              <w:t>Fuga de información</w:t>
+            </w:r>
+          </w:p>
+        </w:tc>
+        <w:tc>
+          <w:tcPr>
+            <w:tcW w:type="dxa" w:w="4535"/>
+            <w:vAlign w:val="center"/>
+          </w:tcPr>
+          <w:p>
+            <w:pPr>
+              <w:spacing w:before="0" w:after="0" w:line="240" w:lineRule="auto"/>
+              <w:jc w:val="center"/>
+            </w:pPr>
+            <w:r>
+              <w:rPr>
+                <w:b w:val="0"/>
+                <w:sz w:val="19"/>
+              </w:rPr>
+              <w:t>Situación en la que datos de evaluación influyen en el entrenamiento, lo que infla las métricas; los grupos de casi-duplicados la evitan.</w:t>
+            </w:r>
+          </w:p>
+        </w:tc>
+      </w:tr>
+      <w:tr>
+        <w:trPr>
+          <w:cantSplit/>
+        </w:trPr>
+        <w:tc>
+          <w:tcPr>
+            <w:tcW w:type="dxa" w:w="4105"/>
+            <w:vAlign w:val="center"/>
+          </w:tcPr>
+          <w:p>
+            <w:pPr>
+              <w:spacing w:before="0" w:after="0" w:line="240" w:lineRule="auto"/>
+              <w:jc w:val="center"/>
+            </w:pPr>
+            <w:r>
+              <w:rPr>
+                <w:b w:val="0"/>
+                <w:sz w:val="19"/>
+              </w:rPr>
+              <w:t>Gap (brecha de error)</w:t>
+            </w:r>
+          </w:p>
+        </w:tc>
+        <w:tc>
+          <w:tcPr>
+            <w:tcW w:type="dxa" w:w="4535"/>
+            <w:vAlign w:val="center"/>
+          </w:tcPr>
+          <w:p>
+            <w:pPr>
+              <w:spacing w:before="0" w:after="0" w:line="240" w:lineRule="auto"/>
+              <w:jc w:val="center"/>
+            </w:pPr>
+            <w:r>
+              <w:rPr>
+                <w:b w:val="0"/>
+                <w:sz w:val="19"/>
+              </w:rPr>
+              <w:t>Aumento del error al pasar del dominio fuente al objetivo: Error_objetivo − Error_fuente (ver 2.6).</w:t>
+            </w:r>
+          </w:p>
+        </w:tc>
+      </w:tr>
+      <w:tr>
+        <w:trPr>
+          <w:cantSplit/>
+        </w:trPr>
+        <w:tc>
+          <w:tcPr>
+            <w:tcW w:type="dxa" w:w="4105"/>
+            <w:vAlign w:val="center"/>
+          </w:tcPr>
+          <w:p>
+            <w:pPr>
+              <w:spacing w:before="0" w:after="0" w:line="240" w:lineRule="auto"/>
+              <w:jc w:val="center"/>
+            </w:pPr>
+            <w:r>
+              <w:rPr>
+                <w:b w:val="0"/>
+                <w:sz w:val="19"/>
+              </w:rPr>
+              <w:t>ImageNet</w:t>
+            </w:r>
+          </w:p>
+        </w:tc>
+        <w:tc>
+          <w:tcPr>
+            <w:tcW w:type="dxa" w:w="4535"/>
+            <w:vAlign w:val="center"/>
+          </w:tcPr>
+          <w:p>
+            <w:pPr>
+              <w:spacing w:before="0" w:after="0" w:line="240" w:lineRule="auto"/>
+              <w:jc w:val="center"/>
+            </w:pPr>
+            <w:r>
+              <w:rPr>
+                <w:b w:val="0"/>
+                <w:sz w:val="19"/>
+              </w:rPr>
+              <w:t>Conjunto de imágenes de referencia con el que se preentrenan los modelos; también define la normalización de las imágenes.</w:t>
+            </w:r>
+          </w:p>
+        </w:tc>
+      </w:tr>
+      <w:tr>
+        <w:trPr>
+          <w:cantSplit/>
+        </w:trPr>
+        <w:tc>
+          <w:tcPr>
+            <w:tcW w:type="dxa" w:w="4105"/>
+            <w:vAlign w:val="center"/>
+          </w:tcPr>
+          <w:p>
+            <w:pPr>
+              <w:spacing w:before="0" w:after="0" w:line="240" w:lineRule="auto"/>
+              <w:jc w:val="center"/>
+            </w:pPr>
+            <w:r>
+              <w:rPr>
+                <w:b w:val="0"/>
+                <w:sz w:val="19"/>
+              </w:rPr>
+              <w:t>Inferencia</w:t>
+            </w:r>
+          </w:p>
+        </w:tc>
+        <w:tc>
+          <w:tcPr>
+            <w:tcW w:type="dxa" w:w="4535"/>
+            <w:vAlign w:val="center"/>
+          </w:tcPr>
+          <w:p>
+            <w:pPr>
+              <w:spacing w:before="0" w:after="0" w:line="240" w:lineRule="auto"/>
+              <w:jc w:val="center"/>
+            </w:pPr>
+            <w:r>
+              <w:rPr>
+                <w:b w:val="0"/>
+                <w:sz w:val="19"/>
+              </w:rPr>
+              <w:t>Uso del modelo ya entrenado para predecir imágenes, sin modificar sus pesos.</w:t>
+            </w:r>
+          </w:p>
+        </w:tc>
+      </w:tr>
+      <w:tr>
+        <w:trPr>
+          <w:cantSplit/>
+        </w:trPr>
+        <w:tc>
+          <w:tcPr>
+            <w:tcW w:type="dxa" w:w="4105"/>
+            <w:vAlign w:val="center"/>
+          </w:tcPr>
+          <w:p>
+            <w:pPr>
+              <w:spacing w:before="0" w:after="0" w:line="240" w:lineRule="auto"/>
+              <w:jc w:val="center"/>
+            </w:pPr>
+            <w:r>
+              <w:rPr>
+                <w:b w:val="0"/>
+                <w:sz w:val="19"/>
+              </w:rPr>
+              <w:t>Learning rate</w:t>
+            </w:r>
+          </w:p>
+        </w:tc>
+        <w:tc>
+          <w:tcPr>
+            <w:tcW w:type="dxa" w:w="4535"/>
+            <w:vAlign w:val="center"/>
+          </w:tcPr>
+          <w:p>
+            <w:pPr>
+              <w:spacing w:before="0" w:after="0" w:line="240" w:lineRule="auto"/>
+              <w:jc w:val="center"/>
+            </w:pPr>
+            <w:r>
+              <w:rPr>
+                <w:b w:val="0"/>
+                <w:sz w:val="19"/>
+              </w:rPr>
+              <w:t>Tamaño del paso con que el optimizador actualiza los pesos (aquí 1e-4).</w:t>
+            </w:r>
+          </w:p>
+        </w:tc>
+      </w:tr>
+      <w:tr>
+        <w:trPr>
+          <w:cantSplit/>
+        </w:trPr>
+        <w:tc>
+          <w:tcPr>
+            <w:tcW w:type="dxa" w:w="4105"/>
+            <w:vAlign w:val="center"/>
+          </w:tcPr>
+          <w:p>
+            <w:pPr>
+              <w:spacing w:before="0" w:after="0" w:line="240" w:lineRule="auto"/>
+              <w:jc w:val="center"/>
+            </w:pPr>
+            <w:r>
+              <w:rPr>
+                <w:b w:val="0"/>
+                <w:sz w:val="19"/>
+              </w:rPr>
+              <w:t>Linear probe (congelado)</w:t>
+            </w:r>
+          </w:p>
+        </w:tc>
+        <w:tc>
+          <w:tcPr>
+            <w:tcW w:type="dxa" w:w="4535"/>
+            <w:vAlign w:val="center"/>
+          </w:tcPr>
+          <w:p>
+            <w:pPr>
+              <w:spacing w:before="0" w:after="0" w:line="240" w:lineRule="auto"/>
+              <w:jc w:val="center"/>
+            </w:pPr>
+            <w:r>
+              <w:rPr>
+                <w:b w:val="0"/>
+                <w:sz w:val="19"/>
+              </w:rPr>
+              <w:t>Método de transferencia que congela el backbone y entrena solo la cabeza de clasificación en el dominio objetivo.</w:t>
+            </w:r>
+          </w:p>
+        </w:tc>
+      </w:tr>
+      <w:tr>
+        <w:trPr>
+          <w:cantSplit/>
+        </w:trPr>
+        <w:tc>
+          <w:tcPr>
+            <w:tcW w:type="dxa" w:w="4105"/>
+            <w:vAlign w:val="center"/>
+          </w:tcPr>
+          <w:p>
+            <w:pPr>
+              <w:spacing w:before="0" w:after="0" w:line="240" w:lineRule="auto"/>
+              <w:jc w:val="center"/>
+            </w:pPr>
+            <w:r>
+              <w:rPr>
+                <w:b w:val="0"/>
+                <w:sz w:val="19"/>
+              </w:rPr>
+              <w:t>Matriz de confusión</w:t>
+            </w:r>
+          </w:p>
+        </w:tc>
+        <w:tc>
+          <w:tcPr>
+            <w:tcW w:type="dxa" w:w="4535"/>
+            <w:vAlign w:val="center"/>
+          </w:tcPr>
+          <w:p>
+            <w:pPr>
+              <w:spacing w:before="0" w:after="0" w:line="240" w:lineRule="auto"/>
+              <w:jc w:val="center"/>
+            </w:pPr>
+            <w:r>
+              <w:rPr>
+                <w:b w:val="0"/>
+                <w:sz w:val="19"/>
+              </w:rPr>
+              <w:t>Tabla 2 × 2 que cruza la clase real (filas) con la clase predicha (columnas); de ella salen TP, FP, FN y TN.</w:t>
+            </w:r>
+          </w:p>
+        </w:tc>
+      </w:tr>
+      <w:tr>
+        <w:trPr>
+          <w:cantSplit/>
+        </w:trPr>
+        <w:tc>
+          <w:tcPr>
+            <w:tcW w:type="dxa" w:w="4105"/>
+            <w:vAlign w:val="center"/>
+          </w:tcPr>
+          <w:p>
+            <w:pPr>
+              <w:spacing w:before="0" w:after="0" w:line="240" w:lineRule="auto"/>
+              <w:jc w:val="center"/>
+            </w:pPr>
+            <w:r>
+              <w:rPr>
+                <w:b w:val="0"/>
+                <w:sz w:val="19"/>
+              </w:rPr>
+              <w:t>Matriz pooled</w:t>
+            </w:r>
+          </w:p>
+        </w:tc>
+        <w:tc>
+          <w:tcPr>
+            <w:tcW w:type="dxa" w:w="4535"/>
+            <w:vAlign w:val="center"/>
+          </w:tcPr>
+          <w:p>
+            <w:pPr>
+              <w:spacing w:before="0" w:after="0" w:line="240" w:lineRule="auto"/>
+              <w:jc w:val="center"/>
+            </w:pPr>
+            <w:r>
+              <w:rPr>
+                <w:b w:val="0"/>
+                <w:sz w:val="19"/>
+              </w:rPr>
+              <w:t>Suma celda a celda de las 5 matrices de fold de un modelo; suma 1,150 imágenes en Trucha y 1,261 en Rohu.</w:t>
+            </w:r>
+          </w:p>
+        </w:tc>
+      </w:tr>
+      <w:tr>
+        <w:trPr>
+          <w:cantSplit/>
+        </w:trPr>
+        <w:tc>
+          <w:tcPr>
+            <w:tcW w:type="dxa" w:w="4105"/>
+            <w:vAlign w:val="center"/>
+          </w:tcPr>
+          <w:p>
+            <w:pPr>
+              <w:spacing w:before="0" w:after="0" w:line="240" w:lineRule="auto"/>
+              <w:jc w:val="center"/>
+            </w:pPr>
+            <w:r>
+              <w:rPr>
+                <w:b w:val="0"/>
+                <w:sz w:val="19"/>
+              </w:rPr>
+              <w:t>MPS</w:t>
+            </w:r>
+          </w:p>
+        </w:tc>
+        <w:tc>
+          <w:tcPr>
+            <w:tcW w:type="dxa" w:w="4535"/>
+            <w:vAlign w:val="center"/>
+          </w:tcPr>
+          <w:p>
+            <w:pPr>
+              <w:spacing w:before="0" w:after="0" w:line="240" w:lineRule="auto"/>
+              <w:jc w:val="center"/>
+            </w:pPr>
+            <w:r>
+              <w:rPr>
+                <w:b w:val="0"/>
+                <w:sz w:val="19"/>
+              </w:rPr>
+              <w:t>Metal Performance Shaders: aceleración por GPU de PyTorch en equipos Apple.</w:t>
+            </w:r>
+          </w:p>
+        </w:tc>
+      </w:tr>
+      <w:tr>
+        <w:trPr>
+          <w:cantSplit/>
+        </w:trPr>
+        <w:tc>
+          <w:tcPr>
+            <w:tcW w:type="dxa" w:w="4105"/>
+            <w:vAlign w:val="center"/>
+          </w:tcPr>
+          <w:p>
+            <w:pPr>
+              <w:spacing w:before="0" w:after="0" w:line="240" w:lineRule="auto"/>
+              <w:jc w:val="center"/>
+            </w:pPr>
+            <w:r>
+              <w:rPr>
+                <w:b w:val="0"/>
+                <w:sz w:val="19"/>
+              </w:rPr>
+              <w:t>OOF (out-of-fold)</w:t>
+            </w:r>
+          </w:p>
+        </w:tc>
+        <w:tc>
+          <w:tcPr>
+            <w:tcW w:type="dxa" w:w="4535"/>
+            <w:vAlign w:val="center"/>
+          </w:tcPr>
+          <w:p>
+            <w:pPr>
+              <w:spacing w:before="0" w:after="0" w:line="240" w:lineRule="auto"/>
+              <w:jc w:val="center"/>
+            </w:pPr>
+            <w:r>
+              <w:rPr>
+                <w:b w:val="0"/>
+                <w:sz w:val="19"/>
+              </w:rPr>
+              <w:t>Predicción que recibe una imagen de la cabeza entrenada con los otros 4 folds, que no la vio en entrenamiento.</w:t>
+            </w:r>
+          </w:p>
+        </w:tc>
+      </w:tr>
+      <w:tr>
+        <w:trPr>
+          <w:cantSplit/>
+        </w:trPr>
+        <w:tc>
+          <w:tcPr>
+            <w:tcW w:type="dxa" w:w="4105"/>
+            <w:vAlign w:val="center"/>
+          </w:tcPr>
+          <w:p>
+            <w:pPr>
+              <w:spacing w:before="0" w:after="0" w:line="240" w:lineRule="auto"/>
+              <w:jc w:val="center"/>
+            </w:pPr>
+            <w:r>
+              <w:rPr>
+                <w:b w:val="0"/>
+                <w:sz w:val="19"/>
+              </w:rPr>
+              <w:t>Paciencia</w:t>
+            </w:r>
+          </w:p>
+        </w:tc>
+        <w:tc>
+          <w:tcPr>
+            <w:tcW w:type="dxa" w:w="4535"/>
+            <w:vAlign w:val="center"/>
+          </w:tcPr>
+          <w:p>
+            <w:pPr>
+              <w:spacing w:before="0" w:after="0" w:line="240" w:lineRule="auto"/>
+              <w:jc w:val="center"/>
+            </w:pPr>
+            <w:r>
+              <w:rPr>
+                <w:b w:val="0"/>
+                <w:sz w:val="19"/>
+              </w:rPr>
+              <w:t>Número de epochs seguidos sin mejora de val_F1 que se toleran antes del early stopping.</w:t>
+            </w:r>
+          </w:p>
+        </w:tc>
+      </w:tr>
+      <w:tr>
+        <w:trPr>
+          <w:cantSplit/>
+        </w:trPr>
+        <w:tc>
+          <w:tcPr>
+            <w:tcW w:type="dxa" w:w="4105"/>
+            <w:vAlign w:val="center"/>
+          </w:tcPr>
+          <w:p>
+            <w:pPr>
+              <w:spacing w:before="0" w:after="0" w:line="240" w:lineRule="auto"/>
+              <w:jc w:val="center"/>
+            </w:pPr>
+            <w:r>
+              <w:rPr>
+                <w:b w:val="0"/>
+                <w:sz w:val="19"/>
+              </w:rPr>
+              <w:t>Parámetros</w:t>
+            </w:r>
+          </w:p>
+        </w:tc>
+        <w:tc>
+          <w:tcPr>
+            <w:tcW w:type="dxa" w:w="4535"/>
+            <w:vAlign w:val="center"/>
+          </w:tcPr>
+          <w:p>
+            <w:pPr>
+              <w:spacing w:before="0" w:after="0" w:line="240" w:lineRule="auto"/>
+              <w:jc w:val="center"/>
+            </w:pPr>
+            <w:r>
+              <w:rPr>
+                <w:b w:val="0"/>
+                <w:sz w:val="19"/>
+              </w:rPr>
+              <w:t>Cantidad de pesos del modelo, en millones (M); los entrenables aquí son solo los de la cabeza.</w:t>
+            </w:r>
+          </w:p>
+        </w:tc>
+      </w:tr>
+      <w:tr>
+        <w:trPr>
+          <w:cantSplit/>
+        </w:trPr>
+        <w:tc>
+          <w:tcPr>
+            <w:tcW w:type="dxa" w:w="4105"/>
+            <w:vAlign w:val="center"/>
+          </w:tcPr>
+          <w:p>
+            <w:pPr>
+              <w:spacing w:before="0" w:after="0" w:line="240" w:lineRule="auto"/>
+              <w:jc w:val="center"/>
+            </w:pPr>
+            <w:r>
+              <w:rPr>
+                <w:b w:val="0"/>
+                <w:sz w:val="19"/>
+              </w:rPr>
+              <w:t>Pooled</w:t>
+            </w:r>
+          </w:p>
+        </w:tc>
+        <w:tc>
+          <w:tcPr>
+            <w:tcW w:type="dxa" w:w="4535"/>
+            <w:vAlign w:val="center"/>
+          </w:tcPr>
+          <w:p>
+            <w:pPr>
+              <w:spacing w:before="0" w:after="0" w:line="240" w:lineRule="auto"/>
+              <w:jc w:val="center"/>
+            </w:pPr>
+            <w:r>
+              <w:rPr>
+                <w:b w:val="0"/>
+                <w:sz w:val="19"/>
+              </w:rPr>
+              <w:t>Resultado calculado una sola vez sobre todas las predicciones OOF concatenadas, no como promedio de folds.</w:t>
+            </w:r>
+          </w:p>
+        </w:tc>
+      </w:tr>
+      <w:tr>
+        <w:trPr>
+          <w:cantSplit/>
+        </w:trPr>
+        <w:tc>
+          <w:tcPr>
+            <w:tcW w:type="dxa" w:w="4105"/>
+            <w:vAlign w:val="center"/>
+          </w:tcPr>
+          <w:p>
+            <w:pPr>
+              <w:spacing w:before="0" w:after="0" w:line="240" w:lineRule="auto"/>
+              <w:jc w:val="center"/>
+            </w:pPr>
+            <w:r>
+              <w:rPr>
+                <w:b w:val="0"/>
+                <w:sz w:val="19"/>
+              </w:rPr>
+              <w:t>Precisión</w:t>
+            </w:r>
+          </w:p>
+        </w:tc>
+        <w:tc>
+          <w:tcPr>
+            <w:tcW w:type="dxa" w:w="4535"/>
+            <w:vAlign w:val="center"/>
+          </w:tcPr>
+          <w:p>
+            <w:pPr>
+              <w:spacing w:before="0" w:after="0" w:line="240" w:lineRule="auto"/>
+              <w:jc w:val="center"/>
+            </w:pPr>
+            <w:r>
+              <w:rPr>
+                <w:b w:val="0"/>
+                <w:sz w:val="19"/>
+              </w:rPr>
+              <w:t>De las imágenes que el modelo asignó a una clase, porcentaje correcto: TP/(TP+FP) × 100.</w:t>
+            </w:r>
+          </w:p>
+        </w:tc>
+      </w:tr>
+      <w:tr>
+        <w:trPr>
+          <w:cantSplit/>
+        </w:trPr>
+        <w:tc>
+          <w:tcPr>
+            <w:tcW w:type="dxa" w:w="4105"/>
+            <w:vAlign w:val="center"/>
+          </w:tcPr>
+          <w:p>
+            <w:pPr>
+              <w:spacing w:before="0" w:after="0" w:line="240" w:lineRule="auto"/>
+              <w:jc w:val="center"/>
+            </w:pPr>
+            <w:r>
+              <w:rPr>
+                <w:b w:val="0"/>
+                <w:sz w:val="19"/>
+              </w:rPr>
+              <w:t>PyTorch</w:t>
+            </w:r>
+          </w:p>
+        </w:tc>
+        <w:tc>
+          <w:tcPr>
+            <w:tcW w:type="dxa" w:w="4535"/>
+            <w:vAlign w:val="center"/>
+          </w:tcPr>
+          <w:p>
+            <w:pPr>
+              <w:spacing w:before="0" w:after="0" w:line="240" w:lineRule="auto"/>
+              <w:jc w:val="center"/>
+            </w:pPr>
+            <w:r>
+              <w:rPr>
+                <w:b w:val="0"/>
+                <w:sz w:val="19"/>
+              </w:rPr>
+              <w:t>Biblioteca de deep learning usada para entrenar y evaluar los modelos.</w:t>
+            </w:r>
+          </w:p>
+        </w:tc>
+      </w:tr>
+      <w:tr>
+        <w:trPr>
+          <w:cantSplit/>
+        </w:trPr>
+        <w:tc>
+          <w:tcPr>
+            <w:tcW w:type="dxa" w:w="4105"/>
+            <w:vAlign w:val="center"/>
+          </w:tcPr>
+          <w:p>
+            <w:pPr>
+              <w:spacing w:before="0" w:after="0" w:line="240" w:lineRule="auto"/>
+              <w:jc w:val="center"/>
+            </w:pPr>
+            <w:r>
+              <w:rPr>
+                <w:b w:val="0"/>
+                <w:sz w:val="19"/>
+              </w:rPr>
+              <w:t>RBE (reducción de brecha de error)</w:t>
+            </w:r>
+          </w:p>
+        </w:tc>
+        <w:tc>
+          <w:tcPr>
+            <w:tcW w:type="dxa" w:w="4535"/>
+            <w:vAlign w:val="center"/>
+          </w:tcPr>
+          <w:p>
+            <w:pPr>
+              <w:spacing w:before="0" w:after="0" w:line="240" w:lineRule="auto"/>
+              <w:jc w:val="center"/>
+            </w:pPr>
+            <w:r>
+              <w:rPr>
+                <w:b w:val="0"/>
+                <w:sz w:val="19"/>
+              </w:rPr>
+              <w:t>Cuánto reduce un modelo el Gap frente al baseline DenseNet-121, en porcentaje (ver 2.6).</w:t>
+            </w:r>
+          </w:p>
+        </w:tc>
+      </w:tr>
+      <w:tr>
+        <w:trPr>
+          <w:cantSplit/>
+        </w:trPr>
+        <w:tc>
+          <w:tcPr>
+            <w:tcW w:type="dxa" w:w="4105"/>
+            <w:vAlign w:val="center"/>
+          </w:tcPr>
+          <w:p>
+            <w:pPr>
+              <w:spacing w:before="0" w:after="0" w:line="240" w:lineRule="auto"/>
+              <w:jc w:val="center"/>
+            </w:pPr>
+            <w:r>
+              <w:rPr>
+                <w:b w:val="0"/>
+                <w:sz w:val="19"/>
+              </w:rPr>
+              <w:t>Recall (sensibilidad)</w:t>
+            </w:r>
+          </w:p>
+        </w:tc>
+        <w:tc>
+          <w:tcPr>
+            <w:tcW w:type="dxa" w:w="4535"/>
+            <w:vAlign w:val="center"/>
+          </w:tcPr>
+          <w:p>
+            <w:pPr>
+              <w:spacing w:before="0" w:after="0" w:line="240" w:lineRule="auto"/>
+              <w:jc w:val="center"/>
+            </w:pPr>
+            <w:r>
+              <w:rPr>
+                <w:b w:val="0"/>
+                <w:sz w:val="19"/>
+              </w:rPr>
+              <w:t>De las imágenes de una clase, porcentaje que el modelo detectó: TP/(TP+FN) × 100.</w:t>
+            </w:r>
+          </w:p>
+        </w:tc>
+      </w:tr>
+      <w:tr>
+        <w:trPr>
+          <w:cantSplit/>
+        </w:trPr>
+        <w:tc>
+          <w:tcPr>
+            <w:tcW w:type="dxa" w:w="4105"/>
+            <w:vAlign w:val="center"/>
+          </w:tcPr>
+          <w:p>
+            <w:pPr>
+              <w:spacing w:before="0" w:after="0" w:line="240" w:lineRule="auto"/>
+              <w:jc w:val="center"/>
+            </w:pPr>
+            <w:r>
+              <w:rPr>
+                <w:b w:val="0"/>
+                <w:sz w:val="19"/>
+              </w:rPr>
+              <w:t>Scheduler coseno</w:t>
+            </w:r>
+          </w:p>
+        </w:tc>
+        <w:tc>
+          <w:tcPr>
+            <w:tcW w:type="dxa" w:w="4535"/>
+            <w:vAlign w:val="center"/>
+          </w:tcPr>
+          <w:p>
+            <w:pPr>
+              <w:spacing w:before="0" w:after="0" w:line="240" w:lineRule="auto"/>
+              <w:jc w:val="center"/>
+            </w:pPr>
+            <w:r>
+              <w:rPr>
+                <w:b w:val="0"/>
+                <w:sz w:val="19"/>
+              </w:rPr>
+              <w:t>Regla que reduce el learning rate siguiendo una curva coseno a lo largo de los epochs (CosineAnnealingLR).</w:t>
+            </w:r>
+          </w:p>
+        </w:tc>
+      </w:tr>
+      <w:tr>
+        <w:trPr>
+          <w:cantSplit/>
+        </w:trPr>
+        <w:tc>
+          <w:tcPr>
+            <w:tcW w:type="dxa" w:w="4105"/>
+            <w:vAlign w:val="center"/>
+          </w:tcPr>
+          <w:p>
+            <w:pPr>
+              <w:spacing w:before="0" w:after="0" w:line="240" w:lineRule="auto"/>
+              <w:jc w:val="center"/>
+            </w:pPr>
+            <w:r>
+              <w:rPr>
+                <w:b w:val="0"/>
+                <w:sz w:val="19"/>
+              </w:rPr>
+              <w:t>scikit-learn</w:t>
+            </w:r>
+          </w:p>
+        </w:tc>
+        <w:tc>
+          <w:tcPr>
+            <w:tcW w:type="dxa" w:w="4535"/>
+            <w:vAlign w:val="center"/>
+          </w:tcPr>
+          <w:p>
+            <w:pPr>
+              <w:spacing w:before="0" w:after="0" w:line="240" w:lineRule="auto"/>
+              <w:jc w:val="center"/>
+            </w:pPr>
+            <w:r>
+              <w:rPr>
+                <w:b w:val="0"/>
+                <w:sz w:val="19"/>
+              </w:rPr>
+              <w:t>Biblioteca de machine learning usada para la partición (StratifiedKFold, StratifiedGroupKFold) y las métricas.</w:t>
+            </w:r>
+          </w:p>
+        </w:tc>
+      </w:tr>
+      <w:tr>
+        <w:trPr>
+          <w:cantSplit/>
+        </w:trPr>
+        <w:tc>
+          <w:tcPr>
+            <w:tcW w:type="dxa" w:w="4105"/>
+            <w:vAlign w:val="center"/>
+          </w:tcPr>
+          <w:p>
+            <w:pPr>
+              <w:spacing w:before="0" w:after="0" w:line="240" w:lineRule="auto"/>
+              <w:jc w:val="center"/>
+            </w:pPr>
+            <w:r>
+              <w:rPr>
+                <w:b w:val="0"/>
+                <w:sz w:val="19"/>
+              </w:rPr>
+              <w:t>Semilla (random_state)</w:t>
+            </w:r>
+          </w:p>
+        </w:tc>
+        <w:tc>
+          <w:tcPr>
+            <w:tcW w:type="dxa" w:w="4535"/>
+            <w:vAlign w:val="center"/>
+          </w:tcPr>
+          <w:p>
+            <w:pPr>
+              <w:spacing w:before="0" w:after="0" w:line="240" w:lineRule="auto"/>
+              <w:jc w:val="center"/>
+            </w:pPr>
+            <w:r>
+              <w:rPr>
+                <w:b w:val="0"/>
+                <w:sz w:val="19"/>
+              </w:rPr>
+              <w:t>Número fijo (42) que hace reproducibles los procesos aleatorios, como la partición de los datos.</w:t>
+            </w:r>
+          </w:p>
+        </w:tc>
+      </w:tr>
+      <w:tr>
+        <w:trPr>
+          <w:cantSplit/>
+        </w:trPr>
+        <w:tc>
+          <w:tcPr>
+            <w:tcW w:type="dxa" w:w="4105"/>
+            <w:vAlign w:val="center"/>
+          </w:tcPr>
+          <w:p>
+            <w:pPr>
+              <w:spacing w:before="0" w:after="0" w:line="240" w:lineRule="auto"/>
+              <w:jc w:val="center"/>
+            </w:pPr>
+            <w:r>
+              <w:rPr>
+                <w:b w:val="0"/>
+                <w:sz w:val="19"/>
+              </w:rPr>
+              <w:t>Softmax</w:t>
+            </w:r>
+          </w:p>
+        </w:tc>
+        <w:tc>
+          <w:tcPr>
+            <w:tcW w:type="dxa" w:w="4535"/>
+            <w:vAlign w:val="center"/>
+          </w:tcPr>
+          <w:p>
+            <w:pPr>
+              <w:spacing w:before="0" w:after="0" w:line="240" w:lineRule="auto"/>
+              <w:jc w:val="center"/>
+            </w:pPr>
+            <w:r>
+              <w:rPr>
+                <w:b w:val="0"/>
+                <w:sz w:val="19"/>
+              </w:rPr>
+              <w:t>Función que convierte las salidas del modelo en probabilidades por clase que suman 1.</w:t>
+            </w:r>
+          </w:p>
+        </w:tc>
+      </w:tr>
+      <w:tr>
+        <w:trPr>
+          <w:cantSplit/>
+        </w:trPr>
+        <w:tc>
+          <w:tcPr>
+            <w:tcW w:type="dxa" w:w="4105"/>
+            <w:vAlign w:val="center"/>
+          </w:tcPr>
+          <w:p>
+            <w:pPr>
+              <w:spacing w:before="0" w:after="0" w:line="240" w:lineRule="auto"/>
+              <w:jc w:val="center"/>
+            </w:pPr>
+            <w:r>
+              <w:rPr>
+                <w:b w:val="0"/>
+                <w:sz w:val="19"/>
+              </w:rPr>
+              <w:t>StratifiedGroupKFold</w:t>
+            </w:r>
+          </w:p>
+        </w:tc>
+        <w:tc>
+          <w:tcPr>
+            <w:tcW w:type="dxa" w:w="4535"/>
+            <w:vAlign w:val="center"/>
+          </w:tcPr>
+          <w:p>
+            <w:pPr>
+              <w:spacing w:before="0" w:after="0" w:line="240" w:lineRule="auto"/>
+              <w:jc w:val="center"/>
+            </w:pPr>
+            <w:r>
+              <w:rPr>
+                <w:b w:val="0"/>
+                <w:sz w:val="19"/>
+              </w:rPr>
+              <w:t>Partición en k folds que mantiene la proporción de clases y deja cada grupo de casi-duplicados completo en un solo fold (Rohu).</w:t>
+            </w:r>
+          </w:p>
+        </w:tc>
+      </w:tr>
+      <w:tr>
+        <w:trPr>
+          <w:cantSplit/>
+        </w:trPr>
+        <w:tc>
+          <w:tcPr>
+            <w:tcW w:type="dxa" w:w="4105"/>
+            <w:vAlign w:val="center"/>
+          </w:tcPr>
+          <w:p>
+            <w:pPr>
+              <w:spacing w:before="0" w:after="0" w:line="240" w:lineRule="auto"/>
+              <w:jc w:val="center"/>
+            </w:pPr>
+            <w:r>
+              <w:rPr>
+                <w:b w:val="0"/>
+                <w:sz w:val="19"/>
+              </w:rPr>
+              <w:t>StratifiedKFold</w:t>
+            </w:r>
+          </w:p>
+        </w:tc>
+        <w:tc>
+          <w:tcPr>
+            <w:tcW w:type="dxa" w:w="4535"/>
+            <w:vAlign w:val="center"/>
+          </w:tcPr>
+          <w:p>
+            <w:pPr>
+              <w:spacing w:before="0" w:after="0" w:line="240" w:lineRule="auto"/>
+              <w:jc w:val="center"/>
+            </w:pPr>
+            <w:r>
+              <w:rPr>
+                <w:b w:val="0"/>
+                <w:sz w:val="19"/>
+              </w:rPr>
+              <w:t>Partición en k folds que mantiene en cada fold la misma proporción de clases (Trucha).</w:t>
+            </w:r>
+          </w:p>
+        </w:tc>
+      </w:tr>
+      <w:tr>
+        <w:trPr>
+          <w:cantSplit/>
+        </w:trPr>
+        <w:tc>
+          <w:tcPr>
+            <w:tcW w:type="dxa" w:w="4105"/>
+            <w:vAlign w:val="center"/>
+          </w:tcPr>
+          <w:p>
+            <w:pPr>
+              <w:spacing w:before="0" w:after="0" w:line="240" w:lineRule="auto"/>
+              <w:jc w:val="center"/>
+            </w:pPr>
+            <w:r>
+              <w:rPr>
+                <w:b w:val="0"/>
+                <w:sz w:val="19"/>
+              </w:rPr>
+              <w:t>timm</w:t>
+            </w:r>
+          </w:p>
+        </w:tc>
+        <w:tc>
+          <w:tcPr>
+            <w:tcW w:type="dxa" w:w="4535"/>
+            <w:vAlign w:val="center"/>
+          </w:tcPr>
+          <w:p>
+            <w:pPr>
+              <w:spacing w:before="0" w:after="0" w:line="240" w:lineRule="auto"/>
+              <w:jc w:val="center"/>
+            </w:pPr>
+            <w:r>
+              <w:rPr>
+                <w:b w:val="0"/>
+                <w:sz w:val="19"/>
+              </w:rPr>
+              <w:t>Biblioteca de PyTorch con las arquitecturas y pesos preentrenados de los modelos.</w:t>
+            </w:r>
+          </w:p>
+        </w:tc>
+      </w:tr>
+      <w:tr>
+        <w:trPr>
+          <w:cantSplit/>
+        </w:trPr>
+        <w:tc>
+          <w:tcPr>
+            <w:tcW w:type="dxa" w:w="4105"/>
+            <w:vAlign w:val="center"/>
+          </w:tcPr>
+          <w:p>
+            <w:pPr>
+              <w:spacing w:before="0" w:after="0" w:line="240" w:lineRule="auto"/>
+              <w:jc w:val="center"/>
+            </w:pPr>
+            <w:r>
+              <w:rPr>
+                <w:b w:val="0"/>
+                <w:sz w:val="19"/>
+              </w:rPr>
+              <w:t>TN (verdadero negativo)</w:t>
+            </w:r>
+          </w:p>
+        </w:tc>
+        <w:tc>
+          <w:tcPr>
+            <w:tcW w:type="dxa" w:w="4535"/>
+            <w:vAlign w:val="center"/>
+          </w:tcPr>
+          <w:p>
+            <w:pPr>
+              <w:spacing w:before="0" w:after="0" w:line="240" w:lineRule="auto"/>
+              <w:jc w:val="center"/>
+            </w:pPr>
+            <w:r>
+              <w:rPr>
+                <w:b w:val="0"/>
+                <w:sz w:val="19"/>
+              </w:rPr>
+              <w:t>Imagen de la otra clase que el modelo también asignó a la otra clase.</w:t>
+            </w:r>
+          </w:p>
+        </w:tc>
+      </w:tr>
+      <w:tr>
+        <w:trPr>
+          <w:cantSplit/>
+        </w:trPr>
+        <w:tc>
+          <w:tcPr>
+            <w:tcW w:type="dxa" w:w="4105"/>
+            <w:vAlign w:val="center"/>
+          </w:tcPr>
+          <w:p>
+            <w:pPr>
+              <w:spacing w:before="0" w:after="0" w:line="240" w:lineRule="auto"/>
+              <w:jc w:val="center"/>
+            </w:pPr>
+            <w:r>
+              <w:rPr>
+                <w:b w:val="0"/>
+                <w:sz w:val="19"/>
+              </w:rPr>
+              <w:t>TP (verdadero positivo)</w:t>
+            </w:r>
+          </w:p>
+        </w:tc>
+        <w:tc>
+          <w:tcPr>
+            <w:tcW w:type="dxa" w:w="4535"/>
+            <w:vAlign w:val="center"/>
+          </w:tcPr>
+          <w:p>
+            <w:pPr>
+              <w:spacing w:before="0" w:after="0" w:line="240" w:lineRule="auto"/>
+              <w:jc w:val="center"/>
+            </w:pPr>
+            <w:r>
+              <w:rPr>
+                <w:b w:val="0"/>
+                <w:sz w:val="19"/>
+              </w:rPr>
+              <w:t>Imagen de la clase evaluada que el modelo asignó a esa clase.</w:t>
+            </w:r>
+          </w:p>
+        </w:tc>
+      </w:tr>
+      <w:tr>
+        <w:trPr>
+          <w:cantSplit/>
+        </w:trPr>
+        <w:tc>
+          <w:tcPr>
+            <w:tcW w:type="dxa" w:w="4105"/>
+            <w:vAlign w:val="center"/>
+          </w:tcPr>
+          <w:p>
+            <w:pPr>
+              <w:spacing w:before="0" w:after="0" w:line="240" w:lineRule="auto"/>
+              <w:jc w:val="center"/>
+            </w:pPr>
+            <w:r>
+              <w:rPr>
+                <w:b w:val="0"/>
+                <w:sz w:val="19"/>
+              </w:rPr>
+              <w:t>Transformer</w:t>
+            </w:r>
+          </w:p>
+        </w:tc>
+        <w:tc>
+          <w:tcPr>
+            <w:tcW w:type="dxa" w:w="4535"/>
+            <w:vAlign w:val="center"/>
+          </w:tcPr>
+          <w:p>
+            <w:pPr>
+              <w:spacing w:before="0" w:after="0" w:line="240" w:lineRule="auto"/>
+              <w:jc w:val="center"/>
+            </w:pPr>
+            <w:r>
+              <w:rPr>
+                <w:b w:val="0"/>
+                <w:sz w:val="19"/>
+              </w:rPr>
+              <w:t>Arquitectura basada en mecanismos de atención; en visión divide la imagen en parches (ViT).</w:t>
+            </w:r>
+          </w:p>
+        </w:tc>
+      </w:tr>
+      <w:tr>
+        <w:trPr>
+          <w:cantSplit/>
+        </w:trPr>
+        <w:tc>
+          <w:tcPr>
+            <w:tcW w:type="dxa" w:w="4105"/>
+            <w:vAlign w:val="center"/>
+          </w:tcPr>
+          <w:p>
+            <w:pPr>
+              <w:spacing w:before="0" w:after="0" w:line="240" w:lineRule="auto"/>
+              <w:jc w:val="center"/>
+            </w:pPr>
+            <w:r>
+              <w:rPr>
+                <w:b w:val="0"/>
+                <w:sz w:val="19"/>
+              </w:rPr>
+              <w:t>TRD (tasa de retención del desempeño)</w:t>
+            </w:r>
+          </w:p>
+        </w:tc>
+        <w:tc>
+          <w:tcPr>
+            <w:tcW w:type="dxa" w:w="4535"/>
+            <w:vAlign w:val="center"/>
+          </w:tcPr>
+          <w:p>
+            <w:pPr>
+              <w:spacing w:before="0" w:after="0" w:line="240" w:lineRule="auto"/>
+              <w:jc w:val="center"/>
+            </w:pPr>
+            <w:r>
+              <w:rPr>
+                <w:b w:val="0"/>
+                <w:sz w:val="19"/>
+              </w:rPr>
+              <w:t>Porcentaje del F1 de Mendeley que el modelo conserva en el dominio objetivo (ver 2.6).</w:t>
+            </w:r>
+          </w:p>
+        </w:tc>
+      </w:tr>
+      <w:tr>
+        <w:trPr>
+          <w:cantSplit/>
+        </w:trPr>
+        <w:tc>
+          <w:tcPr>
+            <w:tcW w:type="dxa" w:w="4105"/>
+            <w:vAlign w:val="center"/>
+          </w:tcPr>
+          <w:p>
+            <w:pPr>
+              <w:spacing w:before="0" w:after="0" w:line="240" w:lineRule="auto"/>
+              <w:jc w:val="center"/>
+            </w:pPr>
+            <w:r>
+              <w:rPr>
+                <w:b w:val="0"/>
+                <w:sz w:val="19"/>
+              </w:rPr>
+              <w:t>Umbral</w:t>
+            </w:r>
+          </w:p>
+        </w:tc>
+        <w:tc>
+          <w:tcPr>
+            <w:tcW w:type="dxa" w:w="4535"/>
+            <w:vAlign w:val="center"/>
+          </w:tcPr>
+          <w:p>
+            <w:pPr>
+              <w:spacing w:before="0" w:after="0" w:line="240" w:lineRule="auto"/>
+              <w:jc w:val="center"/>
+            </w:pPr>
+            <w:r>
+              <w:rPr>
+                <w:b w:val="0"/>
+                <w:sz w:val="19"/>
+              </w:rPr>
+              <w:t>Probabilidad de corte para decidir la clase; la matriz de confusión usa 0.5.</w:t>
+            </w:r>
+          </w:p>
+        </w:tc>
+      </w:tr>
+      <w:tr>
+        <w:trPr>
+          <w:cantSplit/>
+        </w:trPr>
+        <w:tc>
+          <w:tcPr>
+            <w:tcW w:type="dxa" w:w="4105"/>
+            <w:vAlign w:val="center"/>
+          </w:tcPr>
+          <w:p>
+            <w:pPr>
+              <w:spacing w:before="0" w:after="0" w:line="240" w:lineRule="auto"/>
+              <w:jc w:val="center"/>
+            </w:pPr>
+            <w:r>
+              <w:rPr>
+                <w:b w:val="0"/>
+                <w:sz w:val="19"/>
+              </w:rPr>
+              <w:t>val_F1</w:t>
+            </w:r>
+          </w:p>
+        </w:tc>
+        <w:tc>
+          <w:tcPr>
+            <w:tcW w:type="dxa" w:w="4535"/>
+            <w:vAlign w:val="center"/>
+          </w:tcPr>
+          <w:p>
+            <w:pPr>
+              <w:spacing w:before="0" w:after="0" w:line="240" w:lineRule="auto"/>
+              <w:jc w:val="center"/>
+            </w:pPr>
+            <w:r>
+              <w:rPr>
+                <w:b w:val="0"/>
+                <w:sz w:val="19"/>
+              </w:rPr>
+              <w:t>F1 macro sobre el fold de evaluación, medido al final de cada epoch para elegir el mejor.</w:t>
+            </w:r>
+          </w:p>
+        </w:tc>
+      </w:tr>
+      <w:tr>
+        <w:trPr>
+          <w:cantSplit/>
+        </w:trPr>
+        <w:tc>
+          <w:tcPr>
+            <w:tcW w:type="dxa" w:w="4105"/>
+            <w:vAlign w:val="center"/>
+          </w:tcPr>
+          <w:p>
+            <w:pPr>
+              <w:spacing w:before="0" w:after="0" w:line="240" w:lineRule="auto"/>
+              <w:jc w:val="center"/>
+            </w:pPr>
+            <w:r>
+              <w:rPr>
+                <w:b w:val="0"/>
+                <w:sz w:val="19"/>
+              </w:rPr>
+              <w:t>Validación cruzada</w:t>
+            </w:r>
+          </w:p>
+        </w:tc>
+        <w:tc>
+          <w:tcPr>
+            <w:tcW w:type="dxa" w:w="4535"/>
+            <w:vAlign w:val="center"/>
+          </w:tcPr>
+          <w:p>
+            <w:pPr>
+              <w:spacing w:before="0" w:after="0" w:line="240" w:lineRule="auto"/>
+              <w:jc w:val="center"/>
+            </w:pPr>
+            <w:r>
+              <w:rPr>
+                <w:b w:val="0"/>
+                <w:sz w:val="19"/>
+              </w:rPr>
+              <w:t>Esquema en el que cada fold se evalúa una vez, de modo que todas las imágenes se evalúan fuera de muestra.</w:t>
+            </w:r>
+          </w:p>
+        </w:tc>
+      </w:tr>
+      <w:tr>
+        <w:trPr>
+          <w:cantSplit/>
+        </w:trPr>
+        <w:tc>
+          <w:tcPr>
+            <w:tcW w:type="dxa" w:w="4105"/>
+            <w:vAlign w:val="center"/>
+          </w:tcPr>
+          <w:p>
+            <w:pPr>
+              <w:spacing w:before="0" w:after="0" w:line="240" w:lineRule="auto"/>
+              <w:jc w:val="center"/>
+            </w:pPr>
+            <w:r>
+              <w:rPr>
+                <w:b w:val="0"/>
+                <w:sz w:val="19"/>
+              </w:rPr>
+              <w:t>ViT</w:t>
+            </w:r>
+          </w:p>
+        </w:tc>
+        <w:tc>
+          <w:tcPr>
+            <w:tcW w:type="dxa" w:w="4535"/>
+            <w:vAlign w:val="center"/>
+          </w:tcPr>
+          <w:p>
+            <w:pPr>
+              <w:spacing w:before="0" w:after="0" w:line="240" w:lineRule="auto"/>
+              <w:jc w:val="center"/>
+            </w:pPr>
+            <w:r>
+              <w:rPr>
+                <w:b w:val="0"/>
+                <w:sz w:val="19"/>
+              </w:rPr>
+              <w:t>Vision Transformer: aplica un Transformer a parches de 16 × 16 píxeles de la imagen; aquí se usa ViT-Base/16.</w:t>
+            </w:r>
+          </w:p>
+        </w:tc>
+      </w:tr>
+      <w:tr>
+        <w:trPr>
+          <w:cantSplit/>
+        </w:trPr>
+        <w:tc>
+          <w:tcPr>
+            <w:tcW w:type="dxa" w:w="4105"/>
+            <w:vAlign w:val="center"/>
+          </w:tcPr>
+          <w:p>
+            <w:pPr>
+              <w:spacing w:before="0" w:after="0" w:line="240" w:lineRule="auto"/>
+              <w:jc w:val="center"/>
+            </w:pPr>
+            <w:r>
+              <w:rPr>
+                <w:b w:val="0"/>
+                <w:sz w:val="19"/>
+              </w:rPr>
+              <w:t>Weight decay</w:t>
+            </w:r>
+          </w:p>
+        </w:tc>
+        <w:tc>
+          <w:tcPr>
+            <w:tcW w:type="dxa" w:w="4535"/>
+            <w:vAlign w:val="center"/>
+          </w:tcPr>
+          <w:p>
+            <w:pPr>
+              <w:spacing w:before="0" w:after="0" w:line="240" w:lineRule="auto"/>
+              <w:jc w:val="center"/>
+            </w:pPr>
+            <w:r>
+              <w:rPr>
+                <w:b w:val="0"/>
+                <w:sz w:val="19"/>
+              </w:rPr>
+              <w:t>Penalización que reduce los pesos grandes para evitar sobreajuste (aquí 1e-4).</w:t>
+            </w:r>
+          </w:p>
+        </w:tc>
+      </w:tr>
+      <w:tr>
+        <w:trPr>
+          <w:cantSplit/>
+        </w:trPr>
+        <w:tc>
+          <w:tcPr>
+            <w:tcW w:type="dxa" w:w="4105"/>
+            <w:vAlign w:val="center"/>
+          </w:tcPr>
+          <w:p>
+            <w:pPr>
+              <w:spacing w:before="0" w:after="0" w:line="240" w:lineRule="auto"/>
+              <w:jc w:val="center"/>
+            </w:pPr>
+            <w:r>
+              <w:rPr>
+                <w:b w:val="0"/>
+                <w:sz w:val="19"/>
+              </w:rPr>
+              <w:t>Zero-shot</w:t>
+            </w:r>
+          </w:p>
+        </w:tc>
+        <w:tc>
+          <w:tcPr>
+            <w:tcW w:type="dxa" w:w="4535"/>
+            <w:vAlign w:val="center"/>
+          </w:tcPr>
+          <w:p>
+            <w:pPr>
+              <w:spacing w:before="0" w:after="0" w:line="240" w:lineRule="auto"/>
+              <w:jc w:val="center"/>
+            </w:pPr>
+            <w:r>
+              <w:rPr>
+                <w:b w:val="0"/>
+                <w:sz w:val="19"/>
+              </w:rPr>
+              <w:t>Evaluación sin ningún entrenamiento en el dominio objetivo; no es el método de este documento.</w:t>
             </w:r>
           </w:p>
         </w:tc>

</xml_diff>